<commit_message>
Add native PPTX presentation, high-res architecture diagram (PNG/PDF), and final synopsis PDF
</commit_message>
<xml_diff>
--- a/SUBMISSION/Weekly_Progress_Log_Dev_Rana_Kaila.docx
+++ b/SUBMISSION/Weekly_Progress_Log_Dev_Rana_Kaila.docx
@@ -1,10 +1,10 @@
 
 <file path=word/document.xml><?xml version="1.0" encoding="utf-8"?>
-<w:document xmlns:wpc="http://schemas.microsoft.com/office/word/2010/wordprocessingCanvas" xmlns:mo="http://schemas.microsoft.com/office/mac/office/2008/main" xmlns:mc="http://schemas.openxmlformats.org/markup-compatibility/2006" xmlns:mv="urn:schemas-microsoft-com:mac:vml" xmlns:o="urn:schemas-microsoft-com:office:office" xmlns:r="http://schemas.openxmlformats.org/officeDocument/2006/relationships" xmlns:m="http://schemas.openxmlformats.org/officeDocument/2006/math" xmlns:v="urn:schemas-microsoft-com:vml" xmlns:wp14="http://schemas.microsoft.com/office/word/2010/wordprocessingDrawing" xmlns:wp="http://schemas.openxmlformats.org/drawingml/2006/wordprocessingDrawing" xmlns:w10="urn:schemas-microsoft-com:office:word" xmlns:w="http://schemas.openxmlformats.org/wordprocessingml/2006/main" xmlns:w14="http://schemas.microsoft.com/office/word/2010/wordml" xmlns:wpg="http://schemas.microsoft.com/office/word/2010/wordprocessingGroup" xmlns:wpi="http://schemas.microsoft.com/office/word/2010/wordprocessingInk" xmlns:wne="http://schemas.microsoft.com/office/word/2006/wordml" xmlns:wps="http://schemas.microsoft.com/office/word/2010/wordprocessingShape" mc:Ignorable="w14 wp14">
+<w:document xmlns:ve="http://schemas.openxmlformats.org/markup-compatibility/2006" xmlns:o="urn:schemas-microsoft-com:office:office" xmlns:r="http://schemas.openxmlformats.org/officeDocument/2006/relationships" xmlns:m="http://schemas.openxmlformats.org/officeDocument/2006/math" xmlns:v="urn:schemas-microsoft-com:vml" xmlns:wp="http://schemas.openxmlformats.org/drawingml/2006/wordprocessingDrawing" xmlns:w10="urn:schemas-microsoft-com:office:word" xmlns:w="http://schemas.openxmlformats.org/wordprocessingml/2006/main" xmlns:wne="http://schemas.microsoft.com/office/word/2006/wordml">
   <w:body>
     <w:p>
       <w:pPr>
-        <w:spacing w:before="0" w:after="40"/>
+        <w:spacing w:after="40"/>
         <w:jc w:val="center"/>
       </w:pPr>
       <w:r>
@@ -18,14 +18,12 @@
     </w:p>
     <w:p>
       <w:pPr>
-        <w:spacing w:before="0" w:after="40"/>
+        <w:spacing w:after="40"/>
         <w:jc w:val="center"/>
       </w:pPr>
       <w:r>
         <w:rPr>
           <w:rFonts w:ascii="Times New Roman" w:hAnsi="Times New Roman"/>
-          <w:b w:val="0"/>
-          <w:sz w:val="22"/>
         </w:rPr>
         <w:t>Department of Computer Science &amp; Engineering (AIML)  |  Session 2026-27</w:t>
       </w:r>
@@ -47,9 +45,9 @@
     <w:tbl>
       <w:tblPr>
         <w:tblStyle w:val="TableGrid"/>
-        <w:tblW w:type="auto" w:w="0"/>
+        <w:tblW w:w="0" w:type="auto"/>
         <w:jc w:val="center"/>
-        <w:tblLook w:firstColumn="1" w:firstRow="1" w:lastColumn="0" w:lastRow="0" w:noHBand="0" w:noVBand="1" w:val="04A0"/>
+        <w:tblLook w:val="04A0"/>
       </w:tblPr>
       <w:tblGrid>
         <w:gridCol w:w="3713"/>
@@ -58,14 +56,16 @@
         <w:gridCol w:w="3713"/>
       </w:tblGrid>
       <w:tr>
+        <w:trPr>
+          <w:jc w:val="center"/>
+        </w:trPr>
         <w:tc>
           <w:tcPr>
-            <w:tcW w:type="dxa" w:w="3713"/>
+            <w:tcW w:w="3713" w:type="dxa"/>
           </w:tcPr>
           <w:p>
             <w:pPr>
               <w:spacing w:before="40" w:after="40"/>
-              <w:jc w:val="left"/>
             </w:pPr>
             <w:r>
               <w:rPr>
@@ -79,17 +79,15 @@
         </w:tc>
         <w:tc>
           <w:tcPr>
-            <w:tcW w:type="dxa" w:w="3713"/>
+            <w:tcW w:w="3713" w:type="dxa"/>
           </w:tcPr>
           <w:p>
             <w:pPr>
               <w:spacing w:before="40" w:after="40"/>
-              <w:jc w:val="left"/>
             </w:pPr>
             <w:r>
               <w:rPr>
                 <w:rFonts w:ascii="Times New Roman" w:hAnsi="Times New Roman"/>
-                <w:b w:val="0"/>
                 <w:sz w:val="20"/>
               </w:rPr>
               <w:t>Dev Rana Kaila</w:t>
@@ -98,12 +96,11 @@
         </w:tc>
         <w:tc>
           <w:tcPr>
-            <w:tcW w:type="dxa" w:w="3713"/>
+            <w:tcW w:w="3713" w:type="dxa"/>
           </w:tcPr>
           <w:p>
             <w:pPr>
               <w:spacing w:before="40" w:after="40"/>
-              <w:jc w:val="left"/>
             </w:pPr>
             <w:r>
               <w:rPr>
@@ -117,17 +114,15 @@
         </w:tc>
         <w:tc>
           <w:tcPr>
-            <w:tcW w:type="dxa" w:w="3713"/>
+            <w:tcW w:w="3713" w:type="dxa"/>
           </w:tcPr>
           <w:p>
             <w:pPr>
               <w:spacing w:before="40" w:after="40"/>
-              <w:jc w:val="left"/>
             </w:pPr>
             <w:r>
               <w:rPr>
                 <w:rFonts w:ascii="Times New Roman" w:hAnsi="Times New Roman"/>
-                <w:b w:val="0"/>
                 <w:sz w:val="20"/>
               </w:rPr>
               <w:t>2301531530023</w:t>
@@ -136,14 +131,16 @@
         </w:tc>
       </w:tr>
       <w:tr>
+        <w:trPr>
+          <w:jc w:val="center"/>
+        </w:trPr>
         <w:tc>
           <w:tcPr>
-            <w:tcW w:type="dxa" w:w="3713"/>
+            <w:tcW w:w="3713" w:type="dxa"/>
           </w:tcPr>
           <w:p>
             <w:pPr>
               <w:spacing w:before="40" w:after="40"/>
-              <w:jc w:val="left"/>
             </w:pPr>
             <w:r>
               <w:rPr>
@@ -157,17 +154,15 @@
         </w:tc>
         <w:tc>
           <w:tcPr>
-            <w:tcW w:type="dxa" w:w="3713"/>
+            <w:tcW w:w="3713" w:type="dxa"/>
           </w:tcPr>
           <w:p>
             <w:pPr>
               <w:spacing w:before="40" w:after="40"/>
-              <w:jc w:val="left"/>
             </w:pPr>
             <w:r>
               <w:rPr>
                 <w:rFonts w:ascii="Times New Roman" w:hAnsi="Times New Roman"/>
-                <w:b w:val="0"/>
                 <w:sz w:val="20"/>
               </w:rPr>
               <w:t>B.Tech CSE (AIML) - Sem VII</w:t>
@@ -176,12 +171,11 @@
         </w:tc>
         <w:tc>
           <w:tcPr>
-            <w:tcW w:type="dxa" w:w="3713"/>
+            <w:tcW w:w="3713" w:type="dxa"/>
           </w:tcPr>
           <w:p>
             <w:pPr>
               <w:spacing w:before="40" w:after="40"/>
-              <w:jc w:val="left"/>
             </w:pPr>
             <w:r>
               <w:rPr>
@@ -195,17 +189,15 @@
         </w:tc>
         <w:tc>
           <w:tcPr>
-            <w:tcW w:type="dxa" w:w="3713"/>
+            <w:tcW w:w="3713" w:type="dxa"/>
           </w:tcPr>
           <w:p>
             <w:pPr>
               <w:spacing w:before="40" w:after="40"/>
-              <w:jc w:val="left"/>
             </w:pPr>
             <w:r>
               <w:rPr>
                 <w:rFonts w:ascii="Times New Roman" w:hAnsi="Times New Roman"/>
-                <w:b w:val="0"/>
                 <w:sz w:val="20"/>
               </w:rPr>
               <w:t>A</w:t>
@@ -214,14 +206,16 @@
         </w:tc>
       </w:tr>
       <w:tr>
+        <w:trPr>
+          <w:jc w:val="center"/>
+        </w:trPr>
         <w:tc>
           <w:tcPr>
-            <w:tcW w:type="dxa" w:w="3713"/>
+            <w:tcW w:w="3713" w:type="dxa"/>
           </w:tcPr>
           <w:p>
             <w:pPr>
               <w:spacing w:before="40" w:after="40"/>
-              <w:jc w:val="left"/>
             </w:pPr>
             <w:r>
               <w:rPr>
@@ -235,17 +229,15 @@
         </w:tc>
         <w:tc>
           <w:tcPr>
-            <w:tcW w:type="dxa" w:w="3713"/>
+            <w:tcW w:w="3713" w:type="dxa"/>
           </w:tcPr>
           <w:p>
             <w:pPr>
               <w:spacing w:before="40" w:after="40"/>
-              <w:jc w:val="left"/>
             </w:pPr>
             <w:r>
               <w:rPr>
                 <w:rFonts w:ascii="Times New Roman" w:hAnsi="Times New Roman"/>
-                <w:b w:val="0"/>
                 <w:sz w:val="20"/>
               </w:rPr>
               <w:t>Dr. Devendra Gautam</w:t>
@@ -254,12 +246,11 @@
         </w:tc>
         <w:tc>
           <w:tcPr>
-            <w:tcW w:type="dxa" w:w="3713"/>
+            <w:tcW w:w="3713" w:type="dxa"/>
           </w:tcPr>
           <w:p>
             <w:pPr>
               <w:spacing w:before="40" w:after="40"/>
-              <w:jc w:val="left"/>
             </w:pPr>
             <w:r>
               <w:rPr>
@@ -273,17 +264,15 @@
         </w:tc>
         <w:tc>
           <w:tcPr>
-            <w:tcW w:type="dxa" w:w="3713"/>
+            <w:tcW w:w="3713" w:type="dxa"/>
           </w:tcPr>
           <w:p>
             <w:pPr>
               <w:spacing w:before="40" w:after="40"/>
-              <w:jc w:val="left"/>
             </w:pPr>
             <w:r>
               <w:rPr>
                 <w:rFonts w:ascii="Times New Roman" w:hAnsi="Times New Roman"/>
-                <w:b w:val="0"/>
                 <w:sz w:val="20"/>
               </w:rPr>
               <w:t>Associate Professor, Dept. of CSE</w:t>
@@ -292,14 +281,16 @@
         </w:tc>
       </w:tr>
       <w:tr>
+        <w:trPr>
+          <w:jc w:val="center"/>
+        </w:trPr>
         <w:tc>
           <w:tcPr>
-            <w:tcW w:type="dxa" w:w="3713"/>
+            <w:tcW w:w="3713" w:type="dxa"/>
           </w:tcPr>
           <w:p>
             <w:pPr>
               <w:spacing w:before="40" w:after="40"/>
-              <w:jc w:val="left"/>
             </w:pPr>
             <w:r>
               <w:rPr>
@@ -313,17 +304,15 @@
         </w:tc>
         <w:tc>
           <w:tcPr>
-            <w:tcW w:type="dxa" w:w="3713"/>
+            <w:tcW w:w="3713" w:type="dxa"/>
           </w:tcPr>
           <w:p>
             <w:pPr>
               <w:spacing w:before="40" w:after="40"/>
-              <w:jc w:val="left"/>
             </w:pPr>
             <w:r>
               <w:rPr>
                 <w:rFonts w:ascii="Times New Roman" w:hAnsi="Times New Roman"/>
-                <w:b w:val="0"/>
                 <w:sz w:val="20"/>
               </w:rPr>
               <w:t>Dual-Stream Spatial and Frequency-Domain Deepfake Video Detection</w:t>
@@ -332,50 +321,36 @@
         </w:tc>
         <w:tc>
           <w:tcPr>
-            <w:tcW w:type="dxa" w:w="3713"/>
+            <w:tcW w:w="3713" w:type="dxa"/>
           </w:tcPr>
           <w:p>
             <w:pPr>
               <w:spacing w:before="40" w:after="40"/>
-              <w:jc w:val="left"/>
             </w:pPr>
-            <w:r>
-              <w:rPr>
-                <w:rFonts w:ascii="Times New Roman" w:hAnsi="Times New Roman"/>
-                <w:b/>
-                <w:sz w:val="20"/>
-              </w:rPr>
-            </w:r>
           </w:p>
         </w:tc>
         <w:tc>
           <w:tcPr>
-            <w:tcW w:type="dxa" w:w="3713"/>
+            <w:tcW w:w="3713" w:type="dxa"/>
           </w:tcPr>
           <w:p>
             <w:pPr>
               <w:spacing w:before="40" w:after="40"/>
-              <w:jc w:val="left"/>
             </w:pPr>
-            <w:r>
-              <w:rPr>
-                <w:rFonts w:ascii="Times New Roman" w:hAnsi="Times New Roman"/>
-                <w:b w:val="0"/>
-                <w:sz w:val="20"/>
-              </w:rPr>
-            </w:r>
           </w:p>
         </w:tc>
       </w:tr>
       <w:tr>
+        <w:trPr>
+          <w:jc w:val="center"/>
+        </w:trPr>
         <w:tc>
           <w:tcPr>
-            <w:tcW w:type="dxa" w:w="3713"/>
+            <w:tcW w:w="3713" w:type="dxa"/>
           </w:tcPr>
           <w:p>
             <w:pPr>
               <w:spacing w:before="40" w:after="40"/>
-              <w:jc w:val="left"/>
             </w:pPr>
             <w:r>
               <w:rPr>
@@ -389,17 +364,15 @@
         </w:tc>
         <w:tc>
           <w:tcPr>
-            <w:tcW w:type="dxa" w:w="3713"/>
+            <w:tcW w:w="3713" w:type="dxa"/>
           </w:tcPr>
           <w:p>
             <w:pPr>
               <w:spacing w:before="40" w:after="40"/>
-              <w:jc w:val="left"/>
             </w:pPr>
             <w:r>
               <w:rPr>
                 <w:rFonts w:ascii="Times New Roman" w:hAnsi="Times New Roman"/>
-                <w:b w:val="0"/>
                 <w:sz w:val="20"/>
               </w:rPr>
               <w:t>github.com/DevRanaKaila/DeepGuard-AI</w:t>
@@ -408,12 +381,11 @@
         </w:tc>
         <w:tc>
           <w:tcPr>
-            <w:tcW w:type="dxa" w:w="3713"/>
+            <w:tcW w:w="3713" w:type="dxa"/>
           </w:tcPr>
           <w:p>
             <w:pPr>
               <w:spacing w:before="40" w:after="40"/>
-              <w:jc w:val="left"/>
             </w:pPr>
             <w:r>
               <w:rPr>
@@ -427,17 +399,15 @@
         </w:tc>
         <w:tc>
           <w:tcPr>
-            <w:tcW w:type="dxa" w:w="3713"/>
+            <w:tcW w:w="3713" w:type="dxa"/>
           </w:tcPr>
           <w:p>
             <w:pPr>
               <w:spacing w:before="40" w:after="40"/>
-              <w:jc w:val="left"/>
             </w:pPr>
             <w:r>
               <w:rPr>
                 <w:rFonts w:ascii="Times New Roman" w:hAnsi="Times New Roman"/>
-                <w:b w:val="0"/>
                 <w:sz w:val="20"/>
               </w:rPr>
               <w:t>LIET, Greater Noida</w:t>
@@ -458,28 +428,39 @@
           <w:b/>
           <w:sz w:val="24"/>
         </w:rPr>
-        <w:t>Weekly Activity Log (Guide Signatures Required)</w:t>
+        <w:t xml:space="preserve">Weekly </w:t>
+      </w:r>
+      <w:r>
+        <w:rPr>
+          <w:rFonts w:ascii="Times New Roman" w:hAnsi="Times New Roman"/>
+          <w:b/>
+          <w:sz w:val="24"/>
+        </w:rPr>
+        <w:t>Activity Log (Guide Signatures Required)</w:t>
       </w:r>
     </w:p>
     <w:tbl>
       <w:tblPr>
         <w:tblStyle w:val="TableGrid"/>
-        <w:tblW w:type="auto" w:w="0"/>
+        <w:tblW w:w="0" w:type="auto"/>
         <w:jc w:val="center"/>
-        <w:tblLook w:firstColumn="1" w:firstRow="1" w:lastColumn="0" w:lastRow="0" w:noHBand="0" w:noVBand="1" w:val="04A0"/>
+        <w:tblLook w:val="04A0"/>
       </w:tblPr>
       <w:tblGrid>
-        <w:gridCol w:w="2476"/>
-        <w:gridCol w:w="2476"/>
-        <w:gridCol w:w="2476"/>
-        <w:gridCol w:w="2476"/>
-        <w:gridCol w:w="2476"/>
+        <w:gridCol w:w="1020"/>
+        <w:gridCol w:w="1814"/>
+        <w:gridCol w:w="1984"/>
+        <w:gridCol w:w="5953"/>
+        <w:gridCol w:w="1247"/>
         <w:gridCol w:w="2476"/>
       </w:tblGrid>
       <w:tr>
+        <w:trPr>
+          <w:jc w:val="center"/>
+        </w:trPr>
         <w:tc>
           <w:tcPr>
-            <w:tcW w:type="dxa" w:w="1020"/>
+            <w:tcW w:w="1020" w:type="dxa"/>
           </w:tcPr>
           <w:p>
             <w:pPr>
@@ -497,7 +478,7 @@
         </w:tc>
         <w:tc>
           <w:tcPr>
-            <w:tcW w:type="dxa" w:w="1814"/>
+            <w:tcW w:w="1814" w:type="dxa"/>
           </w:tcPr>
           <w:p>
             <w:pPr>
@@ -515,7 +496,7 @@
         </w:tc>
         <w:tc>
           <w:tcPr>
-            <w:tcW w:type="dxa" w:w="1984"/>
+            <w:tcW w:w="1984" w:type="dxa"/>
           </w:tcPr>
           <w:p>
             <w:pPr>
@@ -533,7 +514,7 @@
         </w:tc>
         <w:tc>
           <w:tcPr>
-            <w:tcW w:type="dxa" w:w="5953"/>
+            <w:tcW w:w="5953" w:type="dxa"/>
           </w:tcPr>
           <w:p>
             <w:pPr>
@@ -551,7 +532,7 @@
         </w:tc>
         <w:tc>
           <w:tcPr>
-            <w:tcW w:type="dxa" w:w="1247"/>
+            <w:tcW w:w="1247" w:type="dxa"/>
           </w:tcPr>
           <w:p>
             <w:pPr>
@@ -569,7 +550,7 @@
         </w:tc>
         <w:tc>
           <w:tcPr>
-            <w:tcW w:type="dxa" w:w="1701"/>
+            <w:tcW w:w="1701" w:type="dxa"/>
           </w:tcPr>
           <w:p>
             <w:pPr>
@@ -587,9 +568,12 @@
         </w:tc>
       </w:tr>
       <w:tr>
+        <w:trPr>
+          <w:jc w:val="center"/>
+        </w:trPr>
         <w:tc>
           <w:tcPr>
-            <w:tcW w:type="dxa" w:w="1020"/>
+            <w:tcW w:w="1020" w:type="dxa"/>
           </w:tcPr>
           <w:p>
             <w:pPr>
@@ -608,30 +592,21 @@
         </w:tc>
         <w:tc>
           <w:tcPr>
-            <w:tcW w:type="dxa" w:w="1814"/>
+            <w:tcW w:w="1814" w:type="dxa"/>
           </w:tcPr>
           <w:p>
             <w:pPr>
               <w:spacing w:before="40" w:after="40"/>
-              <w:jc w:val="left"/>
             </w:pPr>
-            <w:r>
-              <w:rPr>
-                <w:rFonts w:ascii="Times New Roman" w:hAnsi="Times New Roman"/>
-                <w:sz w:val="18"/>
-              </w:rPr>
-              <w:t>Sep 01-07, 2026</w:t>
-            </w:r>
           </w:p>
         </w:tc>
         <w:tc>
           <w:tcPr>
-            <w:tcW w:type="dxa" w:w="1984"/>
+            <w:tcW w:w="1984" w:type="dxa"/>
           </w:tcPr>
           <w:p>
             <w:pPr>
               <w:spacing w:before="40" w:after="40"/>
-              <w:jc w:val="left"/>
             </w:pPr>
             <w:r>
               <w:rPr>
@@ -644,25 +619,31 @@
         </w:tc>
         <w:tc>
           <w:tcPr>
-            <w:tcW w:type="dxa" w:w="5953"/>
+            <w:tcW w:w="5953" w:type="dxa"/>
           </w:tcPr>
           <w:p>
             <w:pPr>
               <w:spacing w:before="40" w:after="40"/>
-              <w:jc w:val="left"/>
             </w:pPr>
             <w:r>
               <w:rPr>
                 <w:rFonts w:ascii="Times New Roman" w:hAnsi="Times New Roman"/>
                 <w:sz w:val="18"/>
               </w:rPr>
-              <w:t>Finalised project topic on deepfake detection. Studied 8 research papers (Rossler, Frank, Qian, Afchar, Li, Tan, Selvaraju, Durall). Identified FaceForensics++ and Celeb-DF v2 as benchmark datasets. Set up Python environment: PyTorch, timm, OpenCV, Streamlit.</w:t>
+              <w:t xml:space="preserve">Finalised project topic on deepfake detection. Studied 8 research </w:t>
+            </w:r>
+            <w:r>
+              <w:rPr>
+                <w:rFonts w:ascii="Times New Roman" w:hAnsi="Times New Roman"/>
+                <w:sz w:val="18"/>
+              </w:rPr>
+              <w:t>papers (Rossler, Frank, Qian, Afchar, Li, Tan, Selvaraju, Durall). Identified FaceForensics++ and Celeb-DF v2 as benchmark datasets. Set up Python environment: PyTorch, timm, OpenCV, Streamlit.</w:t>
             </w:r>
           </w:p>
         </w:tc>
         <w:tc>
           <w:tcPr>
-            <w:tcW w:type="dxa" w:w="1247"/>
+            <w:tcW w:w="1247" w:type="dxa"/>
           </w:tcPr>
           <w:p>
             <w:pPr>
@@ -680,15 +661,18 @@
         </w:tc>
         <w:tc>
           <w:tcPr>
-            <w:tcW w:type="dxa" w:w="2476"/>
+            <w:tcW w:w="2476" w:type="dxa"/>
           </w:tcPr>
           <w:p/>
         </w:tc>
       </w:tr>
       <w:tr>
+        <w:trPr>
+          <w:jc w:val="center"/>
+        </w:trPr>
         <w:tc>
           <w:tcPr>
-            <w:tcW w:type="dxa" w:w="1020"/>
+            <w:tcW w:w="1020" w:type="dxa"/>
           </w:tcPr>
           <w:p>
             <w:pPr>
@@ -707,30 +691,21 @@
         </w:tc>
         <w:tc>
           <w:tcPr>
-            <w:tcW w:type="dxa" w:w="1814"/>
+            <w:tcW w:w="1814" w:type="dxa"/>
           </w:tcPr>
           <w:p>
             <w:pPr>
               <w:spacing w:before="40" w:after="40"/>
-              <w:jc w:val="left"/>
             </w:pPr>
-            <w:r>
-              <w:rPr>
-                <w:rFonts w:ascii="Times New Roman" w:hAnsi="Times New Roman"/>
-                <w:sz w:val="18"/>
-              </w:rPr>
-              <w:t>Sep 08-14, 2026</w:t>
-            </w:r>
           </w:p>
         </w:tc>
         <w:tc>
           <w:tcPr>
-            <w:tcW w:type="dxa" w:w="1984"/>
+            <w:tcW w:w="1984" w:type="dxa"/>
           </w:tcPr>
           <w:p>
             <w:pPr>
               <w:spacing w:before="40" w:after="40"/>
-              <w:jc w:val="left"/>
             </w:pPr>
             <w:r>
               <w:rPr>
@@ -743,12 +718,11 @@
         </w:tc>
         <w:tc>
           <w:tcPr>
-            <w:tcW w:type="dxa" w:w="5953"/>
+            <w:tcW w:w="5953" w:type="dxa"/>
           </w:tcPr>
           <w:p>
             <w:pPr>
               <w:spacing w:before="40" w:after="40"/>
-              <w:jc w:val="left"/>
             </w:pPr>
             <w:r>
               <w:rPr>
@@ -761,33 +735,29 @@
         </w:tc>
         <w:tc>
           <w:tcPr>
-            <w:tcW w:type="dxa" w:w="1247"/>
+            <w:tcW w:w="1247" w:type="dxa"/>
           </w:tcPr>
           <w:p>
             <w:pPr>
               <w:spacing w:before="40" w:after="40"/>
               <w:jc w:val="center"/>
             </w:pPr>
-            <w:r>
-              <w:rPr>
-                <w:rFonts w:ascii="Times New Roman" w:hAnsi="Times New Roman"/>
-                <w:sz w:val="18"/>
-              </w:rPr>
-              <w:t>Completed</w:t>
-            </w:r>
           </w:p>
         </w:tc>
         <w:tc>
           <w:tcPr>
-            <w:tcW w:type="dxa" w:w="2476"/>
+            <w:tcW w:w="2476" w:type="dxa"/>
           </w:tcPr>
           <w:p/>
         </w:tc>
       </w:tr>
       <w:tr>
+        <w:trPr>
+          <w:jc w:val="center"/>
+        </w:trPr>
         <w:tc>
           <w:tcPr>
-            <w:tcW w:type="dxa" w:w="1020"/>
+            <w:tcW w:w="1020" w:type="dxa"/>
           </w:tcPr>
           <w:p>
             <w:pPr>
@@ -806,30 +776,21 @@
         </w:tc>
         <w:tc>
           <w:tcPr>
-            <w:tcW w:type="dxa" w:w="1814"/>
+            <w:tcW w:w="1814" w:type="dxa"/>
           </w:tcPr>
           <w:p>
             <w:pPr>
               <w:spacing w:before="40" w:after="40"/>
-              <w:jc w:val="left"/>
             </w:pPr>
-            <w:r>
-              <w:rPr>
-                <w:rFonts w:ascii="Times New Roman" w:hAnsi="Times New Roman"/>
-                <w:sz w:val="18"/>
-              </w:rPr>
-              <w:t>Sep 15-21, 2026</w:t>
-            </w:r>
           </w:p>
         </w:tc>
         <w:tc>
           <w:tcPr>
-            <w:tcW w:type="dxa" w:w="1984"/>
+            <w:tcW w:w="1984" w:type="dxa"/>
           </w:tcPr>
           <w:p>
             <w:pPr>
               <w:spacing w:before="40" w:after="40"/>
-              <w:jc w:val="left"/>
             </w:pPr>
             <w:r>
               <w:rPr>
@@ -842,51 +803,53 @@
         </w:tc>
         <w:tc>
           <w:tcPr>
-            <w:tcW w:type="dxa" w:w="5953"/>
+            <w:tcW w:w="5953" w:type="dxa"/>
           </w:tcPr>
           <w:p>
             <w:pPr>
               <w:spacing w:before="40" w:after="40"/>
-              <w:jc w:val="left"/>
             </w:pPr>
             <w:r>
               <w:rPr>
                 <w:rFonts w:ascii="Times New Roman" w:hAnsi="Times New Roman"/>
                 <w:sz w:val="18"/>
               </w:rPr>
-              <w:t>Incorporated mentor feedback. Received synopsis approval. Designed dual-stream pipeline diagram, DFD Level-0 and Level-1. Created GitHub repository: github.com/DevRanaKaila/DeepGuard-AI. Initial commit with project structure.</w:t>
+              <w:t>Incorporated mentor feedback. Received synopsis approval. Designed dual-stream pipeline diagram, DFD Level-0 and Level-1. Created GitHub repository: github.com/DevRanaKaila/DeepGuard-AI. Initial commit with project s</w:t>
+            </w:r>
+            <w:r>
+              <w:rPr>
+                <w:rFonts w:ascii="Times New Roman" w:hAnsi="Times New Roman"/>
+                <w:sz w:val="18"/>
+              </w:rPr>
+              <w:t>tructure.</w:t>
             </w:r>
           </w:p>
         </w:tc>
         <w:tc>
           <w:tcPr>
-            <w:tcW w:type="dxa" w:w="1247"/>
+            <w:tcW w:w="1247" w:type="dxa"/>
           </w:tcPr>
           <w:p>
             <w:pPr>
               <w:spacing w:before="40" w:after="40"/>
               <w:jc w:val="center"/>
             </w:pPr>
-            <w:r>
-              <w:rPr>
-                <w:rFonts w:ascii="Times New Roman" w:hAnsi="Times New Roman"/>
-                <w:sz w:val="18"/>
-              </w:rPr>
-              <w:t>Completed</w:t>
-            </w:r>
           </w:p>
         </w:tc>
         <w:tc>
           <w:tcPr>
-            <w:tcW w:type="dxa" w:w="2476"/>
+            <w:tcW w:w="2476" w:type="dxa"/>
           </w:tcPr>
           <w:p/>
         </w:tc>
       </w:tr>
       <w:tr>
+        <w:trPr>
+          <w:jc w:val="center"/>
+        </w:trPr>
         <w:tc>
           <w:tcPr>
-            <w:tcW w:type="dxa" w:w="1020"/>
+            <w:tcW w:w="1020" w:type="dxa"/>
           </w:tcPr>
           <w:p>
             <w:pPr>
@@ -905,30 +868,21 @@
         </w:tc>
         <w:tc>
           <w:tcPr>
-            <w:tcW w:type="dxa" w:w="1814"/>
+            <w:tcW w:w="1814" w:type="dxa"/>
           </w:tcPr>
           <w:p>
             <w:pPr>
               <w:spacing w:before="40" w:after="40"/>
-              <w:jc w:val="left"/>
             </w:pPr>
-            <w:r>
-              <w:rPr>
-                <w:rFonts w:ascii="Times New Roman" w:hAnsi="Times New Roman"/>
-                <w:sz w:val="18"/>
-              </w:rPr>
-              <w:t>Sep 22-28, 2026</w:t>
-            </w:r>
           </w:p>
         </w:tc>
         <w:tc>
           <w:tcPr>
-            <w:tcW w:type="dxa" w:w="1984"/>
+            <w:tcW w:w="1984" w:type="dxa"/>
           </w:tcPr>
           <w:p>
             <w:pPr>
               <w:spacing w:before="40" w:after="40"/>
-              <w:jc w:val="left"/>
             </w:pPr>
             <w:r>
               <w:rPr>
@@ -941,51 +895,53 @@
         </w:tc>
         <w:tc>
           <w:tcPr>
-            <w:tcW w:type="dxa" w:w="5953"/>
+            <w:tcW w:w="5953" w:type="dxa"/>
           </w:tcPr>
           <w:p>
             <w:pPr>
               <w:spacing w:before="40" w:after="40"/>
-              <w:jc w:val="left"/>
             </w:pPr>
             <w:r>
               <w:rPr>
                 <w:rFonts w:ascii="Times New Roman" w:hAnsi="Times New Roman"/>
                 <w:sz w:val="18"/>
               </w:rPr>
-              <w:t>Set up FaceForensics++ dataset structure. Implemented video frame extraction at 5 FPS using OpenCV. Integrated MTCNN for face detection with 15% boundary margin. Verified preprocessing pipeline on 50 sample videos. Created src/data/ module.</w:t>
+              <w:t xml:space="preserve">Set up FaceForensics++ dataset structure. Implemented video frame extraction at 5 FPS using OpenCV. Integrated MTCNN for face detection with 15% boundary margin. </w:t>
+            </w:r>
+            <w:r>
+              <w:rPr>
+                <w:rFonts w:ascii="Times New Roman" w:hAnsi="Times New Roman"/>
+                <w:sz w:val="18"/>
+              </w:rPr>
+              <w:t>Verified preprocessing pipeline on 50 sample videos. Created src/data/ module.</w:t>
             </w:r>
           </w:p>
         </w:tc>
         <w:tc>
           <w:tcPr>
-            <w:tcW w:type="dxa" w:w="1247"/>
+            <w:tcW w:w="1247" w:type="dxa"/>
           </w:tcPr>
           <w:p>
             <w:pPr>
               <w:spacing w:before="40" w:after="40"/>
               <w:jc w:val="center"/>
             </w:pPr>
-            <w:r>
-              <w:rPr>
-                <w:rFonts w:ascii="Times New Roman" w:hAnsi="Times New Roman"/>
-                <w:sz w:val="18"/>
-              </w:rPr>
-              <w:t>Completed</w:t>
-            </w:r>
           </w:p>
         </w:tc>
         <w:tc>
           <w:tcPr>
-            <w:tcW w:type="dxa" w:w="2476"/>
+            <w:tcW w:w="2476" w:type="dxa"/>
           </w:tcPr>
           <w:p/>
         </w:tc>
       </w:tr>
       <w:tr>
+        <w:trPr>
+          <w:jc w:val="center"/>
+        </w:trPr>
         <w:tc>
           <w:tcPr>
-            <w:tcW w:type="dxa" w:w="1020"/>
+            <w:tcW w:w="1020" w:type="dxa"/>
           </w:tcPr>
           <w:p>
             <w:pPr>
@@ -1004,30 +960,21 @@
         </w:tc>
         <w:tc>
           <w:tcPr>
-            <w:tcW w:type="dxa" w:w="1814"/>
+            <w:tcW w:w="1814" w:type="dxa"/>
           </w:tcPr>
           <w:p>
             <w:pPr>
               <w:spacing w:before="40" w:after="40"/>
-              <w:jc w:val="left"/>
             </w:pPr>
-            <w:r>
-              <w:rPr>
-                <w:rFonts w:ascii="Times New Roman" w:hAnsi="Times New Roman"/>
-                <w:sz w:val="18"/>
-              </w:rPr>
-              <w:t>Sep 29-Oct 5, 2026</w:t>
-            </w:r>
           </w:p>
         </w:tc>
         <w:tc>
           <w:tcPr>
-            <w:tcW w:type="dxa" w:w="1984"/>
+            <w:tcW w:w="1984" w:type="dxa"/>
           </w:tcPr>
           <w:p>
             <w:pPr>
               <w:spacing w:before="40" w:after="40"/>
-              <w:jc w:val="left"/>
             </w:pPr>
             <w:r>
               <w:rPr>
@@ -1040,51 +987,53 @@
         </w:tc>
         <w:tc>
           <w:tcPr>
-            <w:tcW w:type="dxa" w:w="5953"/>
+            <w:tcW w:w="5953" w:type="dxa"/>
           </w:tcPr>
           <w:p>
             <w:pPr>
               <w:spacing w:before="40" w:after="40"/>
-              <w:jc w:val="left"/>
             </w:pPr>
             <w:r>
               <w:rPr>
                 <w:rFonts w:ascii="Times New Roman" w:hAnsi="Times New Roman"/>
                 <w:sz w:val="18"/>
               </w:rPr>
-              <w:t>Integrated EfficientNet-B4 backbone via timm (pretrained ImageNet). Implemented SpatialStream module in src/models/spatial_stream.py. Validated 1792-d feature vector output and gradient flow. Spatial-only baseline achieves 82% accuracy.</w:t>
+              <w:t>Integrated EfficientNet-B4 backbone via timm (pretrained ImageNet). Implemented SpatialStream module in src/m</w:t>
+            </w:r>
+            <w:r>
+              <w:rPr>
+                <w:rFonts w:ascii="Times New Roman" w:hAnsi="Times New Roman"/>
+                <w:sz w:val="18"/>
+              </w:rPr>
+              <w:t>odels/spatial_stream.py. Validated 1792-d feature vector output and gradient flow. Spatial-only baseline achieves 82% accuracy.</w:t>
             </w:r>
           </w:p>
         </w:tc>
         <w:tc>
           <w:tcPr>
-            <w:tcW w:type="dxa" w:w="1247"/>
+            <w:tcW w:w="1247" w:type="dxa"/>
           </w:tcPr>
           <w:p>
             <w:pPr>
               <w:spacing w:before="40" w:after="40"/>
               <w:jc w:val="center"/>
             </w:pPr>
-            <w:r>
-              <w:rPr>
-                <w:rFonts w:ascii="Times New Roman" w:hAnsi="Times New Roman"/>
-                <w:sz w:val="18"/>
-              </w:rPr>
-              <w:t>In Progress</w:t>
-            </w:r>
           </w:p>
         </w:tc>
         <w:tc>
           <w:tcPr>
-            <w:tcW w:type="dxa" w:w="2476"/>
+            <w:tcW w:w="2476" w:type="dxa"/>
           </w:tcPr>
           <w:p/>
         </w:tc>
       </w:tr>
       <w:tr>
+        <w:trPr>
+          <w:jc w:val="center"/>
+        </w:trPr>
         <w:tc>
           <w:tcPr>
-            <w:tcW w:type="dxa" w:w="1020"/>
+            <w:tcW w:w="1020" w:type="dxa"/>
           </w:tcPr>
           <w:p>
             <w:pPr>
@@ -1103,30 +1052,21 @@
         </w:tc>
         <w:tc>
           <w:tcPr>
-            <w:tcW w:type="dxa" w:w="1814"/>
+            <w:tcW w:w="1814" w:type="dxa"/>
           </w:tcPr>
           <w:p>
             <w:pPr>
               <w:spacing w:before="40" w:after="40"/>
-              <w:jc w:val="left"/>
             </w:pPr>
-            <w:r>
-              <w:rPr>
-                <w:rFonts w:ascii="Times New Roman" w:hAnsi="Times New Roman"/>
-                <w:sz w:val="18"/>
-              </w:rPr>
-              <w:t>Oct 06-12, 2026</w:t>
-            </w:r>
           </w:p>
         </w:tc>
         <w:tc>
           <w:tcPr>
-            <w:tcW w:type="dxa" w:w="1984"/>
+            <w:tcW w:w="1984" w:type="dxa"/>
           </w:tcPr>
           <w:p>
             <w:pPr>
               <w:spacing w:before="40" w:after="40"/>
-              <w:jc w:val="left"/>
             </w:pPr>
             <w:r>
               <w:rPr>
@@ -1139,51 +1079,53 @@
         </w:tc>
         <w:tc>
           <w:tcPr>
-            <w:tcW w:type="dxa" w:w="5953"/>
+            <w:tcW w:w="5953" w:type="dxa"/>
           </w:tcPr>
           <w:p>
             <w:pPr>
               <w:spacing w:before="40" w:after="40"/>
-              <w:jc w:val="left"/>
             </w:pPr>
             <w:r>
               <w:rPr>
                 <w:rFonts w:ascii="Times New Roman" w:hAnsi="Times New Roman"/>
                 <w:sz w:val="18"/>
               </w:rPr>
-              <w:t>Implemented 2D-DCT-II transform and Radial Azimuthal Spectrum A(r) in src/data/dct_transform.py. Demonstrated spatial pipeline to mentor. Prepared mid-term progress report. Frequency stream CNN prototype initiated.</w:t>
+              <w:t xml:space="preserve">Implemented 2D-DCT-II transform and Radial Azimuthal </w:t>
+            </w:r>
+            <w:r>
+              <w:rPr>
+                <w:rFonts w:ascii="Times New Roman" w:hAnsi="Times New Roman"/>
+                <w:sz w:val="18"/>
+              </w:rPr>
+              <w:t>Spectrum A(r) in src/data/dct_transform.py. Demonstrated spatial pipeline to mentor. Prepared mid-term progress report. Frequency stream CNN prototype initiated.</w:t>
             </w:r>
           </w:p>
         </w:tc>
         <w:tc>
           <w:tcPr>
-            <w:tcW w:type="dxa" w:w="1247"/>
+            <w:tcW w:w="1247" w:type="dxa"/>
           </w:tcPr>
           <w:p>
             <w:pPr>
               <w:spacing w:before="40" w:after="40"/>
               <w:jc w:val="center"/>
             </w:pPr>
-            <w:r>
-              <w:rPr>
-                <w:rFonts w:ascii="Times New Roman" w:hAnsi="Times New Roman"/>
-                <w:sz w:val="18"/>
-              </w:rPr>
-              <w:t>Upcoming</w:t>
-            </w:r>
           </w:p>
         </w:tc>
         <w:tc>
           <w:tcPr>
-            <w:tcW w:type="dxa" w:w="2476"/>
+            <w:tcW w:w="2476" w:type="dxa"/>
           </w:tcPr>
           <w:p/>
         </w:tc>
       </w:tr>
       <w:tr>
+        <w:trPr>
+          <w:jc w:val="center"/>
+        </w:trPr>
         <w:tc>
           <w:tcPr>
-            <w:tcW w:type="dxa" w:w="1020"/>
+            <w:tcW w:w="1020" w:type="dxa"/>
           </w:tcPr>
           <w:p>
             <w:pPr>
@@ -1196,36 +1138,28 @@
                 <w:b/>
                 <w:sz w:val="18"/>
               </w:rPr>
+              <w:lastRenderedPageBreak/>
               <w:t>Week 7</w:t>
             </w:r>
           </w:p>
         </w:tc>
         <w:tc>
           <w:tcPr>
-            <w:tcW w:type="dxa" w:w="1814"/>
+            <w:tcW w:w="1814" w:type="dxa"/>
           </w:tcPr>
           <w:p>
             <w:pPr>
               <w:spacing w:before="40" w:after="40"/>
-              <w:jc w:val="left"/>
             </w:pPr>
-            <w:r>
-              <w:rPr>
-                <w:rFonts w:ascii="Times New Roman" w:hAnsi="Times New Roman"/>
-                <w:sz w:val="18"/>
-              </w:rPr>
-              <w:t>Oct 13-19, 2026</w:t>
-            </w:r>
           </w:p>
         </w:tc>
         <w:tc>
           <w:tcPr>
-            <w:tcW w:type="dxa" w:w="1984"/>
+            <w:tcW w:w="1984" w:type="dxa"/>
           </w:tcPr>
           <w:p>
             <w:pPr>
               <w:spacing w:before="40" w:after="40"/>
-              <w:jc w:val="left"/>
             </w:pPr>
             <w:r>
               <w:rPr>
@@ -1238,51 +1172,53 @@
         </w:tc>
         <w:tc>
           <w:tcPr>
-            <w:tcW w:type="dxa" w:w="5953"/>
+            <w:tcW w:w="5953" w:type="dxa"/>
           </w:tcPr>
           <w:p>
             <w:pPr>
               <w:spacing w:before="40" w:after="40"/>
-              <w:jc w:val="left"/>
             </w:pPr>
             <w:r>
               <w:rPr>
                 <w:rFonts w:ascii="Times New Roman" w:hAnsi="Times New Roman"/>
                 <w:sz w:val="18"/>
               </w:rPr>
-              <w:t>Implement 4-stage Spectral-CNN (src/models/frequency_stream.py). Implement attention-gated bilinear fusion (src/models/fusion.py). Complete DualStreamNet integration. Begin full training on FF++ c23 split.</w:t>
+              <w:t>Implement 4-stage Spectral-</w:t>
+            </w:r>
+            <w:r>
+              <w:rPr>
+                <w:rFonts w:ascii="Times New Roman" w:hAnsi="Times New Roman"/>
+                <w:sz w:val="18"/>
+              </w:rPr>
+              <w:t>CNN (src/models/frequency_stream.py). Implement attention-gated bilinear fusion (src/models/fusion.py). Complete DualStreamNet integration. Begin full training on FF++ c23 split.</w:t>
             </w:r>
           </w:p>
         </w:tc>
         <w:tc>
           <w:tcPr>
-            <w:tcW w:type="dxa" w:w="1247"/>
+            <w:tcW w:w="1247" w:type="dxa"/>
           </w:tcPr>
           <w:p>
             <w:pPr>
               <w:spacing w:before="40" w:after="40"/>
               <w:jc w:val="center"/>
             </w:pPr>
-            <w:r>
-              <w:rPr>
-                <w:rFonts w:ascii="Times New Roman" w:hAnsi="Times New Roman"/>
-                <w:sz w:val="18"/>
-              </w:rPr>
-              <w:t>Upcoming</w:t>
-            </w:r>
           </w:p>
         </w:tc>
         <w:tc>
           <w:tcPr>
-            <w:tcW w:type="dxa" w:w="2476"/>
+            <w:tcW w:w="2476" w:type="dxa"/>
           </w:tcPr>
           <w:p/>
         </w:tc>
       </w:tr>
       <w:tr>
+        <w:trPr>
+          <w:jc w:val="center"/>
+        </w:trPr>
         <w:tc>
           <w:tcPr>
-            <w:tcW w:type="dxa" w:w="1020"/>
+            <w:tcW w:w="1020" w:type="dxa"/>
           </w:tcPr>
           <w:p>
             <w:pPr>
@@ -1301,30 +1237,21 @@
         </w:tc>
         <w:tc>
           <w:tcPr>
-            <w:tcW w:type="dxa" w:w="1814"/>
+            <w:tcW w:w="1814" w:type="dxa"/>
           </w:tcPr>
           <w:p>
             <w:pPr>
               <w:spacing w:before="40" w:after="40"/>
-              <w:jc w:val="left"/>
             </w:pPr>
-            <w:r>
-              <w:rPr>
-                <w:rFonts w:ascii="Times New Roman" w:hAnsi="Times New Roman"/>
-                <w:sz w:val="18"/>
-              </w:rPr>
-              <w:t>Oct 20-26, 2026</w:t>
-            </w:r>
           </w:p>
         </w:tc>
         <w:tc>
           <w:tcPr>
-            <w:tcW w:type="dxa" w:w="1984"/>
+            <w:tcW w:w="1984" w:type="dxa"/>
           </w:tcPr>
           <w:p>
             <w:pPr>
               <w:spacing w:before="40" w:after="40"/>
-              <w:jc w:val="left"/>
             </w:pPr>
             <w:r>
               <w:rPr>
@@ -1337,51 +1264,53 @@
         </w:tc>
         <w:tc>
           <w:tcPr>
-            <w:tcW w:type="dxa" w:w="5953"/>
+            <w:tcW w:w="5953" w:type="dxa"/>
           </w:tcPr>
           <w:p>
             <w:pPr>
               <w:spacing w:before="40" w:after="40"/>
-              <w:jc w:val="left"/>
             </w:pPr>
             <w:r>
               <w:rPr>
                 <w:rFonts w:ascii="Times New Roman" w:hAnsi="Times New Roman"/>
                 <w:sz w:val="18"/>
               </w:rPr>
-              <w:t>Develop Streamlit web dashboard (app.py). Implement Grad-CAM heatmap generator (src/utils/gradcam.py). End-to-end pipeline integration. Cross-dataset testing on Celeb-DF v2. Benchmark against XceptionNet and F3-Net.</w:t>
+              <w:t xml:space="preserve">Develop </w:t>
+            </w:r>
+            <w:r>
+              <w:rPr>
+                <w:rFonts w:ascii="Times New Roman" w:hAnsi="Times New Roman"/>
+                <w:sz w:val="18"/>
+              </w:rPr>
+              <w:t>Streamlit web dashboard (app.py). Implement Grad-CAM heatmap generator (src/utils/gradcam.py). End-to-end pipeline integration. Cross-dataset testing on Celeb-DF v2. Benchmark against XceptionNet and F3-Net.</w:t>
             </w:r>
           </w:p>
         </w:tc>
         <w:tc>
           <w:tcPr>
-            <w:tcW w:type="dxa" w:w="1247"/>
+            <w:tcW w:w="1247" w:type="dxa"/>
           </w:tcPr>
           <w:p>
             <w:pPr>
               <w:spacing w:before="40" w:after="40"/>
               <w:jc w:val="center"/>
             </w:pPr>
-            <w:r>
-              <w:rPr>
-                <w:rFonts w:ascii="Times New Roman" w:hAnsi="Times New Roman"/>
-                <w:sz w:val="18"/>
-              </w:rPr>
-              <w:t>Upcoming</w:t>
-            </w:r>
           </w:p>
         </w:tc>
         <w:tc>
           <w:tcPr>
-            <w:tcW w:type="dxa" w:w="2476"/>
+            <w:tcW w:w="2476" w:type="dxa"/>
           </w:tcPr>
           <w:p/>
         </w:tc>
       </w:tr>
       <w:tr>
+        <w:trPr>
+          <w:jc w:val="center"/>
+        </w:trPr>
         <w:tc>
           <w:tcPr>
-            <w:tcW w:type="dxa" w:w="1020"/>
+            <w:tcW w:w="1020" w:type="dxa"/>
           </w:tcPr>
           <w:p>
             <w:pPr>
@@ -1400,48 +1329,45 @@
         </w:tc>
         <w:tc>
           <w:tcPr>
-            <w:tcW w:type="dxa" w:w="1814"/>
+            <w:tcW w:w="1814" w:type="dxa"/>
           </w:tcPr>
           <w:p>
             <w:pPr>
               <w:spacing w:before="40" w:after="40"/>
-              <w:jc w:val="left"/>
+            </w:pPr>
+          </w:p>
+        </w:tc>
+        <w:tc>
+          <w:tcPr>
+            <w:tcW w:w="1984" w:type="dxa"/>
+          </w:tcPr>
+          <w:p>
+            <w:pPr>
+              <w:spacing w:before="40" w:after="40"/>
             </w:pPr>
             <w:r>
               <w:rPr>
                 <w:rFonts w:ascii="Times New Roman" w:hAnsi="Times New Roman"/>
                 <w:sz w:val="18"/>
               </w:rPr>
-              <w:t>Oct 27-Nov 2, 2026</w:t>
+              <w:t>Report Writ</w:t>
+            </w:r>
+            <w:r>
+              <w:rPr>
+                <w:rFonts w:ascii="Times New Roman" w:hAnsi="Times New Roman"/>
+                <w:sz w:val="18"/>
+              </w:rPr>
+              <w:t>ing &amp; Code Finalization</w:t>
             </w:r>
           </w:p>
         </w:tc>
         <w:tc>
           <w:tcPr>
-            <w:tcW w:type="dxa" w:w="1984"/>
+            <w:tcW w:w="5953" w:type="dxa"/>
           </w:tcPr>
           <w:p>
             <w:pPr>
               <w:spacing w:before="40" w:after="40"/>
-              <w:jc w:val="left"/>
-            </w:pPr>
-            <w:r>
-              <w:rPr>
-                <w:rFonts w:ascii="Times New Roman" w:hAnsi="Times New Roman"/>
-                <w:sz w:val="18"/>
-              </w:rPr>
-              <w:t>Report Writing &amp; Code Finalization</w:t>
-            </w:r>
-          </w:p>
-        </w:tc>
-        <w:tc>
-          <w:tcPr>
-            <w:tcW w:type="dxa" w:w="5953"/>
-          </w:tcPr>
-          <w:p>
-            <w:pPr>
-              <w:spacing w:before="40" w:after="40"/>
-              <w:jc w:val="left"/>
             </w:pPr>
             <w:r>
               <w:rPr>
@@ -1454,33 +1380,29 @@
         </w:tc>
         <w:tc>
           <w:tcPr>
-            <w:tcW w:type="dxa" w:w="1247"/>
+            <w:tcW w:w="1247" w:type="dxa"/>
           </w:tcPr>
           <w:p>
             <w:pPr>
               <w:spacing w:before="40" w:after="40"/>
               <w:jc w:val="center"/>
             </w:pPr>
-            <w:r>
-              <w:rPr>
-                <w:rFonts w:ascii="Times New Roman" w:hAnsi="Times New Roman"/>
-                <w:sz w:val="18"/>
-              </w:rPr>
-              <w:t>Upcoming</w:t>
-            </w:r>
           </w:p>
         </w:tc>
         <w:tc>
           <w:tcPr>
-            <w:tcW w:type="dxa" w:w="2476"/>
+            <w:tcW w:w="2476" w:type="dxa"/>
           </w:tcPr>
           <w:p/>
         </w:tc>
       </w:tr>
       <w:tr>
+        <w:trPr>
+          <w:jc w:val="center"/>
+        </w:trPr>
         <w:tc>
           <w:tcPr>
-            <w:tcW w:type="dxa" w:w="1020"/>
+            <w:tcW w:w="1020" w:type="dxa"/>
           </w:tcPr>
           <w:p>
             <w:pPr>
@@ -1499,48 +1421,45 @@
         </w:tc>
         <w:tc>
           <w:tcPr>
-            <w:tcW w:type="dxa" w:w="1814"/>
+            <w:tcW w:w="1814" w:type="dxa"/>
           </w:tcPr>
           <w:p>
             <w:pPr>
               <w:spacing w:before="40" w:after="40"/>
-              <w:jc w:val="left"/>
+            </w:pPr>
+          </w:p>
+        </w:tc>
+        <w:tc>
+          <w:tcPr>
+            <w:tcW w:w="1984" w:type="dxa"/>
+          </w:tcPr>
+          <w:p>
+            <w:pPr>
+              <w:spacing w:before="40" w:after="40"/>
             </w:pPr>
             <w:r>
               <w:rPr>
                 <w:rFonts w:ascii="Times New Roman" w:hAnsi="Times New Roman"/>
                 <w:sz w:val="18"/>
               </w:rPr>
-              <w:t>Nov 03-09, 2026</w:t>
+              <w:t>Final S</w:t>
+            </w:r>
+            <w:r>
+              <w:rPr>
+                <w:rFonts w:ascii="Times New Roman" w:hAnsi="Times New Roman"/>
+                <w:sz w:val="18"/>
+              </w:rPr>
+              <w:t>ubmission &amp; Viva Defense</w:t>
             </w:r>
           </w:p>
         </w:tc>
         <w:tc>
           <w:tcPr>
-            <w:tcW w:type="dxa" w:w="1984"/>
+            <w:tcW w:w="5953" w:type="dxa"/>
           </w:tcPr>
           <w:p>
             <w:pPr>
               <w:spacing w:before="40" w:after="40"/>
-              <w:jc w:val="left"/>
-            </w:pPr>
-            <w:r>
-              <w:rPr>
-                <w:rFonts w:ascii="Times New Roman" w:hAnsi="Times New Roman"/>
-                <w:sz w:val="18"/>
-              </w:rPr>
-              <w:t>Final Submission &amp; Viva Defense</w:t>
-            </w:r>
-          </w:p>
-        </w:tc>
-        <w:tc>
-          <w:tcPr>
-            <w:tcW w:type="dxa" w:w="5953"/>
-          </w:tcPr>
-          <w:p>
-            <w:pPr>
-              <w:spacing w:before="40" w:after="40"/>
-              <w:jc w:val="left"/>
             </w:pPr>
             <w:r>
               <w:rPr>
@@ -1553,25 +1472,18 @@
         </w:tc>
         <w:tc>
           <w:tcPr>
-            <w:tcW w:type="dxa" w:w="1247"/>
+            <w:tcW w:w="1247" w:type="dxa"/>
           </w:tcPr>
           <w:p>
             <w:pPr>
               <w:spacing w:before="40" w:after="40"/>
               <w:jc w:val="center"/>
             </w:pPr>
-            <w:r>
-              <w:rPr>
-                <w:rFonts w:ascii="Times New Roman" w:hAnsi="Times New Roman"/>
-                <w:sz w:val="18"/>
-              </w:rPr>
-              <w:t>Upcoming</w:t>
-            </w:r>
           </w:p>
         </w:tc>
         <w:tc>
           <w:tcPr>
-            <w:tcW w:type="dxa" w:w="2476"/>
+            <w:tcW w:w="2476" w:type="dxa"/>
           </w:tcPr>
           <w:p/>
         </w:tc>
@@ -1581,48 +1493,73 @@
     <w:p>
       <w:pPr>
         <w:spacing w:before="40" w:after="80"/>
-        <w:jc w:val="left"/>
       </w:pPr>
       <w:r>
         <w:rPr>
           <w:rFonts w:ascii="Times New Roman" w:hAnsi="Times New Roman"/>
-          <w:b w:val="0"/>
           <w:sz w:val="20"/>
         </w:rPr>
-        <w:t>Note: Weeks marked Completed have been signed by the Project Guide. Remaining weeks will be signed upon completion of respective activities.</w:t>
+        <w:t xml:space="preserve">Note: Weeks marked Completed </w:t>
+      </w:r>
+      <w:r>
+        <w:rPr>
+          <w:rFonts w:ascii="Times New Roman" w:hAnsi="Times New Roman"/>
+          <w:sz w:val="20"/>
+        </w:rPr>
+        <w:t>have been signed by the Project Guide. Remaining weeks will be signed upon completion of respective activities.</w:t>
       </w:r>
     </w:p>
     <w:tbl>
       <w:tblPr>
-        <w:tblW w:type="auto" w:w="0"/>
+        <w:tblW w:w="0" w:type="auto"/>
         <w:jc w:val="center"/>
-        <w:tblLook w:firstColumn="1" w:firstRow="1" w:lastColumn="0" w:lastRow="0" w:noHBand="0" w:noVBand="1" w:val="04A0"/>
+        <w:tblLook w:val="04A0"/>
       </w:tblPr>
       <w:tblGrid>
         <w:gridCol w:w="7427"/>
         <w:gridCol w:w="7427"/>
       </w:tblGrid>
       <w:tr>
+        <w:trPr>
+          <w:jc w:val="center"/>
+        </w:trPr>
         <w:tc>
           <w:tcPr>
-            <w:tcW w:type="dxa" w:w="7427"/>
+            <w:tcW w:w="7427" w:type="dxa"/>
+          </w:tcPr>
+          <w:p/>
+        </w:tc>
+        <w:tc>
+          <w:tcPr>
+            <w:tcW w:w="7427" w:type="dxa"/>
           </w:tcPr>
           <w:p>
             <w:pPr>
-              <w:jc w:val="left"/>
+              <w:jc w:val="right"/>
             </w:pPr>
+          </w:p>
+        </w:tc>
+      </w:tr>
+      <w:tr>
+        <w:trPr>
+          <w:jc w:val="center"/>
+        </w:trPr>
+        <w:tc>
+          <w:tcPr>
+            <w:tcW w:w="7427" w:type="dxa"/>
+          </w:tcPr>
+          <w:p>
             <w:r>
               <w:rPr>
                 <w:rFonts w:ascii="Times New Roman" w:hAnsi="Times New Roman"/>
-                <w:b w:val="0"/>
-                <w:sz w:val="22"/>
               </w:rPr>
+              <w:t>Student Signature: _______________________</w:t>
             </w:r>
           </w:p>
         </w:tc>
         <w:tc>
           <w:tcPr>
-            <w:tcW w:type="dxa" w:w="7427"/>
+            <w:tcW w:w="7427" w:type="dxa"/>
           </w:tcPr>
           <w:p>
             <w:pPr>
@@ -1631,45 +1568,6 @@
             <w:r>
               <w:rPr>
                 <w:rFonts w:ascii="Times New Roman" w:hAnsi="Times New Roman"/>
-                <w:b w:val="0"/>
-                <w:sz w:val="22"/>
-              </w:rPr>
-            </w:r>
-          </w:p>
-        </w:tc>
-      </w:tr>
-      <w:tr>
-        <w:tc>
-          <w:tcPr>
-            <w:tcW w:type="dxa" w:w="7427"/>
-          </w:tcPr>
-          <w:p>
-            <w:pPr>
-              <w:jc w:val="left"/>
-            </w:pPr>
-            <w:r>
-              <w:rPr>
-                <w:rFonts w:ascii="Times New Roman" w:hAnsi="Times New Roman"/>
-                <w:b w:val="0"/>
-                <w:sz w:val="22"/>
-              </w:rPr>
-              <w:t>Student Signature: _______________________</w:t>
-            </w:r>
-          </w:p>
-        </w:tc>
-        <w:tc>
-          <w:tcPr>
-            <w:tcW w:type="dxa" w:w="7427"/>
-          </w:tcPr>
-          <w:p>
-            <w:pPr>
-              <w:jc w:val="right"/>
-            </w:pPr>
-            <w:r>
-              <w:rPr>
-                <w:rFonts w:ascii="Times New Roman" w:hAnsi="Times New Roman"/>
-                <w:b w:val="0"/>
-                <w:sz w:val="22"/>
               </w:rPr>
               <w:t>Guide Signature: _______________________</w:t>
             </w:r>
@@ -1677,19 +1575,18 @@
         </w:tc>
       </w:tr>
       <w:tr>
+        <w:trPr>
+          <w:jc w:val="center"/>
+        </w:trPr>
         <w:tc>
           <w:tcPr>
-            <w:tcW w:type="dxa" w:w="7427"/>
+            <w:tcW w:w="7427" w:type="dxa"/>
           </w:tcPr>
           <w:p>
-            <w:pPr>
-              <w:jc w:val="left"/>
-            </w:pPr>
             <w:r>
               <w:rPr>
                 <w:rFonts w:ascii="Times New Roman" w:hAnsi="Times New Roman"/>
                 <w:b/>
-                <w:sz w:val="22"/>
               </w:rPr>
               <w:t>Dev Rana Kaila  |  Roll No. 2301531530023</w:t>
             </w:r>
@@ -1697,7 +1594,7 @@
         </w:tc>
         <w:tc>
           <w:tcPr>
-            <w:tcW w:type="dxa" w:w="7427"/>
+            <w:tcW w:w="7427" w:type="dxa"/>
           </w:tcPr>
           <w:p>
             <w:pPr>
@@ -1707,14 +1604,21 @@
               <w:rPr>
                 <w:rFonts w:ascii="Times New Roman" w:hAnsi="Times New Roman"/>
                 <w:b/>
-                <w:sz w:val="22"/>
               </w:rPr>
-              <w:t>Dr. Devendra Gautam  |  Assoc. Professor, CSE</w:t>
+              <w:t xml:space="preserve">Dr. Devendra </w:t>
+            </w:r>
+            <w:r>
+              <w:rPr>
+                <w:rFonts w:ascii="Times New Roman" w:hAnsi="Times New Roman"/>
+                <w:b/>
+              </w:rPr>
+              <w:t>Gautam  |  Assoc. Professor, CSE</w:t>
             </w:r>
           </w:p>
         </w:tc>
       </w:tr>
     </w:tbl>
+    <w:p/>
     <w:sectPr>
       <w:pgSz w:w="16838" w:h="11906"/>
       <w:pgMar w:top="1134" w:right="850" w:bottom="850" w:left="1134" w:header="720" w:footer="720" w:gutter="0"/>
@@ -1726,7 +1630,7 @@
 </file>
 
 <file path=word/numbering.xml><?xml version="1.0" encoding="utf-8"?>
-<w:numbering xmlns:wpc="http://schemas.microsoft.com/office/word/2010/wordprocessingCanvas" xmlns:mo="http://schemas.microsoft.com/office/mac/office/2008/main" xmlns:mc="http://schemas.openxmlformats.org/markup-compatibility/2006" xmlns:mv="urn:schemas-microsoft-com:mac:vml" xmlns:o="urn:schemas-microsoft-com:office:office" xmlns:r="http://schemas.openxmlformats.org/officeDocument/2006/relationships" xmlns:m="http://schemas.openxmlformats.org/officeDocument/2006/math" xmlns:v="urn:schemas-microsoft-com:vml" xmlns:wp14="http://schemas.microsoft.com/office/word/2010/wordprocessingDrawing" xmlns:wp="http://schemas.openxmlformats.org/drawingml/2006/wordprocessingDrawing" xmlns:w10="urn:schemas-microsoft-com:office:word" xmlns:w="http://schemas.openxmlformats.org/wordprocessingml/2006/main" xmlns:w14="http://schemas.microsoft.com/office/word/2010/wordml" xmlns:wpg="http://schemas.microsoft.com/office/word/2010/wordprocessingGroup" xmlns:wpi="http://schemas.microsoft.com/office/word/2010/wordprocessingInk" xmlns:wne="http://schemas.microsoft.com/office/word/2006/wordml" xmlns:wps="http://schemas.microsoft.com/office/word/2010/wordprocessingShape" mc:Ignorable="w14 wp14">
+<w:numbering xmlns:ve="http://schemas.openxmlformats.org/markup-compatibility/2006" xmlns:o="urn:schemas-microsoft-com:office:office" xmlns:r="http://schemas.openxmlformats.org/officeDocument/2006/relationships" xmlns:m="http://schemas.openxmlformats.org/officeDocument/2006/math" xmlns:v="urn:schemas-microsoft-com:vml" xmlns:wp="http://schemas.openxmlformats.org/drawingml/2006/wordprocessingDrawing" xmlns:w10="urn:schemas-microsoft-com:office:word" xmlns:w="http://schemas.openxmlformats.org/wordprocessingml/2006/main" xmlns:wne="http://schemas.microsoft.com/office/word/2006/wordml">
   <w:abstractNum w:abstractNumId="0">
     <w:nsid w:val="FFFFFF7C"/>
     <w:multiLevelType w:val="singleLevel"/>
@@ -1929,7 +1833,7 @@
 </file>
 
 <file path=word/styles.xml><?xml version="1.0" encoding="utf-8"?>
-<w:styles xmlns:mc="http://schemas.openxmlformats.org/markup-compatibility/2006" xmlns:r="http://schemas.openxmlformats.org/officeDocument/2006/relationships" xmlns:w="http://schemas.openxmlformats.org/wordprocessingml/2006/main" xmlns:w14="http://schemas.microsoft.com/office/word/2010/wordml" mc:Ignorable="w14">
+<w:styles xmlns:r="http://schemas.openxmlformats.org/officeDocument/2006/relationships" xmlns:w="http://schemas.openxmlformats.org/wordprocessingml/2006/main">
   <w:docDefaults>
     <w:rPrDefault>
       <w:rPr>
@@ -1945,7 +1849,7 @@
       </w:pPr>
     </w:pPrDefault>
   </w:docDefaults>
-  <w:latentStyles w:defLockedState="0" w:defUIPriority="99" w:defSemiHidden="1" w:defUnhideWhenUsed="1" w:defQFormat="0" w:count="276">
+  <w:latentStyles w:defLockedState="0" w:defUIPriority="99" w:defSemiHidden="1" w:defUnhideWhenUsed="1" w:defQFormat="0" w:count="267">
     <w:lsdException w:name="Normal" w:semiHidden="0" w:uiPriority="0" w:unhideWhenUsed="0" w:qFormat="1"/>
     <w:lsdException w:name="heading 1" w:semiHidden="0" w:uiPriority="9" w:unhideWhenUsed="0" w:qFormat="1"/>
     <w:lsdException w:name="heading 2" w:uiPriority="9" w:qFormat="1"/>
@@ -2089,50 +1993,6 @@
     <w:qFormat/>
     <w:rsid w:val="00FC693F"/>
   </w:style>
-  <w:style w:type="paragraph" w:styleId="Header">
-    <w:name w:val="header"/>
-    <w:basedOn w:val="Normal"/>
-    <w:link w:val="HeaderChar"/>
-    <w:uiPriority w:val="99"/>
-    <w:unhideWhenUsed/>
-    <w:rsid w:val="00E618BF"/>
-    <w:pPr>
-      <w:tabs>
-        <w:tab w:val="center" w:pos="4680"/>
-        <w:tab w:val="right" w:pos="9360"/>
-      </w:tabs>
-      <w:spacing w:after="0" w:line="240" w:lineRule="auto"/>
-    </w:pPr>
-  </w:style>
-  <w:style w:type="character" w:customStyle="1" w:styleId="HeaderChar">
-    <w:name w:val="Header Char"/>
-    <w:basedOn w:val="DefaultParagraphFont"/>
-    <w:link w:val="Header"/>
-    <w:uiPriority w:val="99"/>
-    <w:rsid w:val="00E618BF"/>
-  </w:style>
-  <w:style w:type="paragraph" w:styleId="Footer">
-    <w:name w:val="footer"/>
-    <w:basedOn w:val="Normal"/>
-    <w:link w:val="FooterChar"/>
-    <w:uiPriority w:val="99"/>
-    <w:unhideWhenUsed/>
-    <w:rsid w:val="00E618BF"/>
-    <w:pPr>
-      <w:tabs>
-        <w:tab w:val="center" w:pos="4680"/>
-        <w:tab w:val="right" w:pos="9360"/>
-      </w:tabs>
-      <w:spacing w:after="0" w:line="240" w:lineRule="auto"/>
-    </w:pPr>
-  </w:style>
-  <w:style w:type="character" w:customStyle="1" w:styleId="FooterChar">
-    <w:name w:val="Footer Char"/>
-    <w:basedOn w:val="DefaultParagraphFont"/>
-    <w:link w:val="Footer"/>
-    <w:uiPriority w:val="99"/>
-    <w:rsid w:val="00E618BF"/>
-  </w:style>
   <w:style w:type="paragraph" w:styleId="Heading1">
     <w:name w:val="heading 1"/>
     <w:basedOn w:val="Normal"/>
@@ -2353,6 +2213,7 @@
     <w:uiPriority w:val="99"/>
     <w:semiHidden/>
     <w:unhideWhenUsed/>
+    <w:qFormat/>
     <w:tblPr>
       <w:tblInd w:w="0" w:type="dxa"/>
       <w:tblCellMar>
@@ -2368,6 +2229,50 @@
     <w:uiPriority w:val="99"/>
     <w:semiHidden/>
     <w:unhideWhenUsed/>
+  </w:style>
+  <w:style w:type="paragraph" w:styleId="Header">
+    <w:name w:val="header"/>
+    <w:basedOn w:val="Normal"/>
+    <w:link w:val="HeaderChar"/>
+    <w:uiPriority w:val="99"/>
+    <w:unhideWhenUsed/>
+    <w:rsid w:val="00E618BF"/>
+    <w:pPr>
+      <w:tabs>
+        <w:tab w:val="center" w:pos="4680"/>
+        <w:tab w:val="right" w:pos="9360"/>
+      </w:tabs>
+      <w:spacing w:after="0" w:line="240" w:lineRule="auto"/>
+    </w:pPr>
+  </w:style>
+  <w:style w:type="character" w:customStyle="1" w:styleId="HeaderChar">
+    <w:name w:val="Header Char"/>
+    <w:basedOn w:val="DefaultParagraphFont"/>
+    <w:link w:val="Header"/>
+    <w:uiPriority w:val="99"/>
+    <w:rsid w:val="00E618BF"/>
+  </w:style>
+  <w:style w:type="paragraph" w:styleId="Footer">
+    <w:name w:val="footer"/>
+    <w:basedOn w:val="Normal"/>
+    <w:link w:val="FooterChar"/>
+    <w:uiPriority w:val="99"/>
+    <w:unhideWhenUsed/>
+    <w:rsid w:val="00E618BF"/>
+    <w:pPr>
+      <w:tabs>
+        <w:tab w:val="center" w:pos="4680"/>
+        <w:tab w:val="right" w:pos="9360"/>
+      </w:tabs>
+      <w:spacing w:after="0" w:line="240" w:lineRule="auto"/>
+    </w:pPr>
+  </w:style>
+  <w:style w:type="character" w:customStyle="1" w:styleId="FooterChar">
+    <w:name w:val="Footer Char"/>
+    <w:basedOn w:val="DefaultParagraphFont"/>
+    <w:link w:val="Footer"/>
+    <w:uiPriority w:val="99"/>
+    <w:rsid w:val="00E618BF"/>
   </w:style>
   <w:style w:type="paragraph" w:styleId="NoSpacing">
     <w:name w:val="No Spacing"/>
@@ -25901,7 +25806,7 @@
 </file>
 
 <file path=customXml/itemProps1.xml><?xml version="1.0" encoding="utf-8"?>
-<ds:datastoreItem xmlns:ds="http://schemas.openxmlformats.org/officeDocument/2006/customXml" ds:itemID="{EF278816-EC6F-A645-907D-7F25AECB1D4A}">
+<ds:datastoreItem xmlns:ds="http://schemas.openxmlformats.org/officeDocument/2006/customXml" ds:itemID="{3E73CA72-6324-4F2E-B1D6-9746FDABE818}">
   <ds:schemaRefs>
     <ds:schemaRef ds:uri="http://schemas.openxmlformats.org/officeDocument/2006/bibliography"/>
   </ds:schemaRefs>

</xml_diff>

<commit_message>
feat: complete DeepGuard AI project with 58-page report, weekly logbook, visual assets, and UI dashboard
</commit_message>
<xml_diff>
--- a/SUBMISSION/Weekly_Progress_Log_Dev_Rana_Kaila.docx
+++ b/SUBMISSION/Weekly_Progress_Log_Dev_Rana_Kaila.docx
@@ -1,36 +1,10 @@
 
 <file path=word/document.xml><?xml version="1.0" encoding="utf-8"?>
-<w:document xmlns:ve="http://schemas.openxmlformats.org/markup-compatibility/2006" xmlns:o="urn:schemas-microsoft-com:office:office" xmlns:r="http://schemas.openxmlformats.org/officeDocument/2006/relationships" xmlns:m="http://schemas.openxmlformats.org/officeDocument/2006/math" xmlns:v="urn:schemas-microsoft-com:vml" xmlns:wp="http://schemas.openxmlformats.org/drawingml/2006/wordprocessingDrawing" xmlns:w10="urn:schemas-microsoft-com:office:word" xmlns:w="http://schemas.openxmlformats.org/wordprocessingml/2006/main" xmlns:wne="http://schemas.microsoft.com/office/word/2006/wordml">
+<w:document xmlns:wpc="http://schemas.microsoft.com/office/word/2010/wordprocessingCanvas" xmlns:mo="http://schemas.microsoft.com/office/mac/office/2008/main" xmlns:mc="http://schemas.openxmlformats.org/markup-compatibility/2006" xmlns:mv="urn:schemas-microsoft-com:mac:vml" xmlns:o="urn:schemas-microsoft-com:office:office" xmlns:r="http://schemas.openxmlformats.org/officeDocument/2006/relationships" xmlns:m="http://schemas.openxmlformats.org/officeDocument/2006/math" xmlns:v="urn:schemas-microsoft-com:vml" xmlns:wp14="http://schemas.microsoft.com/office/word/2010/wordprocessingDrawing" xmlns:wp="http://schemas.openxmlformats.org/drawingml/2006/wordprocessingDrawing" xmlns:w10="urn:schemas-microsoft-com:office:word" xmlns:w="http://schemas.openxmlformats.org/wordprocessingml/2006/main" xmlns:w14="http://schemas.microsoft.com/office/word/2010/wordml" xmlns:wpg="http://schemas.microsoft.com/office/word/2010/wordprocessingGroup" xmlns:wpi="http://schemas.microsoft.com/office/word/2010/wordprocessingInk" xmlns:wne="http://schemas.microsoft.com/office/word/2006/wordml" xmlns:wps="http://schemas.microsoft.com/office/word/2010/wordprocessingShape" mc:Ignorable="w14 wp14">
   <w:body>
     <w:p>
       <w:pPr>
-        <w:spacing w:after="40"/>
-        <w:jc w:val="center"/>
-      </w:pPr>
-      <w:r>
-        <w:rPr>
-          <w:rFonts w:ascii="Times New Roman" w:hAnsi="Times New Roman"/>
-          <w:b/>
-          <w:sz w:val="28"/>
-        </w:rPr>
-        <w:t>Lloyd Institute of Engineering &amp; Technology</w:t>
-      </w:r>
-    </w:p>
-    <w:p>
-      <w:pPr>
-        <w:spacing w:after="40"/>
-        <w:jc w:val="center"/>
-      </w:pPr>
-      <w:r>
-        <w:rPr>
-          <w:rFonts w:ascii="Times New Roman" w:hAnsi="Times New Roman"/>
-        </w:rPr>
-        <w:t>Department of Computer Science &amp; Engineering (AIML)  |  Session 2026-27</w:t>
-      </w:r>
-    </w:p>
-    <w:p>
-      <w:pPr>
-        <w:spacing w:before="160" w:after="160"/>
+        <w:spacing w:before="0" w:after="40"/>
         <w:jc w:val="center"/>
       </w:pPr>
       <w:r>
@@ -39,29 +13,65 @@
           <w:b/>
           <w:sz w:val="30"/>
         </w:rPr>
+        <w:t>Lloyd Institute of Engineering &amp; Technology</w:t>
+      </w:r>
+    </w:p>
+    <w:p>
+      <w:pPr>
+        <w:spacing w:before="0" w:after="40"/>
+        <w:jc w:val="center"/>
+      </w:pPr>
+      <w:r>
+        <w:rPr>
+          <w:rFonts w:ascii="Times New Roman" w:hAnsi="Times New Roman"/>
+          <w:sz w:val="22"/>
+        </w:rPr>
+        <w:t>Department of Computer Science &amp; Engineering (AIML)  |  Session 2026-27</w:t>
+      </w:r>
+    </w:p>
+    <w:p>
+      <w:pPr>
+        <w:spacing w:before="40" w:after="160"/>
+        <w:jc w:val="center"/>
+      </w:pPr>
+      <w:r>
+        <w:rPr>
+          <w:rFonts w:ascii="Times New Roman" w:hAnsi="Times New Roman"/>
+          <w:b/>
+          <w:sz w:val="26"/>
+        </w:rPr>
         <w:t>MINI PROJECT - WEEKLY PROGRESS LOG</w:t>
       </w:r>
     </w:p>
     <w:tbl>
       <w:tblPr>
-        <w:tblStyle w:val="TableGrid"/>
-        <w:tblW w:w="0" w:type="auto"/>
+        <w:tblW w:type="auto" w:w="0"/>
         <w:jc w:val="center"/>
-        <w:tblLook w:val="04A0"/>
+        <w:tblLook w:firstColumn="1" w:firstRow="1" w:lastColumn="0" w:lastRow="0" w:noHBand="0" w:noVBand="1" w:val="04A0"/>
       </w:tblPr>
       <w:tblGrid>
-        <w:gridCol w:w="3713"/>
-        <w:gridCol w:w="3713"/>
-        <w:gridCol w:w="3713"/>
-        <w:gridCol w:w="3713"/>
+        <w:gridCol w:w="3741"/>
+        <w:gridCol w:w="3741"/>
+        <w:gridCol w:w="3741"/>
+        <w:gridCol w:w="3741"/>
       </w:tblGrid>
       <w:tr>
-        <w:trPr>
-          <w:jc w:val="center"/>
-        </w:trPr>
         <w:tc>
           <w:tcPr>
-            <w:tcW w:w="3713" w:type="dxa"/>
+            <w:tcW w:type="dxa" w:w="2592"/>
+            <w:tcMar>
+              <w:top w:w="80" w:type="dxa"/>
+              <w:bottom w:w="80" w:type="dxa"/>
+              <w:left w:w="100" w:type="dxa"/>
+              <w:right w:w="100" w:type="dxa"/>
+            </w:tcMar>
+            <w:tcBorders>
+              <w:top w:val="single" w:sz="4" w:space="0" w:color="888888"/>
+              <w:bottom w:val="single" w:sz="4" w:space="0" w:color="888888"/>
+              <w:left w:val="single" w:sz="4" w:space="0" w:color="888888"/>
+              <w:right w:val="single" w:sz="4" w:space="0" w:color="888888"/>
+            </w:tcBorders>
+            <w:shd w:fill="F0F4F8"/>
           </w:tcPr>
           <w:p>
             <w:pPr>
@@ -71,7 +81,7 @@
               <w:rPr>
                 <w:rFonts w:ascii="Times New Roman" w:hAnsi="Times New Roman"/>
                 <w:b/>
-                <w:sz w:val="20"/>
+                <w:sz w:val="19"/>
               </w:rPr>
               <w:t>Student Name</w:t>
             </w:r>
@@ -79,7 +89,19 @@
         </w:tc>
         <w:tc>
           <w:tcPr>
-            <w:tcW w:w="3713" w:type="dxa"/>
+            <w:tcW w:type="dxa" w:w="5184"/>
+            <w:tcMar>
+              <w:top w:w="80" w:type="dxa"/>
+              <w:bottom w:w="80" w:type="dxa"/>
+              <w:left w:w="100" w:type="dxa"/>
+              <w:right w:w="100" w:type="dxa"/>
+            </w:tcMar>
+            <w:tcBorders>
+              <w:top w:val="single" w:sz="4" w:space="0" w:color="888888"/>
+              <w:bottom w:val="single" w:sz="4" w:space="0" w:color="888888"/>
+              <w:left w:val="single" w:sz="4" w:space="0" w:color="888888"/>
+              <w:right w:val="single" w:sz="4" w:space="0" w:color="888888"/>
+            </w:tcBorders>
           </w:tcPr>
           <w:p>
             <w:pPr>
@@ -88,7 +110,8 @@
             <w:r>
               <w:rPr>
                 <w:rFonts w:ascii="Times New Roman" w:hAnsi="Times New Roman"/>
-                <w:sz w:val="20"/>
+                <w:b w:val="0"/>
+                <w:sz w:val="19"/>
               </w:rPr>
               <w:t>Dev Rana Kaila</w:t>
             </w:r>
@@ -96,7 +119,20 @@
         </w:tc>
         <w:tc>
           <w:tcPr>
-            <w:tcW w:w="3713" w:type="dxa"/>
+            <w:tcW w:type="dxa" w:w="2592"/>
+            <w:tcMar>
+              <w:top w:w="80" w:type="dxa"/>
+              <w:bottom w:w="80" w:type="dxa"/>
+              <w:left w:w="100" w:type="dxa"/>
+              <w:right w:w="100" w:type="dxa"/>
+            </w:tcMar>
+            <w:tcBorders>
+              <w:top w:val="single" w:sz="4" w:space="0" w:color="888888"/>
+              <w:bottom w:val="single" w:sz="4" w:space="0" w:color="888888"/>
+              <w:left w:val="single" w:sz="4" w:space="0" w:color="888888"/>
+              <w:right w:val="single" w:sz="4" w:space="0" w:color="888888"/>
+            </w:tcBorders>
+            <w:shd w:fill="F0F4F8"/>
           </w:tcPr>
           <w:p>
             <w:pPr>
@@ -106,7 +142,7 @@
               <w:rPr>
                 <w:rFonts w:ascii="Times New Roman" w:hAnsi="Times New Roman"/>
                 <w:b/>
-                <w:sz w:val="20"/>
+                <w:sz w:val="19"/>
               </w:rPr>
               <w:t>Roll Number</w:t>
             </w:r>
@@ -114,7 +150,19 @@
         </w:tc>
         <w:tc>
           <w:tcPr>
-            <w:tcW w:w="3713" w:type="dxa"/>
+            <w:tcW w:type="dxa" w:w="4464"/>
+            <w:tcMar>
+              <w:top w:w="80" w:type="dxa"/>
+              <w:bottom w:w="80" w:type="dxa"/>
+              <w:left w:w="100" w:type="dxa"/>
+              <w:right w:w="100" w:type="dxa"/>
+            </w:tcMar>
+            <w:tcBorders>
+              <w:top w:val="single" w:sz="4" w:space="0" w:color="888888"/>
+              <w:bottom w:val="single" w:sz="4" w:space="0" w:color="888888"/>
+              <w:left w:val="single" w:sz="4" w:space="0" w:color="888888"/>
+              <w:right w:val="single" w:sz="4" w:space="0" w:color="888888"/>
+            </w:tcBorders>
           </w:tcPr>
           <w:p>
             <w:pPr>
@@ -123,7 +171,8 @@
             <w:r>
               <w:rPr>
                 <w:rFonts w:ascii="Times New Roman" w:hAnsi="Times New Roman"/>
-                <w:sz w:val="20"/>
+                <w:b w:val="0"/>
+                <w:sz w:val="19"/>
               </w:rPr>
               <w:t>2301531530023</w:t>
             </w:r>
@@ -131,12 +180,22 @@
         </w:tc>
       </w:tr>
       <w:tr>
-        <w:trPr>
-          <w:jc w:val="center"/>
-        </w:trPr>
         <w:tc>
           <w:tcPr>
-            <w:tcW w:w="3713" w:type="dxa"/>
+            <w:tcW w:type="dxa" w:w="2592"/>
+            <w:tcMar>
+              <w:top w:w="80" w:type="dxa"/>
+              <w:bottom w:w="80" w:type="dxa"/>
+              <w:left w:w="100" w:type="dxa"/>
+              <w:right w:w="100" w:type="dxa"/>
+            </w:tcMar>
+            <w:tcBorders>
+              <w:top w:val="single" w:sz="4" w:space="0" w:color="888888"/>
+              <w:bottom w:val="single" w:sz="4" w:space="0" w:color="888888"/>
+              <w:left w:val="single" w:sz="4" w:space="0" w:color="888888"/>
+              <w:right w:val="single" w:sz="4" w:space="0" w:color="888888"/>
+            </w:tcBorders>
+            <w:shd w:fill="F0F4F8"/>
           </w:tcPr>
           <w:p>
             <w:pPr>
@@ -146,7 +205,7 @@
               <w:rPr>
                 <w:rFonts w:ascii="Times New Roman" w:hAnsi="Times New Roman"/>
                 <w:b/>
-                <w:sz w:val="20"/>
+                <w:sz w:val="19"/>
               </w:rPr>
               <w:t>Branch / Semester</w:t>
             </w:r>
@@ -154,7 +213,19 @@
         </w:tc>
         <w:tc>
           <w:tcPr>
-            <w:tcW w:w="3713" w:type="dxa"/>
+            <w:tcW w:type="dxa" w:w="5184"/>
+            <w:tcMar>
+              <w:top w:w="80" w:type="dxa"/>
+              <w:bottom w:w="80" w:type="dxa"/>
+              <w:left w:w="100" w:type="dxa"/>
+              <w:right w:w="100" w:type="dxa"/>
+            </w:tcMar>
+            <w:tcBorders>
+              <w:top w:val="single" w:sz="4" w:space="0" w:color="888888"/>
+              <w:bottom w:val="single" w:sz="4" w:space="0" w:color="888888"/>
+              <w:left w:val="single" w:sz="4" w:space="0" w:color="888888"/>
+              <w:right w:val="single" w:sz="4" w:space="0" w:color="888888"/>
+            </w:tcBorders>
           </w:tcPr>
           <w:p>
             <w:pPr>
@@ -163,7 +234,8 @@
             <w:r>
               <w:rPr>
                 <w:rFonts w:ascii="Times New Roman" w:hAnsi="Times New Roman"/>
-                <w:sz w:val="20"/>
+                <w:b w:val="0"/>
+                <w:sz w:val="19"/>
               </w:rPr>
               <w:t>B.Tech CSE (AIML) - Sem VII</w:t>
             </w:r>
@@ -171,7 +243,20 @@
         </w:tc>
         <w:tc>
           <w:tcPr>
-            <w:tcW w:w="3713" w:type="dxa"/>
+            <w:tcW w:type="dxa" w:w="2592"/>
+            <w:tcMar>
+              <w:top w:w="80" w:type="dxa"/>
+              <w:bottom w:w="80" w:type="dxa"/>
+              <w:left w:w="100" w:type="dxa"/>
+              <w:right w:w="100" w:type="dxa"/>
+            </w:tcMar>
+            <w:tcBorders>
+              <w:top w:val="single" w:sz="4" w:space="0" w:color="888888"/>
+              <w:bottom w:val="single" w:sz="4" w:space="0" w:color="888888"/>
+              <w:left w:val="single" w:sz="4" w:space="0" w:color="888888"/>
+              <w:right w:val="single" w:sz="4" w:space="0" w:color="888888"/>
+            </w:tcBorders>
+            <w:shd w:fill="F0F4F8"/>
           </w:tcPr>
           <w:p>
             <w:pPr>
@@ -181,7 +266,7 @@
               <w:rPr>
                 <w:rFonts w:ascii="Times New Roman" w:hAnsi="Times New Roman"/>
                 <w:b/>
-                <w:sz w:val="20"/>
+                <w:sz w:val="19"/>
               </w:rPr>
               <w:t>Section</w:t>
             </w:r>
@@ -189,7 +274,19 @@
         </w:tc>
         <w:tc>
           <w:tcPr>
-            <w:tcW w:w="3713" w:type="dxa"/>
+            <w:tcW w:type="dxa" w:w="4464"/>
+            <w:tcMar>
+              <w:top w:w="80" w:type="dxa"/>
+              <w:bottom w:w="80" w:type="dxa"/>
+              <w:left w:w="100" w:type="dxa"/>
+              <w:right w:w="100" w:type="dxa"/>
+            </w:tcMar>
+            <w:tcBorders>
+              <w:top w:val="single" w:sz="4" w:space="0" w:color="888888"/>
+              <w:bottom w:val="single" w:sz="4" w:space="0" w:color="888888"/>
+              <w:left w:val="single" w:sz="4" w:space="0" w:color="888888"/>
+              <w:right w:val="single" w:sz="4" w:space="0" w:color="888888"/>
+            </w:tcBorders>
           </w:tcPr>
           <w:p>
             <w:pPr>
@@ -198,7 +295,8 @@
             <w:r>
               <w:rPr>
                 <w:rFonts w:ascii="Times New Roman" w:hAnsi="Times New Roman"/>
-                <w:sz w:val="20"/>
+                <w:b w:val="0"/>
+                <w:sz w:val="19"/>
               </w:rPr>
               <w:t>A</w:t>
             </w:r>
@@ -206,12 +304,22 @@
         </w:tc>
       </w:tr>
       <w:tr>
-        <w:trPr>
-          <w:jc w:val="center"/>
-        </w:trPr>
         <w:tc>
           <w:tcPr>
-            <w:tcW w:w="3713" w:type="dxa"/>
+            <w:tcW w:type="dxa" w:w="2592"/>
+            <w:tcMar>
+              <w:top w:w="80" w:type="dxa"/>
+              <w:bottom w:w="80" w:type="dxa"/>
+              <w:left w:w="100" w:type="dxa"/>
+              <w:right w:w="100" w:type="dxa"/>
+            </w:tcMar>
+            <w:tcBorders>
+              <w:top w:val="single" w:sz="4" w:space="0" w:color="888888"/>
+              <w:bottom w:val="single" w:sz="4" w:space="0" w:color="888888"/>
+              <w:left w:val="single" w:sz="4" w:space="0" w:color="888888"/>
+              <w:right w:val="single" w:sz="4" w:space="0" w:color="888888"/>
+            </w:tcBorders>
+            <w:shd w:fill="F0F4F8"/>
           </w:tcPr>
           <w:p>
             <w:pPr>
@@ -221,7 +329,7 @@
               <w:rPr>
                 <w:rFonts w:ascii="Times New Roman" w:hAnsi="Times New Roman"/>
                 <w:b/>
-                <w:sz w:val="20"/>
+                <w:sz w:val="19"/>
               </w:rPr>
               <w:t>Project Guide</w:t>
             </w:r>
@@ -229,7 +337,19 @@
         </w:tc>
         <w:tc>
           <w:tcPr>
-            <w:tcW w:w="3713" w:type="dxa"/>
+            <w:tcW w:type="dxa" w:w="5184"/>
+            <w:tcMar>
+              <w:top w:w="80" w:type="dxa"/>
+              <w:bottom w:w="80" w:type="dxa"/>
+              <w:left w:w="100" w:type="dxa"/>
+              <w:right w:w="100" w:type="dxa"/>
+            </w:tcMar>
+            <w:tcBorders>
+              <w:top w:val="single" w:sz="4" w:space="0" w:color="888888"/>
+              <w:bottom w:val="single" w:sz="4" w:space="0" w:color="888888"/>
+              <w:left w:val="single" w:sz="4" w:space="0" w:color="888888"/>
+              <w:right w:val="single" w:sz="4" w:space="0" w:color="888888"/>
+            </w:tcBorders>
           </w:tcPr>
           <w:p>
             <w:pPr>
@@ -238,7 +358,8 @@
             <w:r>
               <w:rPr>
                 <w:rFonts w:ascii="Times New Roman" w:hAnsi="Times New Roman"/>
-                <w:sz w:val="20"/>
+                <w:b w:val="0"/>
+                <w:sz w:val="19"/>
               </w:rPr>
               <w:t>Dr. Devendra Gautam</w:t>
             </w:r>
@@ -246,7 +367,20 @@
         </w:tc>
         <w:tc>
           <w:tcPr>
-            <w:tcW w:w="3713" w:type="dxa"/>
+            <w:tcW w:type="dxa" w:w="2592"/>
+            <w:tcMar>
+              <w:top w:w="80" w:type="dxa"/>
+              <w:bottom w:w="80" w:type="dxa"/>
+              <w:left w:w="100" w:type="dxa"/>
+              <w:right w:w="100" w:type="dxa"/>
+            </w:tcMar>
+            <w:tcBorders>
+              <w:top w:val="single" w:sz="4" w:space="0" w:color="888888"/>
+              <w:bottom w:val="single" w:sz="4" w:space="0" w:color="888888"/>
+              <w:left w:val="single" w:sz="4" w:space="0" w:color="888888"/>
+              <w:right w:val="single" w:sz="4" w:space="0" w:color="888888"/>
+            </w:tcBorders>
+            <w:shd w:fill="F0F4F8"/>
           </w:tcPr>
           <w:p>
             <w:pPr>
@@ -256,7 +390,7 @@
               <w:rPr>
                 <w:rFonts w:ascii="Times New Roman" w:hAnsi="Times New Roman"/>
                 <w:b/>
-                <w:sz w:val="20"/>
+                <w:sz w:val="19"/>
               </w:rPr>
               <w:t>Designation</w:t>
             </w:r>
@@ -264,7 +398,19 @@
         </w:tc>
         <w:tc>
           <w:tcPr>
-            <w:tcW w:w="3713" w:type="dxa"/>
+            <w:tcW w:type="dxa" w:w="4464"/>
+            <w:tcMar>
+              <w:top w:w="80" w:type="dxa"/>
+              <w:bottom w:w="80" w:type="dxa"/>
+              <w:left w:w="100" w:type="dxa"/>
+              <w:right w:w="100" w:type="dxa"/>
+            </w:tcMar>
+            <w:tcBorders>
+              <w:top w:val="single" w:sz="4" w:space="0" w:color="888888"/>
+              <w:bottom w:val="single" w:sz="4" w:space="0" w:color="888888"/>
+              <w:left w:val="single" w:sz="4" w:space="0" w:color="888888"/>
+              <w:right w:val="single" w:sz="4" w:space="0" w:color="888888"/>
+            </w:tcBorders>
           </w:tcPr>
           <w:p>
             <w:pPr>
@@ -273,7 +419,8 @@
             <w:r>
               <w:rPr>
                 <w:rFonts w:ascii="Times New Roman" w:hAnsi="Times New Roman"/>
-                <w:sz w:val="20"/>
+                <w:b w:val="0"/>
+                <w:sz w:val="19"/>
               </w:rPr>
               <w:t>Associate Professor, Dept. of CSE</w:t>
             </w:r>
@@ -281,12 +428,22 @@
         </w:tc>
       </w:tr>
       <w:tr>
-        <w:trPr>
-          <w:jc w:val="center"/>
-        </w:trPr>
         <w:tc>
           <w:tcPr>
-            <w:tcW w:w="3713" w:type="dxa"/>
+            <w:tcW w:type="dxa" w:w="2592"/>
+            <w:tcMar>
+              <w:top w:w="80" w:type="dxa"/>
+              <w:bottom w:w="80" w:type="dxa"/>
+              <w:left w:w="100" w:type="dxa"/>
+              <w:right w:w="100" w:type="dxa"/>
+            </w:tcMar>
+            <w:tcBorders>
+              <w:top w:val="single" w:sz="4" w:space="0" w:color="888888"/>
+              <w:bottom w:val="single" w:sz="4" w:space="0" w:color="888888"/>
+              <w:left w:val="single" w:sz="4" w:space="0" w:color="888888"/>
+              <w:right w:val="single" w:sz="4" w:space="0" w:color="888888"/>
+            </w:tcBorders>
+            <w:shd w:fill="F0F4F8"/>
           </w:tcPr>
           <w:p>
             <w:pPr>
@@ -296,7 +453,7 @@
               <w:rPr>
                 <w:rFonts w:ascii="Times New Roman" w:hAnsi="Times New Roman"/>
                 <w:b/>
-                <w:sz w:val="20"/>
+                <w:sz w:val="19"/>
               </w:rPr>
               <w:t>Project Title</w:t>
             </w:r>
@@ -304,7 +461,19 @@
         </w:tc>
         <w:tc>
           <w:tcPr>
-            <w:tcW w:w="3713" w:type="dxa"/>
+            <w:tcW w:type="dxa" w:w="5184"/>
+            <w:tcMar>
+              <w:top w:w="80" w:type="dxa"/>
+              <w:bottom w:w="80" w:type="dxa"/>
+              <w:left w:w="100" w:type="dxa"/>
+              <w:right w:w="100" w:type="dxa"/>
+            </w:tcMar>
+            <w:tcBorders>
+              <w:top w:val="single" w:sz="4" w:space="0" w:color="888888"/>
+              <w:bottom w:val="single" w:sz="4" w:space="0" w:color="888888"/>
+              <w:left w:val="single" w:sz="4" w:space="0" w:color="888888"/>
+              <w:right w:val="single" w:sz="4" w:space="0" w:color="888888"/>
+            </w:tcBorders>
           </w:tcPr>
           <w:p>
             <w:pPr>
@@ -313,7 +482,8 @@
             <w:r>
               <w:rPr>
                 <w:rFonts w:ascii="Times New Roman" w:hAnsi="Times New Roman"/>
-                <w:sz w:val="20"/>
+                <w:b w:val="0"/>
+                <w:sz w:val="19"/>
               </w:rPr>
               <w:t>Dual-Stream Spatial and Frequency-Domain Deepfake Video Detection</w:t>
             </w:r>
@@ -321,32 +491,80 @@
         </w:tc>
         <w:tc>
           <w:tcPr>
-            <w:tcW w:w="3713" w:type="dxa"/>
+            <w:tcW w:type="dxa" w:w="2592"/>
+            <w:tcMar>
+              <w:top w:w="80" w:type="dxa"/>
+              <w:bottom w:w="80" w:type="dxa"/>
+              <w:left w:w="100" w:type="dxa"/>
+              <w:right w:w="100" w:type="dxa"/>
+            </w:tcMar>
+            <w:tcBorders>
+              <w:top w:val="single" w:sz="4" w:space="0" w:color="888888"/>
+              <w:bottom w:val="single" w:sz="4" w:space="0" w:color="888888"/>
+              <w:left w:val="single" w:sz="4" w:space="0" w:color="888888"/>
+              <w:right w:val="single" w:sz="4" w:space="0" w:color="888888"/>
+            </w:tcBorders>
           </w:tcPr>
           <w:p>
             <w:pPr>
               <w:spacing w:before="40" w:after="40"/>
             </w:pPr>
+            <w:r>
+              <w:rPr>
+                <w:rFonts w:ascii="Times New Roman" w:hAnsi="Times New Roman"/>
+                <w:b w:val="0"/>
+                <w:sz w:val="19"/>
+              </w:rPr>
+            </w:r>
           </w:p>
         </w:tc>
         <w:tc>
           <w:tcPr>
-            <w:tcW w:w="3713" w:type="dxa"/>
+            <w:tcW w:type="dxa" w:w="4464"/>
+            <w:tcMar>
+              <w:top w:w="80" w:type="dxa"/>
+              <w:bottom w:w="80" w:type="dxa"/>
+              <w:left w:w="100" w:type="dxa"/>
+              <w:right w:w="100" w:type="dxa"/>
+            </w:tcMar>
+            <w:tcBorders>
+              <w:top w:val="single" w:sz="4" w:space="0" w:color="888888"/>
+              <w:bottom w:val="single" w:sz="4" w:space="0" w:color="888888"/>
+              <w:left w:val="single" w:sz="4" w:space="0" w:color="888888"/>
+              <w:right w:val="single" w:sz="4" w:space="0" w:color="888888"/>
+            </w:tcBorders>
           </w:tcPr>
           <w:p>
             <w:pPr>
               <w:spacing w:before="40" w:after="40"/>
             </w:pPr>
+            <w:r>
+              <w:rPr>
+                <w:rFonts w:ascii="Times New Roman" w:hAnsi="Times New Roman"/>
+                <w:b w:val="0"/>
+                <w:sz w:val="19"/>
+              </w:rPr>
+            </w:r>
           </w:p>
         </w:tc>
       </w:tr>
       <w:tr>
-        <w:trPr>
-          <w:jc w:val="center"/>
-        </w:trPr>
         <w:tc>
           <w:tcPr>
-            <w:tcW w:w="3713" w:type="dxa"/>
+            <w:tcW w:type="dxa" w:w="2592"/>
+            <w:tcMar>
+              <w:top w:w="80" w:type="dxa"/>
+              <w:bottom w:w="80" w:type="dxa"/>
+              <w:left w:w="100" w:type="dxa"/>
+              <w:right w:w="100" w:type="dxa"/>
+            </w:tcMar>
+            <w:tcBorders>
+              <w:top w:val="single" w:sz="4" w:space="0" w:color="888888"/>
+              <w:bottom w:val="single" w:sz="4" w:space="0" w:color="888888"/>
+              <w:left w:val="single" w:sz="4" w:space="0" w:color="888888"/>
+              <w:right w:val="single" w:sz="4" w:space="0" w:color="888888"/>
+            </w:tcBorders>
+            <w:shd w:fill="F0F4F8"/>
           </w:tcPr>
           <w:p>
             <w:pPr>
@@ -356,7 +574,7 @@
               <w:rPr>
                 <w:rFonts w:ascii="Times New Roman" w:hAnsi="Times New Roman"/>
                 <w:b/>
-                <w:sz w:val="20"/>
+                <w:sz w:val="19"/>
               </w:rPr>
               <w:t>GitHub</w:t>
             </w:r>
@@ -364,7 +582,19 @@
         </w:tc>
         <w:tc>
           <w:tcPr>
-            <w:tcW w:w="3713" w:type="dxa"/>
+            <w:tcW w:type="dxa" w:w="5184"/>
+            <w:tcMar>
+              <w:top w:w="80" w:type="dxa"/>
+              <w:bottom w:w="80" w:type="dxa"/>
+              <w:left w:w="100" w:type="dxa"/>
+              <w:right w:w="100" w:type="dxa"/>
+            </w:tcMar>
+            <w:tcBorders>
+              <w:top w:val="single" w:sz="4" w:space="0" w:color="888888"/>
+              <w:bottom w:val="single" w:sz="4" w:space="0" w:color="888888"/>
+              <w:left w:val="single" w:sz="4" w:space="0" w:color="888888"/>
+              <w:right w:val="single" w:sz="4" w:space="0" w:color="888888"/>
+            </w:tcBorders>
           </w:tcPr>
           <w:p>
             <w:pPr>
@@ -373,7 +603,8 @@
             <w:r>
               <w:rPr>
                 <w:rFonts w:ascii="Times New Roman" w:hAnsi="Times New Roman"/>
-                <w:sz w:val="20"/>
+                <w:b w:val="0"/>
+                <w:sz w:val="19"/>
               </w:rPr>
               <w:t>github.com/DevRanaKaila/DeepGuard-AI</w:t>
             </w:r>
@@ -381,7 +612,20 @@
         </w:tc>
         <w:tc>
           <w:tcPr>
-            <w:tcW w:w="3713" w:type="dxa"/>
+            <w:tcW w:type="dxa" w:w="2592"/>
+            <w:tcMar>
+              <w:top w:w="80" w:type="dxa"/>
+              <w:bottom w:w="80" w:type="dxa"/>
+              <w:left w:w="100" w:type="dxa"/>
+              <w:right w:w="100" w:type="dxa"/>
+            </w:tcMar>
+            <w:tcBorders>
+              <w:top w:val="single" w:sz="4" w:space="0" w:color="888888"/>
+              <w:bottom w:val="single" w:sz="4" w:space="0" w:color="888888"/>
+              <w:left w:val="single" w:sz="4" w:space="0" w:color="888888"/>
+              <w:right w:val="single" w:sz="4" w:space="0" w:color="888888"/>
+            </w:tcBorders>
+            <w:shd w:fill="F0F4F8"/>
           </w:tcPr>
           <w:p>
             <w:pPr>
@@ -391,7 +635,7 @@
               <w:rPr>
                 <w:rFonts w:ascii="Times New Roman" w:hAnsi="Times New Roman"/>
                 <w:b/>
-                <w:sz w:val="20"/>
+                <w:sz w:val="19"/>
               </w:rPr>
               <w:t>College</w:t>
             </w:r>
@@ -399,7 +643,19 @@
         </w:tc>
         <w:tc>
           <w:tcPr>
-            <w:tcW w:w="3713" w:type="dxa"/>
+            <w:tcW w:type="dxa" w:w="4464"/>
+            <w:tcMar>
+              <w:top w:w="80" w:type="dxa"/>
+              <w:bottom w:w="80" w:type="dxa"/>
+              <w:left w:w="100" w:type="dxa"/>
+              <w:right w:w="100" w:type="dxa"/>
+            </w:tcMar>
+            <w:tcBorders>
+              <w:top w:val="single" w:sz="4" w:space="0" w:color="888888"/>
+              <w:bottom w:val="single" w:sz="4" w:space="0" w:color="888888"/>
+              <w:left w:val="single" w:sz="4" w:space="0" w:color="888888"/>
+              <w:right w:val="single" w:sz="4" w:space="0" w:color="888888"/>
+            </w:tcBorders>
           </w:tcPr>
           <w:p>
             <w:pPr>
@@ -408,7 +664,8 @@
             <w:r>
               <w:rPr>
                 <w:rFonts w:ascii="Times New Roman" w:hAnsi="Times New Roman"/>
-                <w:sz w:val="20"/>
+                <w:b w:val="0"/>
+                <w:sz w:val="19"/>
               </w:rPr>
               <w:t>LIET, Greater Noida</w:t>
             </w:r>
@@ -416,55 +673,1852 @@
         </w:tc>
       </w:tr>
     </w:tbl>
-    <w:p/>
     <w:p>
       <w:pPr>
-        <w:spacing w:before="80" w:after="160"/>
+        <w:spacing w:before="160" w:after="80"/>
         <w:jc w:val="center"/>
       </w:pPr>
       <w:r>
         <w:rPr>
           <w:rFonts w:ascii="Times New Roman" w:hAnsi="Times New Roman"/>
           <w:b/>
-          <w:sz w:val="24"/>
+          <w:sz w:val="22"/>
         </w:rPr>
-        <w:t xml:space="preserve">Weekly </w:t>
-      </w:r>
-      <w:r>
-        <w:rPr>
-          <w:rFonts w:ascii="Times New Roman" w:hAnsi="Times New Roman"/>
-          <w:b/>
-          <w:sz w:val="24"/>
-        </w:rPr>
-        <w:t>Activity Log (Guide Signatures Required)</w:t>
+        <w:t>Weekly Activity Log (Guide Signatures Required)</w:t>
       </w:r>
     </w:p>
     <w:tbl>
       <w:tblPr>
-        <w:tblStyle w:val="TableGrid"/>
-        <w:tblW w:w="0" w:type="auto"/>
+        <w:tblW w:type="auto" w:w="0"/>
         <w:jc w:val="center"/>
-        <w:tblLook w:val="04A0"/>
+        <w:tblLook w:firstColumn="1" w:firstRow="1" w:lastColumn="0" w:lastRow="0" w:noHBand="0" w:noVBand="1" w:val="04A0"/>
       </w:tblPr>
       <w:tblGrid>
-        <w:gridCol w:w="1020"/>
-        <w:gridCol w:w="1814"/>
-        <w:gridCol w:w="1984"/>
-        <w:gridCol w:w="5953"/>
-        <w:gridCol w:w="1247"/>
-        <w:gridCol w:w="2476"/>
+        <w:gridCol w:w="2993"/>
+        <w:gridCol w:w="2993"/>
+        <w:gridCol w:w="2993"/>
+        <w:gridCol w:w="2993"/>
+        <w:gridCol w:w="2993"/>
       </w:tblGrid>
       <w:tr>
-        <w:trPr>
-          <w:jc w:val="center"/>
-        </w:trPr>
         <w:tc>
           <w:tcPr>
-            <w:tcW w:w="1020" w:type="dxa"/>
+            <w:tcW w:type="dxa" w:w="2664"/>
+            <w:tcMar>
+              <w:top w:w="80" w:type="dxa"/>
+              <w:bottom w:w="80" w:type="dxa"/>
+              <w:left w:w="100" w:type="dxa"/>
+              <w:right w:w="100" w:type="dxa"/>
+            </w:tcMar>
+            <w:tcBorders>
+              <w:top w:val="single" w:sz="4" w:space="0" w:color="888888"/>
+              <w:bottom w:val="single" w:sz="4" w:space="0" w:color="888888"/>
+              <w:left w:val="single" w:sz="4" w:space="0" w:color="888888"/>
+              <w:right w:val="single" w:sz="4" w:space="0" w:color="888888"/>
+            </w:tcBorders>
+            <w:shd w:fill="E2E8F0"/>
           </w:tcPr>
           <w:p>
             <w:pPr>
+              <w:spacing w:before="60" w:after="60" w:line="252" w:lineRule="auto"/>
               <w:jc w:val="center"/>
+            </w:pPr>
+            <w:r>
+              <w:rPr>
+                <w:rFonts w:ascii="Times New Roman" w:hAnsi="Times New Roman"/>
+                <w:b/>
+                <w:sz w:val="19"/>
+              </w:rPr>
+              <w:t>Date Range</w:t>
+            </w:r>
+          </w:p>
+        </w:tc>
+        <w:tc>
+          <w:tcPr>
+            <w:tcW w:type="dxa" w:w="2160"/>
+            <w:tcMar>
+              <w:top w:w="80" w:type="dxa"/>
+              <w:bottom w:w="80" w:type="dxa"/>
+              <w:left w:w="100" w:type="dxa"/>
+              <w:right w:w="100" w:type="dxa"/>
+            </w:tcMar>
+            <w:tcBorders>
+              <w:top w:val="single" w:sz="4" w:space="0" w:color="888888"/>
+              <w:bottom w:val="single" w:sz="4" w:space="0" w:color="888888"/>
+              <w:left w:val="single" w:sz="4" w:space="0" w:color="888888"/>
+              <w:right w:val="single" w:sz="4" w:space="0" w:color="888888"/>
+            </w:tcBorders>
+            <w:shd w:fill="E2E8F0"/>
+          </w:tcPr>
+          <w:p>
+            <w:pPr>
+              <w:spacing w:before="60" w:after="60" w:line="252" w:lineRule="auto"/>
+              <w:jc w:val="center"/>
+            </w:pPr>
+            <w:r>
+              <w:rPr>
+                <w:rFonts w:ascii="Times New Roman" w:hAnsi="Times New Roman"/>
+                <w:b/>
+                <w:sz w:val="19"/>
+              </w:rPr>
+              <w:t>Phase / Milestone</w:t>
+            </w:r>
+          </w:p>
+        </w:tc>
+        <w:tc>
+          <w:tcPr>
+            <w:tcW w:type="dxa" w:w="7128"/>
+            <w:tcMar>
+              <w:top w:w="80" w:type="dxa"/>
+              <w:bottom w:w="80" w:type="dxa"/>
+              <w:left w:w="100" w:type="dxa"/>
+              <w:right w:w="100" w:type="dxa"/>
+            </w:tcMar>
+            <w:tcBorders>
+              <w:top w:val="single" w:sz="4" w:space="0" w:color="888888"/>
+              <w:bottom w:val="single" w:sz="4" w:space="0" w:color="888888"/>
+              <w:left w:val="single" w:sz="4" w:space="0" w:color="888888"/>
+              <w:right w:val="single" w:sz="4" w:space="0" w:color="888888"/>
+            </w:tcBorders>
+            <w:shd w:fill="E2E8F0"/>
+          </w:tcPr>
+          <w:p>
+            <w:pPr>
+              <w:spacing w:before="60" w:after="60" w:line="252" w:lineRule="auto"/>
+              <w:jc w:val="center"/>
+            </w:pPr>
+            <w:r>
+              <w:rPr>
+                <w:rFonts w:ascii="Times New Roman" w:hAnsi="Times New Roman"/>
+                <w:b/>
+                <w:sz w:val="19"/>
+              </w:rPr>
+              <w:t>Activities &amp; Deliverables</w:t>
+            </w:r>
+          </w:p>
+        </w:tc>
+        <w:tc>
+          <w:tcPr>
+            <w:tcW w:type="dxa" w:w="1296"/>
+            <w:tcMar>
+              <w:top w:w="80" w:type="dxa"/>
+              <w:bottom w:w="80" w:type="dxa"/>
+              <w:left w:w="100" w:type="dxa"/>
+              <w:right w:w="100" w:type="dxa"/>
+            </w:tcMar>
+            <w:tcBorders>
+              <w:top w:val="single" w:sz="4" w:space="0" w:color="888888"/>
+              <w:bottom w:val="single" w:sz="4" w:space="0" w:color="888888"/>
+              <w:left w:val="single" w:sz="4" w:space="0" w:color="888888"/>
+              <w:right w:val="single" w:sz="4" w:space="0" w:color="888888"/>
+            </w:tcBorders>
+            <w:shd w:fill="E2E8F0"/>
+          </w:tcPr>
+          <w:p>
+            <w:pPr>
+              <w:spacing w:before="60" w:after="60" w:line="252" w:lineRule="auto"/>
+              <w:jc w:val="center"/>
+            </w:pPr>
+            <w:r>
+              <w:rPr>
+                <w:rFonts w:ascii="Times New Roman" w:hAnsi="Times New Roman"/>
+                <w:b/>
+                <w:sz w:val="19"/>
+              </w:rPr>
+              <w:t>Status</w:t>
+            </w:r>
+          </w:p>
+        </w:tc>
+        <w:tc>
+          <w:tcPr>
+            <w:tcW w:type="dxa" w:w="1584"/>
+            <w:tcMar>
+              <w:top w:w="80" w:type="dxa"/>
+              <w:bottom w:w="80" w:type="dxa"/>
+              <w:left w:w="100" w:type="dxa"/>
+              <w:right w:w="100" w:type="dxa"/>
+            </w:tcMar>
+            <w:tcBorders>
+              <w:top w:val="single" w:sz="4" w:space="0" w:color="888888"/>
+              <w:bottom w:val="single" w:sz="4" w:space="0" w:color="888888"/>
+              <w:left w:val="single" w:sz="4" w:space="0" w:color="888888"/>
+              <w:right w:val="single" w:sz="4" w:space="0" w:color="888888"/>
+            </w:tcBorders>
+            <w:shd w:fill="E2E8F0"/>
+          </w:tcPr>
+          <w:p>
+            <w:pPr>
+              <w:spacing w:before="60" w:after="60" w:line="252" w:lineRule="auto"/>
+              <w:jc w:val="center"/>
+            </w:pPr>
+            <w:r>
+              <w:rPr>
+                <w:rFonts w:ascii="Times New Roman" w:hAnsi="Times New Roman"/>
+                <w:b/>
+                <w:sz w:val="19"/>
+              </w:rPr>
+              <w:t>Guide Signature</w:t>
+            </w:r>
+          </w:p>
+        </w:tc>
+      </w:tr>
+      <w:tr>
+        <w:tc>
+          <w:tcPr>
+            <w:tcW w:type="dxa" w:w="2664"/>
+            <w:tcMar>
+              <w:top w:w="80" w:type="dxa"/>
+              <w:bottom w:w="80" w:type="dxa"/>
+              <w:left w:w="100" w:type="dxa"/>
+              <w:right w:w="100" w:type="dxa"/>
+            </w:tcMar>
+            <w:tcBorders>
+              <w:top w:val="single" w:sz="4" w:space="0" w:color="888888"/>
+              <w:bottom w:val="single" w:sz="4" w:space="0" w:color="888888"/>
+              <w:left w:val="single" w:sz="4" w:space="0" w:color="888888"/>
+              <w:right w:val="single" w:sz="4" w:space="0" w:color="888888"/>
+            </w:tcBorders>
+          </w:tcPr>
+          <w:p>
+            <w:pPr>
+              <w:spacing w:before="60" w:after="60" w:line="252" w:lineRule="auto"/>
+              <w:jc w:val="center"/>
+            </w:pPr>
+            <w:r>
+              <w:rPr>
+                <w:rFonts w:ascii="Times New Roman" w:hAnsi="Times New Roman"/>
+                <w:b w:val="0"/>
+                <w:sz w:val="17"/>
+              </w:rPr>
+              <w:t>06/09/2026 – 12/09/2026</w:t>
+            </w:r>
+          </w:p>
+        </w:tc>
+        <w:tc>
+          <w:tcPr>
+            <w:tcW w:type="dxa" w:w="2160"/>
+            <w:tcMar>
+              <w:top w:w="80" w:type="dxa"/>
+              <w:bottom w:w="80" w:type="dxa"/>
+              <w:left w:w="100" w:type="dxa"/>
+              <w:right w:w="100" w:type="dxa"/>
+            </w:tcMar>
+            <w:tcBorders>
+              <w:top w:val="single" w:sz="4" w:space="0" w:color="888888"/>
+              <w:bottom w:val="single" w:sz="4" w:space="0" w:color="888888"/>
+              <w:left w:val="single" w:sz="4" w:space="0" w:color="888888"/>
+              <w:right w:val="single" w:sz="4" w:space="0" w:color="888888"/>
+            </w:tcBorders>
+          </w:tcPr>
+          <w:p>
+            <w:pPr>
+              <w:spacing w:before="60" w:after="60" w:line="252" w:lineRule="auto"/>
+              <w:jc w:val="left"/>
+            </w:pPr>
+            <w:r>
+              <w:rPr>
+                <w:rFonts w:ascii="Times New Roman" w:hAnsi="Times New Roman"/>
+                <w:b/>
+                <w:sz w:val="17"/>
+              </w:rPr>
+              <w:t>Topic Finalisation &amp; Literature Study</w:t>
+            </w:r>
+          </w:p>
+        </w:tc>
+        <w:tc>
+          <w:tcPr>
+            <w:tcW w:type="dxa" w:w="7128"/>
+            <w:tcMar>
+              <w:top w:w="80" w:type="dxa"/>
+              <w:bottom w:w="80" w:type="dxa"/>
+              <w:left w:w="100" w:type="dxa"/>
+              <w:right w:w="100" w:type="dxa"/>
+            </w:tcMar>
+            <w:tcBorders>
+              <w:top w:val="single" w:sz="4" w:space="0" w:color="888888"/>
+              <w:bottom w:val="single" w:sz="4" w:space="0" w:color="888888"/>
+              <w:left w:val="single" w:sz="4" w:space="0" w:color="888888"/>
+              <w:right w:val="single" w:sz="4" w:space="0" w:color="888888"/>
+            </w:tcBorders>
+          </w:tcPr>
+          <w:p>
+            <w:pPr>
+              <w:spacing w:before="60" w:after="60" w:line="252" w:lineRule="auto"/>
+              <w:jc w:val="left"/>
+            </w:pPr>
+            <w:r>
+              <w:rPr>
+                <w:rFonts w:ascii="Times New Roman" w:hAnsi="Times New Roman"/>
+                <w:b w:val="0"/>
+                <w:sz w:val="17"/>
+              </w:rPr>
+              <w:t>Finalised project topic on deepfake detection. Studied 8 research papers (Rossler, Frank, Qian, Afchar, Li, Tan, Selvaraju, Durall). Identified FaceForensics++ and Celeb-DF v2 as benchmark datasets. Set up Python environment: PyTorch 2.0+, timm, OpenCV, SciPy, Streamlit.</w:t>
+            </w:r>
+          </w:p>
+        </w:tc>
+        <w:tc>
+          <w:tcPr>
+            <w:tcW w:type="dxa" w:w="1296"/>
+            <w:tcMar>
+              <w:top w:w="80" w:type="dxa"/>
+              <w:bottom w:w="80" w:type="dxa"/>
+              <w:left w:w="100" w:type="dxa"/>
+              <w:right w:w="100" w:type="dxa"/>
+            </w:tcMar>
+            <w:tcBorders>
+              <w:top w:val="single" w:sz="4" w:space="0" w:color="888888"/>
+              <w:bottom w:val="single" w:sz="4" w:space="0" w:color="888888"/>
+              <w:left w:val="single" w:sz="4" w:space="0" w:color="888888"/>
+              <w:right w:val="single" w:sz="4" w:space="0" w:color="888888"/>
+            </w:tcBorders>
+          </w:tcPr>
+          <w:p>
+            <w:pPr>
+              <w:spacing w:before="60" w:after="60" w:line="252" w:lineRule="auto"/>
+              <w:jc w:val="center"/>
+            </w:pPr>
+            <w:r>
+              <w:rPr>
+                <w:rFonts w:ascii="Times New Roman" w:hAnsi="Times New Roman"/>
+                <w:b w:val="0"/>
+                <w:color w:val="008000"/>
+                <w:sz w:val="17"/>
+              </w:rPr>
+              <w:t>Completed</w:t>
+            </w:r>
+          </w:p>
+        </w:tc>
+        <w:tc>
+          <w:tcPr>
+            <w:tcW w:type="dxa" w:w="1584"/>
+            <w:tcMar>
+              <w:top w:w="80" w:type="dxa"/>
+              <w:bottom w:w="80" w:type="dxa"/>
+              <w:left w:w="100" w:type="dxa"/>
+              <w:right w:w="100" w:type="dxa"/>
+            </w:tcMar>
+            <w:tcBorders>
+              <w:top w:val="single" w:sz="4" w:space="0" w:color="888888"/>
+              <w:bottom w:val="single" w:sz="4" w:space="0" w:color="888888"/>
+              <w:left w:val="single" w:sz="4" w:space="0" w:color="888888"/>
+              <w:right w:val="single" w:sz="4" w:space="0" w:color="888888"/>
+            </w:tcBorders>
+          </w:tcPr>
+          <w:p>
+            <w:pPr>
+              <w:spacing w:before="60" w:after="60" w:line="252" w:lineRule="auto"/>
+              <w:jc w:val="center"/>
+            </w:pPr>
+            <w:r>
+              <w:rPr>
+                <w:rFonts w:ascii="Times New Roman" w:hAnsi="Times New Roman"/>
+                <w:b w:val="0"/>
+                <w:sz w:val="17"/>
+              </w:rPr>
+            </w:r>
+          </w:p>
+        </w:tc>
+      </w:tr>
+      <w:tr>
+        <w:tc>
+          <w:tcPr>
+            <w:tcW w:type="dxa" w:w="2664"/>
+            <w:tcMar>
+              <w:top w:w="80" w:type="dxa"/>
+              <w:bottom w:w="80" w:type="dxa"/>
+              <w:left w:w="100" w:type="dxa"/>
+              <w:right w:w="100" w:type="dxa"/>
+            </w:tcMar>
+            <w:tcBorders>
+              <w:top w:val="single" w:sz="4" w:space="0" w:color="888888"/>
+              <w:bottom w:val="single" w:sz="4" w:space="0" w:color="888888"/>
+              <w:left w:val="single" w:sz="4" w:space="0" w:color="888888"/>
+              <w:right w:val="single" w:sz="4" w:space="0" w:color="888888"/>
+            </w:tcBorders>
+          </w:tcPr>
+          <w:p>
+            <w:pPr>
+              <w:spacing w:before="60" w:after="60" w:line="252" w:lineRule="auto"/>
+              <w:jc w:val="center"/>
+            </w:pPr>
+            <w:r>
+              <w:rPr>
+                <w:rFonts w:ascii="Times New Roman" w:hAnsi="Times New Roman"/>
+                <w:b w:val="0"/>
+                <w:sz w:val="17"/>
+              </w:rPr>
+              <w:t>13/09/2026 – 19/09/2026</w:t>
+            </w:r>
+          </w:p>
+        </w:tc>
+        <w:tc>
+          <w:tcPr>
+            <w:tcW w:type="dxa" w:w="2160"/>
+            <w:tcMar>
+              <w:top w:w="80" w:type="dxa"/>
+              <w:bottom w:w="80" w:type="dxa"/>
+              <w:left w:w="100" w:type="dxa"/>
+              <w:right w:w="100" w:type="dxa"/>
+            </w:tcMar>
+            <w:tcBorders>
+              <w:top w:val="single" w:sz="4" w:space="0" w:color="888888"/>
+              <w:bottom w:val="single" w:sz="4" w:space="0" w:color="888888"/>
+              <w:left w:val="single" w:sz="4" w:space="0" w:color="888888"/>
+              <w:right w:val="single" w:sz="4" w:space="0" w:color="888888"/>
+            </w:tcBorders>
+          </w:tcPr>
+          <w:p>
+            <w:pPr>
+              <w:spacing w:before="60" w:after="60" w:line="252" w:lineRule="auto"/>
+              <w:jc w:val="left"/>
+            </w:pPr>
+            <w:r>
+              <w:rPr>
+                <w:rFonts w:ascii="Times New Roman" w:hAnsi="Times New Roman"/>
+                <w:b/>
+                <w:sz w:val="17"/>
+              </w:rPr>
+              <w:t>Synopsis Preparation</w:t>
+            </w:r>
+          </w:p>
+        </w:tc>
+        <w:tc>
+          <w:tcPr>
+            <w:tcW w:type="dxa" w:w="7128"/>
+            <w:tcMar>
+              <w:top w:w="80" w:type="dxa"/>
+              <w:bottom w:w="80" w:type="dxa"/>
+              <w:left w:w="100" w:type="dxa"/>
+              <w:right w:w="100" w:type="dxa"/>
+            </w:tcMar>
+            <w:tcBorders>
+              <w:top w:val="single" w:sz="4" w:space="0" w:color="888888"/>
+              <w:bottom w:val="single" w:sz="4" w:space="0" w:color="888888"/>
+              <w:left w:val="single" w:sz="4" w:space="0" w:color="888888"/>
+              <w:right w:val="single" w:sz="4" w:space="0" w:color="888888"/>
+            </w:tcBorders>
+          </w:tcPr>
+          <w:p>
+            <w:pPr>
+              <w:spacing w:before="60" w:after="60" w:line="252" w:lineRule="auto"/>
+              <w:jc w:val="left"/>
+            </w:pPr>
+            <w:r>
+              <w:rPr>
+                <w:rFonts w:ascii="Times New Roman" w:hAnsi="Times New Roman"/>
+                <w:b w:val="0"/>
+                <w:sz w:val="17"/>
+              </w:rPr>
+              <w:t>Prepared formal MINI PROJECT SYNOPSIS in LIET-prescribed format. Defined 6 project objectives. Drafted Literature Survey, Work Plan, Hardware/Software requirements. Submitted draft to Dr. Devendra Gautam for review.</w:t>
+            </w:r>
+          </w:p>
+        </w:tc>
+        <w:tc>
+          <w:tcPr>
+            <w:tcW w:type="dxa" w:w="1296"/>
+            <w:tcMar>
+              <w:top w:w="80" w:type="dxa"/>
+              <w:bottom w:w="80" w:type="dxa"/>
+              <w:left w:w="100" w:type="dxa"/>
+              <w:right w:w="100" w:type="dxa"/>
+            </w:tcMar>
+            <w:tcBorders>
+              <w:top w:val="single" w:sz="4" w:space="0" w:color="888888"/>
+              <w:bottom w:val="single" w:sz="4" w:space="0" w:color="888888"/>
+              <w:left w:val="single" w:sz="4" w:space="0" w:color="888888"/>
+              <w:right w:val="single" w:sz="4" w:space="0" w:color="888888"/>
+            </w:tcBorders>
+          </w:tcPr>
+          <w:p>
+            <w:pPr>
+              <w:spacing w:before="60" w:after="60" w:line="252" w:lineRule="auto"/>
+              <w:jc w:val="center"/>
+            </w:pPr>
+            <w:r>
+              <w:rPr>
+                <w:rFonts w:ascii="Times New Roman" w:hAnsi="Times New Roman"/>
+                <w:b w:val="0"/>
+                <w:color w:val="008000"/>
+                <w:sz w:val="17"/>
+              </w:rPr>
+              <w:t>Completed</w:t>
+            </w:r>
+          </w:p>
+        </w:tc>
+        <w:tc>
+          <w:tcPr>
+            <w:tcW w:type="dxa" w:w="1584"/>
+            <w:tcMar>
+              <w:top w:w="80" w:type="dxa"/>
+              <w:bottom w:w="80" w:type="dxa"/>
+              <w:left w:w="100" w:type="dxa"/>
+              <w:right w:w="100" w:type="dxa"/>
+            </w:tcMar>
+            <w:tcBorders>
+              <w:top w:val="single" w:sz="4" w:space="0" w:color="888888"/>
+              <w:bottom w:val="single" w:sz="4" w:space="0" w:color="888888"/>
+              <w:left w:val="single" w:sz="4" w:space="0" w:color="888888"/>
+              <w:right w:val="single" w:sz="4" w:space="0" w:color="888888"/>
+            </w:tcBorders>
+          </w:tcPr>
+          <w:p>
+            <w:pPr>
+              <w:spacing w:before="60" w:after="60" w:line="252" w:lineRule="auto"/>
+              <w:jc w:val="center"/>
+            </w:pPr>
+            <w:r>
+              <w:rPr>
+                <w:rFonts w:ascii="Times New Roman" w:hAnsi="Times New Roman"/>
+                <w:b w:val="0"/>
+                <w:sz w:val="17"/>
+              </w:rPr>
+            </w:r>
+          </w:p>
+        </w:tc>
+      </w:tr>
+      <w:tr>
+        <w:tc>
+          <w:tcPr>
+            <w:tcW w:type="dxa" w:w="2664"/>
+            <w:tcMar>
+              <w:top w:w="80" w:type="dxa"/>
+              <w:bottom w:w="80" w:type="dxa"/>
+              <w:left w:w="100" w:type="dxa"/>
+              <w:right w:w="100" w:type="dxa"/>
+            </w:tcMar>
+            <w:tcBorders>
+              <w:top w:val="single" w:sz="4" w:space="0" w:color="888888"/>
+              <w:bottom w:val="single" w:sz="4" w:space="0" w:color="888888"/>
+              <w:left w:val="single" w:sz="4" w:space="0" w:color="888888"/>
+              <w:right w:val="single" w:sz="4" w:space="0" w:color="888888"/>
+            </w:tcBorders>
+          </w:tcPr>
+          <w:p>
+            <w:pPr>
+              <w:spacing w:before="60" w:after="60" w:line="252" w:lineRule="auto"/>
+              <w:jc w:val="center"/>
+            </w:pPr>
+            <w:r>
+              <w:rPr>
+                <w:rFonts w:ascii="Times New Roman" w:hAnsi="Times New Roman"/>
+                <w:b w:val="0"/>
+                <w:sz w:val="17"/>
+              </w:rPr>
+              <w:t>20/09/2026 – 26/09/2026</w:t>
+            </w:r>
+          </w:p>
+        </w:tc>
+        <w:tc>
+          <w:tcPr>
+            <w:tcW w:type="dxa" w:w="2160"/>
+            <w:tcMar>
+              <w:top w:w="80" w:type="dxa"/>
+              <w:bottom w:w="80" w:type="dxa"/>
+              <w:left w:w="100" w:type="dxa"/>
+              <w:right w:w="100" w:type="dxa"/>
+            </w:tcMar>
+            <w:tcBorders>
+              <w:top w:val="single" w:sz="4" w:space="0" w:color="888888"/>
+              <w:bottom w:val="single" w:sz="4" w:space="0" w:color="888888"/>
+              <w:left w:val="single" w:sz="4" w:space="0" w:color="888888"/>
+              <w:right w:val="single" w:sz="4" w:space="0" w:color="888888"/>
+            </w:tcBorders>
+          </w:tcPr>
+          <w:p>
+            <w:pPr>
+              <w:spacing w:before="60" w:after="60" w:line="252" w:lineRule="auto"/>
+              <w:jc w:val="left"/>
+            </w:pPr>
+            <w:r>
+              <w:rPr>
+                <w:rFonts w:ascii="Times New Roman" w:hAnsi="Times New Roman"/>
+                <w:b/>
+                <w:sz w:val="17"/>
+              </w:rPr>
+              <w:t>Synopsis Approval &amp; Architecture Design</w:t>
+            </w:r>
+          </w:p>
+        </w:tc>
+        <w:tc>
+          <w:tcPr>
+            <w:tcW w:type="dxa" w:w="7128"/>
+            <w:tcMar>
+              <w:top w:w="80" w:type="dxa"/>
+              <w:bottom w:w="80" w:type="dxa"/>
+              <w:left w:w="100" w:type="dxa"/>
+              <w:right w:w="100" w:type="dxa"/>
+            </w:tcMar>
+            <w:tcBorders>
+              <w:top w:val="single" w:sz="4" w:space="0" w:color="888888"/>
+              <w:bottom w:val="single" w:sz="4" w:space="0" w:color="888888"/>
+              <w:left w:val="single" w:sz="4" w:space="0" w:color="888888"/>
+              <w:right w:val="single" w:sz="4" w:space="0" w:color="888888"/>
+            </w:tcBorders>
+          </w:tcPr>
+          <w:p>
+            <w:pPr>
+              <w:spacing w:before="60" w:after="60" w:line="252" w:lineRule="auto"/>
+              <w:jc w:val="left"/>
+            </w:pPr>
+            <w:r>
+              <w:rPr>
+                <w:rFonts w:ascii="Times New Roman" w:hAnsi="Times New Roman"/>
+                <w:b w:val="0"/>
+                <w:sz w:val="17"/>
+              </w:rPr>
+              <w:t>Incorporated mentor feedback. Received synopsis approval. Designed dual-stream pipeline diagram, DFD Level-0 and Level-1. Initialized GitHub repository: github.com/DevRanaKaila/DeepGuard-AI. Initial commit with project structure.</w:t>
+            </w:r>
+          </w:p>
+        </w:tc>
+        <w:tc>
+          <w:tcPr>
+            <w:tcW w:type="dxa" w:w="1296"/>
+            <w:tcMar>
+              <w:top w:w="80" w:type="dxa"/>
+              <w:bottom w:w="80" w:type="dxa"/>
+              <w:left w:w="100" w:type="dxa"/>
+              <w:right w:w="100" w:type="dxa"/>
+            </w:tcMar>
+            <w:tcBorders>
+              <w:top w:val="single" w:sz="4" w:space="0" w:color="888888"/>
+              <w:bottom w:val="single" w:sz="4" w:space="0" w:color="888888"/>
+              <w:left w:val="single" w:sz="4" w:space="0" w:color="888888"/>
+              <w:right w:val="single" w:sz="4" w:space="0" w:color="888888"/>
+            </w:tcBorders>
+          </w:tcPr>
+          <w:p>
+            <w:pPr>
+              <w:spacing w:before="60" w:after="60" w:line="252" w:lineRule="auto"/>
+              <w:jc w:val="center"/>
+            </w:pPr>
+            <w:r>
+              <w:rPr>
+                <w:rFonts w:ascii="Times New Roman" w:hAnsi="Times New Roman"/>
+                <w:b w:val="0"/>
+                <w:color w:val="008000"/>
+                <w:sz w:val="17"/>
+              </w:rPr>
+              <w:t>Completed</w:t>
+            </w:r>
+          </w:p>
+        </w:tc>
+        <w:tc>
+          <w:tcPr>
+            <w:tcW w:type="dxa" w:w="1584"/>
+            <w:tcMar>
+              <w:top w:w="80" w:type="dxa"/>
+              <w:bottom w:w="80" w:type="dxa"/>
+              <w:left w:w="100" w:type="dxa"/>
+              <w:right w:w="100" w:type="dxa"/>
+            </w:tcMar>
+            <w:tcBorders>
+              <w:top w:val="single" w:sz="4" w:space="0" w:color="888888"/>
+              <w:bottom w:val="single" w:sz="4" w:space="0" w:color="888888"/>
+              <w:left w:val="single" w:sz="4" w:space="0" w:color="888888"/>
+              <w:right w:val="single" w:sz="4" w:space="0" w:color="888888"/>
+            </w:tcBorders>
+          </w:tcPr>
+          <w:p>
+            <w:pPr>
+              <w:spacing w:before="60" w:after="60" w:line="252" w:lineRule="auto"/>
+              <w:jc w:val="center"/>
+            </w:pPr>
+            <w:r>
+              <w:rPr>
+                <w:rFonts w:ascii="Times New Roman" w:hAnsi="Times New Roman"/>
+                <w:b w:val="0"/>
+                <w:sz w:val="17"/>
+              </w:rPr>
+            </w:r>
+          </w:p>
+        </w:tc>
+      </w:tr>
+      <w:tr>
+        <w:tc>
+          <w:tcPr>
+            <w:tcW w:type="dxa" w:w="2664"/>
+            <w:tcMar>
+              <w:top w:w="80" w:type="dxa"/>
+              <w:bottom w:w="80" w:type="dxa"/>
+              <w:left w:w="100" w:type="dxa"/>
+              <w:right w:w="100" w:type="dxa"/>
+            </w:tcMar>
+            <w:tcBorders>
+              <w:top w:val="single" w:sz="4" w:space="0" w:color="888888"/>
+              <w:bottom w:val="single" w:sz="4" w:space="0" w:color="888888"/>
+              <w:left w:val="single" w:sz="4" w:space="0" w:color="888888"/>
+              <w:right w:val="single" w:sz="4" w:space="0" w:color="888888"/>
+            </w:tcBorders>
+          </w:tcPr>
+          <w:p>
+            <w:pPr>
+              <w:spacing w:before="60" w:after="60" w:line="252" w:lineRule="auto"/>
+              <w:jc w:val="center"/>
+            </w:pPr>
+            <w:r>
+              <w:rPr>
+                <w:rFonts w:ascii="Times New Roman" w:hAnsi="Times New Roman"/>
+                <w:b w:val="0"/>
+                <w:sz w:val="17"/>
+              </w:rPr>
+              <w:t>27/09/2026 – 03/10/2026</w:t>
+            </w:r>
+          </w:p>
+        </w:tc>
+        <w:tc>
+          <w:tcPr>
+            <w:tcW w:type="dxa" w:w="2160"/>
+            <w:tcMar>
+              <w:top w:w="80" w:type="dxa"/>
+              <w:bottom w:w="80" w:type="dxa"/>
+              <w:left w:w="100" w:type="dxa"/>
+              <w:right w:w="100" w:type="dxa"/>
+            </w:tcMar>
+            <w:tcBorders>
+              <w:top w:val="single" w:sz="4" w:space="0" w:color="888888"/>
+              <w:bottom w:val="single" w:sz="4" w:space="0" w:color="888888"/>
+              <w:left w:val="single" w:sz="4" w:space="0" w:color="888888"/>
+              <w:right w:val="single" w:sz="4" w:space="0" w:color="888888"/>
+            </w:tcBorders>
+          </w:tcPr>
+          <w:p>
+            <w:pPr>
+              <w:spacing w:before="60" w:after="60" w:line="252" w:lineRule="auto"/>
+              <w:jc w:val="left"/>
+            </w:pPr>
+            <w:r>
+              <w:rPr>
+                <w:rFonts w:ascii="Times New Roman" w:hAnsi="Times New Roman"/>
+                <w:b/>
+                <w:sz w:val="17"/>
+              </w:rPr>
+              <w:t>Dataset Curation &amp; Preprocessing Pipeline</w:t>
+            </w:r>
+          </w:p>
+        </w:tc>
+        <w:tc>
+          <w:tcPr>
+            <w:tcW w:type="dxa" w:w="7128"/>
+            <w:tcMar>
+              <w:top w:w="80" w:type="dxa"/>
+              <w:bottom w:w="80" w:type="dxa"/>
+              <w:left w:w="100" w:type="dxa"/>
+              <w:right w:w="100" w:type="dxa"/>
+            </w:tcMar>
+            <w:tcBorders>
+              <w:top w:val="single" w:sz="4" w:space="0" w:color="888888"/>
+              <w:bottom w:val="single" w:sz="4" w:space="0" w:color="888888"/>
+              <w:left w:val="single" w:sz="4" w:space="0" w:color="888888"/>
+              <w:right w:val="single" w:sz="4" w:space="0" w:color="888888"/>
+            </w:tcBorders>
+          </w:tcPr>
+          <w:p>
+            <w:pPr>
+              <w:spacing w:before="60" w:after="60" w:line="252" w:lineRule="auto"/>
+              <w:jc w:val="left"/>
+            </w:pPr>
+            <w:r>
+              <w:rPr>
+                <w:rFonts w:ascii="Times New Roman" w:hAnsi="Times New Roman"/>
+                <w:b w:val="0"/>
+                <w:sz w:val="17"/>
+              </w:rPr>
+              <w:t>Set up FaceForensics++ dataset structure across raw, c23, c40 tiers. Implemented video frame extraction at 5 FPS using OpenCV. Integrated MTCNN for face detection with 15% boundary margin. Verified preprocessing pipeline on 50 sample videos. Created src/data/ module.</w:t>
+            </w:r>
+          </w:p>
+        </w:tc>
+        <w:tc>
+          <w:tcPr>
+            <w:tcW w:type="dxa" w:w="1296"/>
+            <w:tcMar>
+              <w:top w:w="80" w:type="dxa"/>
+              <w:bottom w:w="80" w:type="dxa"/>
+              <w:left w:w="100" w:type="dxa"/>
+              <w:right w:w="100" w:type="dxa"/>
+            </w:tcMar>
+            <w:tcBorders>
+              <w:top w:val="single" w:sz="4" w:space="0" w:color="888888"/>
+              <w:bottom w:val="single" w:sz="4" w:space="0" w:color="888888"/>
+              <w:left w:val="single" w:sz="4" w:space="0" w:color="888888"/>
+              <w:right w:val="single" w:sz="4" w:space="0" w:color="888888"/>
+            </w:tcBorders>
+          </w:tcPr>
+          <w:p>
+            <w:pPr>
+              <w:spacing w:before="60" w:after="60" w:line="252" w:lineRule="auto"/>
+              <w:jc w:val="center"/>
+            </w:pPr>
+            <w:r>
+              <w:rPr>
+                <w:rFonts w:ascii="Times New Roman" w:hAnsi="Times New Roman"/>
+                <w:b w:val="0"/>
+                <w:color w:val="008000"/>
+                <w:sz w:val="17"/>
+              </w:rPr>
+              <w:t>Completed</w:t>
+            </w:r>
+          </w:p>
+        </w:tc>
+        <w:tc>
+          <w:tcPr>
+            <w:tcW w:type="dxa" w:w="1584"/>
+            <w:tcMar>
+              <w:top w:w="80" w:type="dxa"/>
+              <w:bottom w:w="80" w:type="dxa"/>
+              <w:left w:w="100" w:type="dxa"/>
+              <w:right w:w="100" w:type="dxa"/>
+            </w:tcMar>
+            <w:tcBorders>
+              <w:top w:val="single" w:sz="4" w:space="0" w:color="888888"/>
+              <w:bottom w:val="single" w:sz="4" w:space="0" w:color="888888"/>
+              <w:left w:val="single" w:sz="4" w:space="0" w:color="888888"/>
+              <w:right w:val="single" w:sz="4" w:space="0" w:color="888888"/>
+            </w:tcBorders>
+          </w:tcPr>
+          <w:p>
+            <w:pPr>
+              <w:spacing w:before="60" w:after="60" w:line="252" w:lineRule="auto"/>
+              <w:jc w:val="center"/>
+            </w:pPr>
+            <w:r>
+              <w:rPr>
+                <w:rFonts w:ascii="Times New Roman" w:hAnsi="Times New Roman"/>
+                <w:b w:val="0"/>
+                <w:sz w:val="17"/>
+              </w:rPr>
+            </w:r>
+          </w:p>
+        </w:tc>
+      </w:tr>
+      <w:tr>
+        <w:tc>
+          <w:tcPr>
+            <w:tcW w:type="dxa" w:w="2664"/>
+            <w:tcMar>
+              <w:top w:w="80" w:type="dxa"/>
+              <w:bottom w:w="80" w:type="dxa"/>
+              <w:left w:w="100" w:type="dxa"/>
+              <w:right w:w="100" w:type="dxa"/>
+            </w:tcMar>
+            <w:tcBorders>
+              <w:top w:val="single" w:sz="4" w:space="0" w:color="888888"/>
+              <w:bottom w:val="single" w:sz="4" w:space="0" w:color="888888"/>
+              <w:left w:val="single" w:sz="4" w:space="0" w:color="888888"/>
+              <w:right w:val="single" w:sz="4" w:space="0" w:color="888888"/>
+            </w:tcBorders>
+          </w:tcPr>
+          <w:p>
+            <w:pPr>
+              <w:spacing w:before="60" w:after="60" w:line="252" w:lineRule="auto"/>
+              <w:jc w:val="center"/>
+            </w:pPr>
+            <w:r>
+              <w:rPr>
+                <w:rFonts w:ascii="Times New Roman" w:hAnsi="Times New Roman"/>
+                <w:b w:val="0"/>
+                <w:sz w:val="17"/>
+              </w:rPr>
+              <w:t>04/10/2026 – 10/10/2026</w:t>
+            </w:r>
+          </w:p>
+        </w:tc>
+        <w:tc>
+          <w:tcPr>
+            <w:tcW w:type="dxa" w:w="2160"/>
+            <w:tcMar>
+              <w:top w:w="80" w:type="dxa"/>
+              <w:bottom w:w="80" w:type="dxa"/>
+              <w:left w:w="100" w:type="dxa"/>
+              <w:right w:w="100" w:type="dxa"/>
+            </w:tcMar>
+            <w:tcBorders>
+              <w:top w:val="single" w:sz="4" w:space="0" w:color="888888"/>
+              <w:bottom w:val="single" w:sz="4" w:space="0" w:color="888888"/>
+              <w:left w:val="single" w:sz="4" w:space="0" w:color="888888"/>
+              <w:right w:val="single" w:sz="4" w:space="0" w:color="888888"/>
+            </w:tcBorders>
+          </w:tcPr>
+          <w:p>
+            <w:pPr>
+              <w:spacing w:before="60" w:after="60" w:line="252" w:lineRule="auto"/>
+              <w:jc w:val="left"/>
+            </w:pPr>
+            <w:r>
+              <w:rPr>
+                <w:rFonts w:ascii="Times New Roman" w:hAnsi="Times New Roman"/>
+                <w:b/>
+                <w:sz w:val="17"/>
+              </w:rPr>
+              <w:t>Spatial Stream Implementation</w:t>
+            </w:r>
+          </w:p>
+        </w:tc>
+        <w:tc>
+          <w:tcPr>
+            <w:tcW w:type="dxa" w:w="7128"/>
+            <w:tcMar>
+              <w:top w:w="80" w:type="dxa"/>
+              <w:bottom w:w="80" w:type="dxa"/>
+              <w:left w:w="100" w:type="dxa"/>
+              <w:right w:w="100" w:type="dxa"/>
+            </w:tcMar>
+            <w:tcBorders>
+              <w:top w:val="single" w:sz="4" w:space="0" w:color="888888"/>
+              <w:bottom w:val="single" w:sz="4" w:space="0" w:color="888888"/>
+              <w:left w:val="single" w:sz="4" w:space="0" w:color="888888"/>
+              <w:right w:val="single" w:sz="4" w:space="0" w:color="888888"/>
+            </w:tcBorders>
+          </w:tcPr>
+          <w:p>
+            <w:pPr>
+              <w:spacing w:before="60" w:after="60" w:line="252" w:lineRule="auto"/>
+              <w:jc w:val="left"/>
+            </w:pPr>
+            <w:r>
+              <w:rPr>
+                <w:rFonts w:ascii="Times New Roman" w:hAnsi="Times New Roman"/>
+                <w:b w:val="0"/>
+                <w:sz w:val="17"/>
+              </w:rPr>
+              <w:t>Integrated EfficientNet-B4 backbone via timm (pretrained ImageNet). Implemented SpatialStream module in src/models/spatial_stream.py. Validated 1792-d feature vector output and gradient flow. Spatial-only baseline achieves 82% accuracy.</w:t>
+            </w:r>
+          </w:p>
+        </w:tc>
+        <w:tc>
+          <w:tcPr>
+            <w:tcW w:type="dxa" w:w="1296"/>
+            <w:tcMar>
+              <w:top w:w="80" w:type="dxa"/>
+              <w:bottom w:w="80" w:type="dxa"/>
+              <w:left w:w="100" w:type="dxa"/>
+              <w:right w:w="100" w:type="dxa"/>
+            </w:tcMar>
+            <w:tcBorders>
+              <w:top w:val="single" w:sz="4" w:space="0" w:color="888888"/>
+              <w:bottom w:val="single" w:sz="4" w:space="0" w:color="888888"/>
+              <w:left w:val="single" w:sz="4" w:space="0" w:color="888888"/>
+              <w:right w:val="single" w:sz="4" w:space="0" w:color="888888"/>
+            </w:tcBorders>
+          </w:tcPr>
+          <w:p>
+            <w:pPr>
+              <w:spacing w:before="60" w:after="60" w:line="252" w:lineRule="auto"/>
+              <w:jc w:val="center"/>
+            </w:pPr>
+            <w:r>
+              <w:rPr>
+                <w:rFonts w:ascii="Times New Roman" w:hAnsi="Times New Roman"/>
+                <w:b w:val="0"/>
+                <w:color w:val="008000"/>
+                <w:sz w:val="17"/>
+              </w:rPr>
+              <w:t>Completed</w:t>
+            </w:r>
+          </w:p>
+        </w:tc>
+        <w:tc>
+          <w:tcPr>
+            <w:tcW w:type="dxa" w:w="1584"/>
+            <w:tcMar>
+              <w:top w:w="80" w:type="dxa"/>
+              <w:bottom w:w="80" w:type="dxa"/>
+              <w:left w:w="100" w:type="dxa"/>
+              <w:right w:w="100" w:type="dxa"/>
+            </w:tcMar>
+            <w:tcBorders>
+              <w:top w:val="single" w:sz="4" w:space="0" w:color="888888"/>
+              <w:bottom w:val="single" w:sz="4" w:space="0" w:color="888888"/>
+              <w:left w:val="single" w:sz="4" w:space="0" w:color="888888"/>
+              <w:right w:val="single" w:sz="4" w:space="0" w:color="888888"/>
+            </w:tcBorders>
+          </w:tcPr>
+          <w:p>
+            <w:pPr>
+              <w:spacing w:before="60" w:after="60" w:line="252" w:lineRule="auto"/>
+              <w:jc w:val="center"/>
+            </w:pPr>
+            <w:r>
+              <w:rPr>
+                <w:rFonts w:ascii="Times New Roman" w:hAnsi="Times New Roman"/>
+                <w:b w:val="0"/>
+                <w:sz w:val="17"/>
+              </w:rPr>
+            </w:r>
+          </w:p>
+        </w:tc>
+      </w:tr>
+      <w:tr>
+        <w:tc>
+          <w:tcPr>
+            <w:tcW w:type="dxa" w:w="2664"/>
+            <w:tcMar>
+              <w:top w:w="80" w:type="dxa"/>
+              <w:bottom w:w="80" w:type="dxa"/>
+              <w:left w:w="100" w:type="dxa"/>
+              <w:right w:w="100" w:type="dxa"/>
+            </w:tcMar>
+            <w:tcBorders>
+              <w:top w:val="single" w:sz="4" w:space="0" w:color="888888"/>
+              <w:bottom w:val="single" w:sz="4" w:space="0" w:color="888888"/>
+              <w:left w:val="single" w:sz="4" w:space="0" w:color="888888"/>
+              <w:right w:val="single" w:sz="4" w:space="0" w:color="888888"/>
+            </w:tcBorders>
+          </w:tcPr>
+          <w:p>
+            <w:pPr>
+              <w:spacing w:before="60" w:after="60" w:line="252" w:lineRule="auto"/>
+              <w:jc w:val="center"/>
+            </w:pPr>
+            <w:r>
+              <w:rPr>
+                <w:rFonts w:ascii="Times New Roman" w:hAnsi="Times New Roman"/>
+                <w:b w:val="0"/>
+                <w:sz w:val="17"/>
+              </w:rPr>
+              <w:t>11/10/2026 – 17/10/2026</w:t>
+            </w:r>
+          </w:p>
+        </w:tc>
+        <w:tc>
+          <w:tcPr>
+            <w:tcW w:type="dxa" w:w="2160"/>
+            <w:tcMar>
+              <w:top w:w="80" w:type="dxa"/>
+              <w:bottom w:w="80" w:type="dxa"/>
+              <w:left w:w="100" w:type="dxa"/>
+              <w:right w:w="100" w:type="dxa"/>
+            </w:tcMar>
+            <w:tcBorders>
+              <w:top w:val="single" w:sz="4" w:space="0" w:color="888888"/>
+              <w:bottom w:val="single" w:sz="4" w:space="0" w:color="888888"/>
+              <w:left w:val="single" w:sz="4" w:space="0" w:color="888888"/>
+              <w:right w:val="single" w:sz="4" w:space="0" w:color="888888"/>
+            </w:tcBorders>
+          </w:tcPr>
+          <w:p>
+            <w:pPr>
+              <w:spacing w:before="60" w:after="60" w:line="252" w:lineRule="auto"/>
+              <w:jc w:val="left"/>
+            </w:pPr>
+            <w:r>
+              <w:rPr>
+                <w:rFonts w:ascii="Times New Roman" w:hAnsi="Times New Roman"/>
+                <w:b/>
+                <w:sz w:val="17"/>
+              </w:rPr>
+              <w:t>DCT Transform &amp; Mid-Term Review</w:t>
+            </w:r>
+          </w:p>
+        </w:tc>
+        <w:tc>
+          <w:tcPr>
+            <w:tcW w:type="dxa" w:w="7128"/>
+            <w:tcMar>
+              <w:top w:w="80" w:type="dxa"/>
+              <w:bottom w:w="80" w:type="dxa"/>
+              <w:left w:w="100" w:type="dxa"/>
+              <w:right w:w="100" w:type="dxa"/>
+            </w:tcMar>
+            <w:tcBorders>
+              <w:top w:val="single" w:sz="4" w:space="0" w:color="888888"/>
+              <w:bottom w:val="single" w:sz="4" w:space="0" w:color="888888"/>
+              <w:left w:val="single" w:sz="4" w:space="0" w:color="888888"/>
+              <w:right w:val="single" w:sz="4" w:space="0" w:color="888888"/>
+            </w:tcBorders>
+          </w:tcPr>
+          <w:p>
+            <w:pPr>
+              <w:spacing w:before="60" w:after="60" w:line="252" w:lineRule="auto"/>
+              <w:jc w:val="left"/>
+            </w:pPr>
+            <w:r>
+              <w:rPr>
+                <w:rFonts w:ascii="Times New Roman" w:hAnsi="Times New Roman"/>
+                <w:b w:val="0"/>
+                <w:sz w:val="17"/>
+              </w:rPr>
+              <w:t>Implemented 2D-DCT-II transform and Radial Azimuthal Spectrum A(r) in src/data/dct_transform.py. Demonstrated spatial pipeline to mentor. Prepared mid-term progress report. Frequency stream CNN prototype initiated. Mid-term review signed off.</w:t>
+            </w:r>
+          </w:p>
+        </w:tc>
+        <w:tc>
+          <w:tcPr>
+            <w:tcW w:type="dxa" w:w="1296"/>
+            <w:tcMar>
+              <w:top w:w="80" w:type="dxa"/>
+              <w:bottom w:w="80" w:type="dxa"/>
+              <w:left w:w="100" w:type="dxa"/>
+              <w:right w:w="100" w:type="dxa"/>
+            </w:tcMar>
+            <w:tcBorders>
+              <w:top w:val="single" w:sz="4" w:space="0" w:color="888888"/>
+              <w:bottom w:val="single" w:sz="4" w:space="0" w:color="888888"/>
+              <w:left w:val="single" w:sz="4" w:space="0" w:color="888888"/>
+              <w:right w:val="single" w:sz="4" w:space="0" w:color="888888"/>
+            </w:tcBorders>
+          </w:tcPr>
+          <w:p>
+            <w:pPr>
+              <w:spacing w:before="60" w:after="60" w:line="252" w:lineRule="auto"/>
+              <w:jc w:val="center"/>
+            </w:pPr>
+            <w:r>
+              <w:rPr>
+                <w:rFonts w:ascii="Times New Roman" w:hAnsi="Times New Roman"/>
+                <w:b w:val="0"/>
+                <w:color w:val="008000"/>
+                <w:sz w:val="17"/>
+              </w:rPr>
+              <w:t>Completed</w:t>
+            </w:r>
+          </w:p>
+        </w:tc>
+        <w:tc>
+          <w:tcPr>
+            <w:tcW w:type="dxa" w:w="1584"/>
+            <w:tcMar>
+              <w:top w:w="80" w:type="dxa"/>
+              <w:bottom w:w="80" w:type="dxa"/>
+              <w:left w:w="100" w:type="dxa"/>
+              <w:right w:w="100" w:type="dxa"/>
+            </w:tcMar>
+            <w:tcBorders>
+              <w:top w:val="single" w:sz="4" w:space="0" w:color="888888"/>
+              <w:bottom w:val="single" w:sz="4" w:space="0" w:color="888888"/>
+              <w:left w:val="single" w:sz="4" w:space="0" w:color="888888"/>
+              <w:right w:val="single" w:sz="4" w:space="0" w:color="888888"/>
+            </w:tcBorders>
+          </w:tcPr>
+          <w:p>
+            <w:pPr>
+              <w:spacing w:before="60" w:after="60" w:line="252" w:lineRule="auto"/>
+              <w:jc w:val="center"/>
+            </w:pPr>
+            <w:r>
+              <w:rPr>
+                <w:rFonts w:ascii="Times New Roman" w:hAnsi="Times New Roman"/>
+                <w:b w:val="0"/>
+                <w:sz w:val="17"/>
+              </w:rPr>
+            </w:r>
+          </w:p>
+        </w:tc>
+      </w:tr>
+      <w:tr>
+        <w:tc>
+          <w:tcPr>
+            <w:tcW w:type="dxa" w:w="2664"/>
+            <w:tcMar>
+              <w:top w:w="80" w:type="dxa"/>
+              <w:bottom w:w="80" w:type="dxa"/>
+              <w:left w:w="100" w:type="dxa"/>
+              <w:right w:w="100" w:type="dxa"/>
+            </w:tcMar>
+            <w:tcBorders>
+              <w:top w:val="single" w:sz="4" w:space="0" w:color="888888"/>
+              <w:bottom w:val="single" w:sz="4" w:space="0" w:color="888888"/>
+              <w:left w:val="single" w:sz="4" w:space="0" w:color="888888"/>
+              <w:right w:val="single" w:sz="4" w:space="0" w:color="888888"/>
+            </w:tcBorders>
+          </w:tcPr>
+          <w:p>
+            <w:pPr>
+              <w:spacing w:before="60" w:after="60" w:line="252" w:lineRule="auto"/>
+              <w:jc w:val="center"/>
+            </w:pPr>
+            <w:r>
+              <w:rPr>
+                <w:rFonts w:ascii="Times New Roman" w:hAnsi="Times New Roman"/>
+                <w:b w:val="0"/>
+                <w:sz w:val="17"/>
+              </w:rPr>
+              <w:t>18/10/2026 – 24/10/2026</w:t>
+            </w:r>
+          </w:p>
+        </w:tc>
+        <w:tc>
+          <w:tcPr>
+            <w:tcW w:type="dxa" w:w="2160"/>
+            <w:tcMar>
+              <w:top w:w="80" w:type="dxa"/>
+              <w:bottom w:w="80" w:type="dxa"/>
+              <w:left w:w="100" w:type="dxa"/>
+              <w:right w:w="100" w:type="dxa"/>
+            </w:tcMar>
+            <w:tcBorders>
+              <w:top w:val="single" w:sz="4" w:space="0" w:color="888888"/>
+              <w:bottom w:val="single" w:sz="4" w:space="0" w:color="888888"/>
+              <w:left w:val="single" w:sz="4" w:space="0" w:color="888888"/>
+              <w:right w:val="single" w:sz="4" w:space="0" w:color="888888"/>
+            </w:tcBorders>
+          </w:tcPr>
+          <w:p>
+            <w:pPr>
+              <w:spacing w:before="60" w:after="60" w:line="252" w:lineRule="auto"/>
+              <w:jc w:val="left"/>
+            </w:pPr>
+            <w:r>
+              <w:rPr>
+                <w:rFonts w:ascii="Times New Roman" w:hAnsi="Times New Roman"/>
+                <w:b/>
+                <w:sz w:val="17"/>
+              </w:rPr>
+              <w:t>Frequency Stream &amp; Fusion Module</w:t>
+            </w:r>
+          </w:p>
+        </w:tc>
+        <w:tc>
+          <w:tcPr>
+            <w:tcW w:type="dxa" w:w="7128"/>
+            <w:tcMar>
+              <w:top w:w="80" w:type="dxa"/>
+              <w:bottom w:w="80" w:type="dxa"/>
+              <w:left w:w="100" w:type="dxa"/>
+              <w:right w:w="100" w:type="dxa"/>
+            </w:tcMar>
+            <w:tcBorders>
+              <w:top w:val="single" w:sz="4" w:space="0" w:color="888888"/>
+              <w:bottom w:val="single" w:sz="4" w:space="0" w:color="888888"/>
+              <w:left w:val="single" w:sz="4" w:space="0" w:color="888888"/>
+              <w:right w:val="single" w:sz="4" w:space="0" w:color="888888"/>
+            </w:tcBorders>
+          </w:tcPr>
+          <w:p>
+            <w:pPr>
+              <w:spacing w:before="60" w:after="60" w:line="252" w:lineRule="auto"/>
+              <w:jc w:val="left"/>
+            </w:pPr>
+            <w:r>
+              <w:rPr>
+                <w:rFonts w:ascii="Times New Roman" w:hAnsi="Times New Roman"/>
+                <w:b w:val="0"/>
+                <w:sz w:val="17"/>
+              </w:rPr>
+              <w:t>Implemented 4-stage Spectral-CNN (src/models/frequency_stream.py). Implemented attention-gated bilinear fusion (src/models/fusion.py). Complete DualStreamNet integration. Configured training engine with AdamW, label smoothing, and AMP.</w:t>
+            </w:r>
+          </w:p>
+        </w:tc>
+        <w:tc>
+          <w:tcPr>
+            <w:tcW w:type="dxa" w:w="1296"/>
+            <w:tcMar>
+              <w:top w:w="80" w:type="dxa"/>
+              <w:bottom w:w="80" w:type="dxa"/>
+              <w:left w:w="100" w:type="dxa"/>
+              <w:right w:w="100" w:type="dxa"/>
+            </w:tcMar>
+            <w:tcBorders>
+              <w:top w:val="single" w:sz="4" w:space="0" w:color="888888"/>
+              <w:bottom w:val="single" w:sz="4" w:space="0" w:color="888888"/>
+              <w:left w:val="single" w:sz="4" w:space="0" w:color="888888"/>
+              <w:right w:val="single" w:sz="4" w:space="0" w:color="888888"/>
+            </w:tcBorders>
+          </w:tcPr>
+          <w:p>
+            <w:pPr>
+              <w:spacing w:before="60" w:after="60" w:line="252" w:lineRule="auto"/>
+              <w:jc w:val="center"/>
+            </w:pPr>
+            <w:r>
+              <w:rPr>
+                <w:rFonts w:ascii="Times New Roman" w:hAnsi="Times New Roman"/>
+                <w:b w:val="0"/>
+                <w:color w:val="008000"/>
+                <w:sz w:val="17"/>
+              </w:rPr>
+              <w:t>Completed</w:t>
+            </w:r>
+          </w:p>
+        </w:tc>
+        <w:tc>
+          <w:tcPr>
+            <w:tcW w:type="dxa" w:w="1584"/>
+            <w:tcMar>
+              <w:top w:w="80" w:type="dxa"/>
+              <w:bottom w:w="80" w:type="dxa"/>
+              <w:left w:w="100" w:type="dxa"/>
+              <w:right w:w="100" w:type="dxa"/>
+            </w:tcMar>
+            <w:tcBorders>
+              <w:top w:val="single" w:sz="4" w:space="0" w:color="888888"/>
+              <w:bottom w:val="single" w:sz="4" w:space="0" w:color="888888"/>
+              <w:left w:val="single" w:sz="4" w:space="0" w:color="888888"/>
+              <w:right w:val="single" w:sz="4" w:space="0" w:color="888888"/>
+            </w:tcBorders>
+          </w:tcPr>
+          <w:p>
+            <w:pPr>
+              <w:spacing w:before="60" w:after="60" w:line="252" w:lineRule="auto"/>
+              <w:jc w:val="center"/>
+            </w:pPr>
+            <w:r>
+              <w:rPr>
+                <w:rFonts w:ascii="Times New Roman" w:hAnsi="Times New Roman"/>
+                <w:b w:val="0"/>
+                <w:sz w:val="17"/>
+              </w:rPr>
+            </w:r>
+          </w:p>
+        </w:tc>
+      </w:tr>
+      <w:tr>
+        <w:tc>
+          <w:tcPr>
+            <w:tcW w:type="dxa" w:w="2664"/>
+            <w:tcMar>
+              <w:top w:w="80" w:type="dxa"/>
+              <w:bottom w:w="80" w:type="dxa"/>
+              <w:left w:w="100" w:type="dxa"/>
+              <w:right w:w="100" w:type="dxa"/>
+            </w:tcMar>
+            <w:tcBorders>
+              <w:top w:val="single" w:sz="4" w:space="0" w:color="888888"/>
+              <w:bottom w:val="single" w:sz="4" w:space="0" w:color="888888"/>
+              <w:left w:val="single" w:sz="4" w:space="0" w:color="888888"/>
+              <w:right w:val="single" w:sz="4" w:space="0" w:color="888888"/>
+            </w:tcBorders>
+          </w:tcPr>
+          <w:p>
+            <w:pPr>
+              <w:spacing w:before="60" w:after="60" w:line="252" w:lineRule="auto"/>
+              <w:jc w:val="center"/>
+            </w:pPr>
+            <w:r>
+              <w:rPr>
+                <w:rFonts w:ascii="Times New Roman" w:hAnsi="Times New Roman"/>
+                <w:b w:val="0"/>
+                <w:sz w:val="17"/>
+              </w:rPr>
+              <w:t>25/10/2026 – 31/10/2026</w:t>
+            </w:r>
+          </w:p>
+        </w:tc>
+        <w:tc>
+          <w:tcPr>
+            <w:tcW w:type="dxa" w:w="2160"/>
+            <w:tcMar>
+              <w:top w:w="80" w:type="dxa"/>
+              <w:bottom w:w="80" w:type="dxa"/>
+              <w:left w:w="100" w:type="dxa"/>
+              <w:right w:w="100" w:type="dxa"/>
+            </w:tcMar>
+            <w:tcBorders>
+              <w:top w:val="single" w:sz="4" w:space="0" w:color="888888"/>
+              <w:bottom w:val="single" w:sz="4" w:space="0" w:color="888888"/>
+              <w:left w:val="single" w:sz="4" w:space="0" w:color="888888"/>
+              <w:right w:val="single" w:sz="4" w:space="0" w:color="888888"/>
+            </w:tcBorders>
+          </w:tcPr>
+          <w:p>
+            <w:pPr>
+              <w:spacing w:before="60" w:after="60" w:line="252" w:lineRule="auto"/>
+              <w:jc w:val="left"/>
+            </w:pPr>
+            <w:r>
+              <w:rPr>
+                <w:rFonts w:ascii="Times New Roman" w:hAnsi="Times New Roman"/>
+                <w:b/>
+                <w:sz w:val="17"/>
+              </w:rPr>
+              <w:t>Dashboard, Grad-CAM &amp; Testing</w:t>
+            </w:r>
+          </w:p>
+        </w:tc>
+        <w:tc>
+          <w:tcPr>
+            <w:tcW w:type="dxa" w:w="7128"/>
+            <w:tcMar>
+              <w:top w:w="80" w:type="dxa"/>
+              <w:bottom w:w="80" w:type="dxa"/>
+              <w:left w:w="100" w:type="dxa"/>
+              <w:right w:w="100" w:type="dxa"/>
+            </w:tcMar>
+            <w:tcBorders>
+              <w:top w:val="single" w:sz="4" w:space="0" w:color="888888"/>
+              <w:bottom w:val="single" w:sz="4" w:space="0" w:color="888888"/>
+              <w:left w:val="single" w:sz="4" w:space="0" w:color="888888"/>
+              <w:right w:val="single" w:sz="4" w:space="0" w:color="888888"/>
+            </w:tcBorders>
+          </w:tcPr>
+          <w:p>
+            <w:pPr>
+              <w:spacing w:before="60" w:after="60" w:line="252" w:lineRule="auto"/>
+              <w:jc w:val="left"/>
+            </w:pPr>
+            <w:r>
+              <w:rPr>
+                <w:rFonts w:ascii="Times New Roman" w:hAnsi="Times New Roman"/>
+                <w:b w:val="0"/>
+                <w:sz w:val="17"/>
+              </w:rPr>
+              <w:t>Develop Streamlit web dashboard (app.py). Implement Grad-CAM heatmap generator (src/utils/gradcam.py). End-to-end pipeline integration. Cross-dataset testing on Celeb-DF v2. Benchmark against XceptionNet and F3-Net baselines.</w:t>
+            </w:r>
+          </w:p>
+        </w:tc>
+        <w:tc>
+          <w:tcPr>
+            <w:tcW w:type="dxa" w:w="1296"/>
+            <w:tcMar>
+              <w:top w:w="80" w:type="dxa"/>
+              <w:bottom w:w="80" w:type="dxa"/>
+              <w:left w:w="100" w:type="dxa"/>
+              <w:right w:w="100" w:type="dxa"/>
+            </w:tcMar>
+            <w:tcBorders>
+              <w:top w:val="single" w:sz="4" w:space="0" w:color="888888"/>
+              <w:bottom w:val="single" w:sz="4" w:space="0" w:color="888888"/>
+              <w:left w:val="single" w:sz="4" w:space="0" w:color="888888"/>
+              <w:right w:val="single" w:sz="4" w:space="0" w:color="888888"/>
+            </w:tcBorders>
+          </w:tcPr>
+          <w:p>
+            <w:pPr>
+              <w:spacing w:before="60" w:after="60" w:line="252" w:lineRule="auto"/>
+              <w:jc w:val="center"/>
+            </w:pPr>
+            <w:r>
+              <w:rPr>
+                <w:rFonts w:ascii="Times New Roman" w:hAnsi="Times New Roman"/>
+                <w:b w:val="0"/>
+                <w:color w:val="B46400"/>
+                <w:sz w:val="17"/>
+              </w:rPr>
+              <w:t>Planned</w:t>
+            </w:r>
+          </w:p>
+        </w:tc>
+        <w:tc>
+          <w:tcPr>
+            <w:tcW w:type="dxa" w:w="1584"/>
+            <w:tcMar>
+              <w:top w:w="80" w:type="dxa"/>
+              <w:bottom w:w="80" w:type="dxa"/>
+              <w:left w:w="100" w:type="dxa"/>
+              <w:right w:w="100" w:type="dxa"/>
+            </w:tcMar>
+            <w:tcBorders>
+              <w:top w:val="single" w:sz="4" w:space="0" w:color="888888"/>
+              <w:bottom w:val="single" w:sz="4" w:space="0" w:color="888888"/>
+              <w:left w:val="single" w:sz="4" w:space="0" w:color="888888"/>
+              <w:right w:val="single" w:sz="4" w:space="0" w:color="888888"/>
+            </w:tcBorders>
+          </w:tcPr>
+          <w:p>
+            <w:pPr>
+              <w:spacing w:before="60" w:after="60" w:line="252" w:lineRule="auto"/>
+              <w:jc w:val="center"/>
+            </w:pPr>
+            <w:r>
+              <w:rPr>
+                <w:rFonts w:ascii="Times New Roman" w:hAnsi="Times New Roman"/>
+                <w:b w:val="0"/>
+                <w:sz w:val="17"/>
+              </w:rPr>
+            </w:r>
+          </w:p>
+        </w:tc>
+      </w:tr>
+      <w:tr>
+        <w:tc>
+          <w:tcPr>
+            <w:tcW w:type="dxa" w:w="2664"/>
+            <w:tcMar>
+              <w:top w:w="80" w:type="dxa"/>
+              <w:bottom w:w="80" w:type="dxa"/>
+              <w:left w:w="100" w:type="dxa"/>
+              <w:right w:w="100" w:type="dxa"/>
+            </w:tcMar>
+            <w:tcBorders>
+              <w:top w:val="single" w:sz="4" w:space="0" w:color="888888"/>
+              <w:bottom w:val="single" w:sz="4" w:space="0" w:color="888888"/>
+              <w:left w:val="single" w:sz="4" w:space="0" w:color="888888"/>
+              <w:right w:val="single" w:sz="4" w:space="0" w:color="888888"/>
+            </w:tcBorders>
+          </w:tcPr>
+          <w:p>
+            <w:pPr>
+              <w:spacing w:before="60" w:after="60" w:line="252" w:lineRule="auto"/>
+              <w:jc w:val="center"/>
+            </w:pPr>
+            <w:r>
+              <w:rPr>
+                <w:rFonts w:ascii="Times New Roman" w:hAnsi="Times New Roman"/>
+                <w:b w:val="0"/>
+                <w:sz w:val="17"/>
+              </w:rPr>
+              <w:t>01/11/2026 – 07/11/2026</w:t>
+            </w:r>
+          </w:p>
+        </w:tc>
+        <w:tc>
+          <w:tcPr>
+            <w:tcW w:type="dxa" w:w="2160"/>
+            <w:tcMar>
+              <w:top w:w="80" w:type="dxa"/>
+              <w:bottom w:w="80" w:type="dxa"/>
+              <w:left w:w="100" w:type="dxa"/>
+              <w:right w:w="100" w:type="dxa"/>
+            </w:tcMar>
+            <w:tcBorders>
+              <w:top w:val="single" w:sz="4" w:space="0" w:color="888888"/>
+              <w:bottom w:val="single" w:sz="4" w:space="0" w:color="888888"/>
+              <w:left w:val="single" w:sz="4" w:space="0" w:color="888888"/>
+              <w:right w:val="single" w:sz="4" w:space="0" w:color="888888"/>
+            </w:tcBorders>
+          </w:tcPr>
+          <w:p>
+            <w:pPr>
+              <w:spacing w:before="60" w:after="60" w:line="252" w:lineRule="auto"/>
+              <w:jc w:val="left"/>
+            </w:pPr>
+            <w:r>
+              <w:rPr>
+                <w:rFonts w:ascii="Times New Roman" w:hAnsi="Times New Roman"/>
+                <w:b/>
+                <w:sz w:val="17"/>
+              </w:rPr>
+              <w:t>Report Writing &amp; Code Finalization</w:t>
+            </w:r>
+          </w:p>
+        </w:tc>
+        <w:tc>
+          <w:tcPr>
+            <w:tcW w:type="dxa" w:w="7128"/>
+            <w:tcMar>
+              <w:top w:w="80" w:type="dxa"/>
+              <w:bottom w:w="80" w:type="dxa"/>
+              <w:left w:w="100" w:type="dxa"/>
+              <w:right w:w="100" w:type="dxa"/>
+            </w:tcMar>
+            <w:tcBorders>
+              <w:top w:val="single" w:sz="4" w:space="0" w:color="888888"/>
+              <w:bottom w:val="single" w:sz="4" w:space="0" w:color="888888"/>
+              <w:left w:val="single" w:sz="4" w:space="0" w:color="888888"/>
+              <w:right w:val="single" w:sz="4" w:space="0" w:color="888888"/>
+            </w:tcBorders>
+          </w:tcPr>
+          <w:p>
+            <w:pPr>
+              <w:spacing w:before="60" w:after="60" w:line="252" w:lineRule="auto"/>
+              <w:jc w:val="left"/>
+            </w:pPr>
+            <w:r>
+              <w:rPr>
+                <w:rFonts w:ascii="Times New Roman" w:hAnsi="Times New Roman"/>
+                <w:b w:val="0"/>
+                <w:sz w:val="17"/>
+              </w:rPr>
+              <w:t>Draft complete 60+ page project report strictly adhering to AKTU formatting rules. Conduct ablation study (spatial-only vs. dual-stream). Run plagiarism check (Turnitin &lt; 20%). Finalize GitHub repo with full documentation and README.</w:t>
+            </w:r>
+          </w:p>
+        </w:tc>
+        <w:tc>
+          <w:tcPr>
+            <w:tcW w:type="dxa" w:w="1296"/>
+            <w:tcMar>
+              <w:top w:w="80" w:type="dxa"/>
+              <w:bottom w:w="80" w:type="dxa"/>
+              <w:left w:w="100" w:type="dxa"/>
+              <w:right w:w="100" w:type="dxa"/>
+            </w:tcMar>
+            <w:tcBorders>
+              <w:top w:val="single" w:sz="4" w:space="0" w:color="888888"/>
+              <w:bottom w:val="single" w:sz="4" w:space="0" w:color="888888"/>
+              <w:left w:val="single" w:sz="4" w:space="0" w:color="888888"/>
+              <w:right w:val="single" w:sz="4" w:space="0" w:color="888888"/>
+            </w:tcBorders>
+          </w:tcPr>
+          <w:p>
+            <w:pPr>
+              <w:spacing w:before="60" w:after="60" w:line="252" w:lineRule="auto"/>
+              <w:jc w:val="center"/>
+            </w:pPr>
+            <w:r>
+              <w:rPr>
+                <w:rFonts w:ascii="Times New Roman" w:hAnsi="Times New Roman"/>
+                <w:b w:val="0"/>
+                <w:color w:val="B46400"/>
+                <w:sz w:val="17"/>
+              </w:rPr>
+              <w:t>Planned</w:t>
+            </w:r>
+          </w:p>
+        </w:tc>
+        <w:tc>
+          <w:tcPr>
+            <w:tcW w:type="dxa" w:w="1584"/>
+            <w:tcMar>
+              <w:top w:w="80" w:type="dxa"/>
+              <w:bottom w:w="80" w:type="dxa"/>
+              <w:left w:w="100" w:type="dxa"/>
+              <w:right w:w="100" w:type="dxa"/>
+            </w:tcMar>
+            <w:tcBorders>
+              <w:top w:val="single" w:sz="4" w:space="0" w:color="888888"/>
+              <w:bottom w:val="single" w:sz="4" w:space="0" w:color="888888"/>
+              <w:left w:val="single" w:sz="4" w:space="0" w:color="888888"/>
+              <w:right w:val="single" w:sz="4" w:space="0" w:color="888888"/>
+            </w:tcBorders>
+          </w:tcPr>
+          <w:p>
+            <w:pPr>
+              <w:spacing w:before="60" w:after="60" w:line="252" w:lineRule="auto"/>
+              <w:jc w:val="center"/>
+            </w:pPr>
+            <w:r>
+              <w:rPr>
+                <w:rFonts w:ascii="Times New Roman" w:hAnsi="Times New Roman"/>
+                <w:b w:val="0"/>
+                <w:sz w:val="17"/>
+              </w:rPr>
+            </w:r>
+          </w:p>
+        </w:tc>
+      </w:tr>
+      <w:tr>
+        <w:tc>
+          <w:tcPr>
+            <w:tcW w:type="dxa" w:w="2664"/>
+            <w:tcMar>
+              <w:top w:w="80" w:type="dxa"/>
+              <w:bottom w:w="80" w:type="dxa"/>
+              <w:left w:w="100" w:type="dxa"/>
+              <w:right w:w="100" w:type="dxa"/>
+            </w:tcMar>
+            <w:tcBorders>
+              <w:top w:val="single" w:sz="4" w:space="0" w:color="888888"/>
+              <w:bottom w:val="single" w:sz="4" w:space="0" w:color="888888"/>
+              <w:left w:val="single" w:sz="4" w:space="0" w:color="888888"/>
+              <w:right w:val="single" w:sz="4" w:space="0" w:color="888888"/>
+            </w:tcBorders>
+          </w:tcPr>
+          <w:p>
+            <w:pPr>
+              <w:spacing w:before="60" w:after="60" w:line="252" w:lineRule="auto"/>
+              <w:jc w:val="center"/>
+            </w:pPr>
+            <w:r>
+              <w:rPr>
+                <w:rFonts w:ascii="Times New Roman" w:hAnsi="Times New Roman"/>
+                <w:b w:val="0"/>
+                <w:sz w:val="17"/>
+              </w:rPr>
+              <w:t>08/11/2026 – 14/11/2026</w:t>
+            </w:r>
+          </w:p>
+        </w:tc>
+        <w:tc>
+          <w:tcPr>
+            <w:tcW w:type="dxa" w:w="2160"/>
+            <w:tcMar>
+              <w:top w:w="80" w:type="dxa"/>
+              <w:bottom w:w="80" w:type="dxa"/>
+              <w:left w:w="100" w:type="dxa"/>
+              <w:right w:w="100" w:type="dxa"/>
+            </w:tcMar>
+            <w:tcBorders>
+              <w:top w:val="single" w:sz="4" w:space="0" w:color="888888"/>
+              <w:bottom w:val="single" w:sz="4" w:space="0" w:color="888888"/>
+              <w:left w:val="single" w:sz="4" w:space="0" w:color="888888"/>
+              <w:right w:val="single" w:sz="4" w:space="0" w:color="888888"/>
+            </w:tcBorders>
+          </w:tcPr>
+          <w:p>
+            <w:pPr>
+              <w:spacing w:before="60" w:after="60" w:line="252" w:lineRule="auto"/>
+              <w:jc w:val="left"/>
+            </w:pPr>
+            <w:r>
+              <w:rPr>
+                <w:rFonts w:ascii="Times New Roman" w:hAnsi="Times New Roman"/>
+                <w:b/>
+                <w:sz w:val="17"/>
+              </w:rPr>
+              <w:t>Final Submission &amp; Viva Defense</w:t>
+            </w:r>
+          </w:p>
+        </w:tc>
+        <w:tc>
+          <w:tcPr>
+            <w:tcW w:type="dxa" w:w="7128"/>
+            <w:tcMar>
+              <w:top w:w="80" w:type="dxa"/>
+              <w:bottom w:w="80" w:type="dxa"/>
+              <w:left w:w="100" w:type="dxa"/>
+              <w:right w:w="100" w:type="dxa"/>
+            </w:tcMar>
+            <w:tcBorders>
+              <w:top w:val="single" w:sz="4" w:space="0" w:color="888888"/>
+              <w:bottom w:val="single" w:sz="4" w:space="0" w:color="888888"/>
+              <w:left w:val="single" w:sz="4" w:space="0" w:color="888888"/>
+              <w:right w:val="single" w:sz="4" w:space="0" w:color="888888"/>
+            </w:tcBorders>
+          </w:tcPr>
+          <w:p>
+            <w:pPr>
+              <w:spacing w:before="60" w:after="60" w:line="252" w:lineRule="auto"/>
+              <w:jc w:val="left"/>
+            </w:pPr>
+            <w:r>
+              <w:rPr>
+                <w:rFonts w:ascii="Times New Roman" w:hAnsi="Times New Roman"/>
+                <w:b w:val="0"/>
+                <w:sz w:val="17"/>
+              </w:rPr>
+              <w:t>Spiral-bind project report. Prepare 15-slide viva presentation deck. Live demo of Streamlit dashboard with real and fake test videos. Final submission to Dr. Devendra Gautam. Panel question-and-answer defense.</w:t>
+            </w:r>
+          </w:p>
+        </w:tc>
+        <w:tc>
+          <w:tcPr>
+            <w:tcW w:type="dxa" w:w="1296"/>
+            <w:tcMar>
+              <w:top w:w="80" w:type="dxa"/>
+              <w:bottom w:w="80" w:type="dxa"/>
+              <w:left w:w="100" w:type="dxa"/>
+              <w:right w:w="100" w:type="dxa"/>
+            </w:tcMar>
+            <w:tcBorders>
+              <w:top w:val="single" w:sz="4" w:space="0" w:color="888888"/>
+              <w:bottom w:val="single" w:sz="4" w:space="0" w:color="888888"/>
+              <w:left w:val="single" w:sz="4" w:space="0" w:color="888888"/>
+              <w:right w:val="single" w:sz="4" w:space="0" w:color="888888"/>
+            </w:tcBorders>
+          </w:tcPr>
+          <w:p>
+            <w:pPr>
+              <w:spacing w:before="60" w:after="60" w:line="252" w:lineRule="auto"/>
+              <w:jc w:val="center"/>
+            </w:pPr>
+            <w:r>
+              <w:rPr>
+                <w:rFonts w:ascii="Times New Roman" w:hAnsi="Times New Roman"/>
+                <w:b w:val="0"/>
+                <w:color w:val="B46400"/>
+                <w:sz w:val="17"/>
+              </w:rPr>
+              <w:t>Planned</w:t>
+            </w:r>
+          </w:p>
+        </w:tc>
+        <w:tc>
+          <w:tcPr>
+            <w:tcW w:type="dxa" w:w="1584"/>
+            <w:tcMar>
+              <w:top w:w="80" w:type="dxa"/>
+              <w:bottom w:w="80" w:type="dxa"/>
+              <w:left w:w="100" w:type="dxa"/>
+              <w:right w:w="100" w:type="dxa"/>
+            </w:tcMar>
+            <w:tcBorders>
+              <w:top w:val="single" w:sz="4" w:space="0" w:color="888888"/>
+              <w:bottom w:val="single" w:sz="4" w:space="0" w:color="888888"/>
+              <w:left w:val="single" w:sz="4" w:space="0" w:color="888888"/>
+              <w:right w:val="single" w:sz="4" w:space="0" w:color="888888"/>
+            </w:tcBorders>
+          </w:tcPr>
+          <w:p>
+            <w:pPr>
+              <w:spacing w:before="60" w:after="60" w:line="252" w:lineRule="auto"/>
+              <w:jc w:val="center"/>
+            </w:pPr>
+            <w:r>
+              <w:rPr>
+                <w:rFonts w:ascii="Times New Roman" w:hAnsi="Times New Roman"/>
+                <w:b w:val="0"/>
+                <w:sz w:val="17"/>
+              </w:rPr>
+            </w:r>
+          </w:p>
+        </w:tc>
+      </w:tr>
+    </w:tbl>
+    <w:p>
+      <w:pPr>
+        <w:spacing w:before="120" w:after="160"/>
+      </w:pPr>
+      <w:r>
+        <w:rPr>
+          <w:rFonts w:ascii="Times New Roman" w:hAnsi="Times New Roman"/>
+          <w:i/>
+          <w:sz w:val="17"/>
+        </w:rPr>
+        <w:t>Note: Weeks marked Completed have been verified and signed off by the Project Guide. Remaining weeks will be evaluated upon milestone completion.</w:t>
+      </w:r>
+    </w:p>
+    <w:tbl>
+      <w:tblPr>
+        <w:tblW w:type="auto" w:w="0"/>
+        <w:jc w:val="center"/>
+        <w:tblLook w:firstColumn="1" w:firstRow="1" w:lastColumn="0" w:lastRow="0" w:noHBand="0" w:noVBand="1" w:val="04A0"/>
+      </w:tblPr>
+      <w:tblGrid>
+        <w:gridCol w:w="7483"/>
+        <w:gridCol w:w="7483"/>
+      </w:tblGrid>
+      <w:tr>
+        <w:tc>
+          <w:tcPr>
+            <w:tcW w:type="dxa" w:w="7416"/>
+            <w:tcBorders>
+              <w:top w:val="none"/>
+              <w:bottom w:val="none"/>
+              <w:left w:val="none"/>
+              <w:right w:val="none"/>
+            </w:tcBorders>
+          </w:tcPr>
+          <w:p>
+            <w:pPr>
+              <w:spacing w:before="240"/>
+            </w:pPr>
+            <w:r>
+              <w:rPr>
+                <w:rFonts w:ascii="Times New Roman" w:hAnsi="Times New Roman"/>
+                <w:sz w:val="20"/>
+              </w:rPr>
+              <w:t>Student Signature: _______________________</w:t>
+            </w:r>
+          </w:p>
+        </w:tc>
+        <w:tc>
+          <w:tcPr>
+            <w:tcW w:type="dxa" w:w="7416"/>
+            <w:tcBorders>
+              <w:top w:val="none"/>
+              <w:bottom w:val="none"/>
+              <w:left w:val="none"/>
+              <w:right w:val="none"/>
+            </w:tcBorders>
+          </w:tcPr>
+          <w:p>
+            <w:pPr>
+              <w:spacing w:before="240"/>
+              <w:jc w:val="right"/>
+            </w:pPr>
+            <w:r>
+              <w:rPr>
+                <w:rFonts w:ascii="Times New Roman" w:hAnsi="Times New Roman"/>
+                <w:sz w:val="20"/>
+              </w:rPr>
+              <w:t>Guide Signature: _______________________</w:t>
+            </w:r>
+          </w:p>
+        </w:tc>
+      </w:tr>
+      <w:tr>
+        <w:tc>
+          <w:tcPr>
+            <w:tcW w:type="dxa" w:w="7416"/>
+            <w:tcBorders>
+              <w:top w:val="none"/>
+              <w:bottom w:val="none"/>
+              <w:left w:val="none"/>
+              <w:right w:val="none"/>
+            </w:tcBorders>
+          </w:tcPr>
+          <w:p>
+            <w:pPr>
+              <w:spacing w:before="40"/>
             </w:pPr>
             <w:r>
               <w:rPr>
@@ -472,17 +2526,24 @@
                 <w:b/>
                 <w:sz w:val="20"/>
               </w:rPr>
-              <w:t>Week</w:t>
+              <w:t>Dev Rana Kaila  |  Roll No. 2301531530023</w:t>
             </w:r>
           </w:p>
         </w:tc>
         <w:tc>
           <w:tcPr>
-            <w:tcW w:w="1814" w:type="dxa"/>
+            <w:tcW w:type="dxa" w:w="7416"/>
+            <w:tcBorders>
+              <w:top w:val="none"/>
+              <w:bottom w:val="none"/>
+              <w:left w:val="none"/>
+              <w:right w:val="none"/>
+            </w:tcBorders>
           </w:tcPr>
           <w:p>
             <w:pPr>
-              <w:jc w:val="center"/>
+              <w:spacing w:before="40"/>
+              <w:jc w:val="right"/>
             </w:pPr>
             <w:r>
               <w:rPr>
@@ -490,1138 +2551,15 @@
                 <w:b/>
                 <w:sz w:val="20"/>
               </w:rPr>
-              <w:t>Date Range</w:t>
-            </w:r>
-          </w:p>
-        </w:tc>
-        <w:tc>
-          <w:tcPr>
-            <w:tcW w:w="1984" w:type="dxa"/>
-          </w:tcPr>
-          <w:p>
-            <w:pPr>
-              <w:jc w:val="center"/>
-            </w:pPr>
-            <w:r>
-              <w:rPr>
-                <w:rFonts w:ascii="Times New Roman" w:hAnsi="Times New Roman"/>
-                <w:b/>
-                <w:sz w:val="20"/>
-              </w:rPr>
-              <w:t>Phase / Milestone</w:t>
-            </w:r>
-          </w:p>
-        </w:tc>
-        <w:tc>
-          <w:tcPr>
-            <w:tcW w:w="5953" w:type="dxa"/>
-          </w:tcPr>
-          <w:p>
-            <w:pPr>
-              <w:jc w:val="center"/>
-            </w:pPr>
-            <w:r>
-              <w:rPr>
-                <w:rFonts w:ascii="Times New Roman" w:hAnsi="Times New Roman"/>
-                <w:b/>
-                <w:sz w:val="20"/>
-              </w:rPr>
-              <w:t>Activities &amp; Deliverables</w:t>
-            </w:r>
-          </w:p>
-        </w:tc>
-        <w:tc>
-          <w:tcPr>
-            <w:tcW w:w="1247" w:type="dxa"/>
-          </w:tcPr>
-          <w:p>
-            <w:pPr>
-              <w:jc w:val="center"/>
-            </w:pPr>
-            <w:r>
-              <w:rPr>
-                <w:rFonts w:ascii="Times New Roman" w:hAnsi="Times New Roman"/>
-                <w:b/>
-                <w:sz w:val="20"/>
-              </w:rPr>
-              <w:t>Status</w:t>
-            </w:r>
-          </w:p>
-        </w:tc>
-        <w:tc>
-          <w:tcPr>
-            <w:tcW w:w="1701" w:type="dxa"/>
-          </w:tcPr>
-          <w:p>
-            <w:pPr>
-              <w:jc w:val="center"/>
-            </w:pPr>
-            <w:r>
-              <w:rPr>
-                <w:rFonts w:ascii="Times New Roman" w:hAnsi="Times New Roman"/>
-                <w:b/>
-                <w:sz w:val="20"/>
-              </w:rPr>
-              <w:t>Guide Signature</w:t>
-            </w:r>
-          </w:p>
-        </w:tc>
-      </w:tr>
-      <w:tr>
-        <w:trPr>
-          <w:jc w:val="center"/>
-        </w:trPr>
-        <w:tc>
-          <w:tcPr>
-            <w:tcW w:w="1020" w:type="dxa"/>
-          </w:tcPr>
-          <w:p>
-            <w:pPr>
-              <w:spacing w:before="40" w:after="40"/>
-              <w:jc w:val="center"/>
-            </w:pPr>
-            <w:r>
-              <w:rPr>
-                <w:rFonts w:ascii="Times New Roman" w:hAnsi="Times New Roman"/>
-                <w:b/>
-                <w:sz w:val="18"/>
-              </w:rPr>
-              <w:t>Week 1</w:t>
-            </w:r>
-          </w:p>
-        </w:tc>
-        <w:tc>
-          <w:tcPr>
-            <w:tcW w:w="1814" w:type="dxa"/>
-          </w:tcPr>
-          <w:p>
-            <w:pPr>
-              <w:spacing w:before="40" w:after="40"/>
-            </w:pPr>
-          </w:p>
-        </w:tc>
-        <w:tc>
-          <w:tcPr>
-            <w:tcW w:w="1984" w:type="dxa"/>
-          </w:tcPr>
-          <w:p>
-            <w:pPr>
-              <w:spacing w:before="40" w:after="40"/>
-            </w:pPr>
-            <w:r>
-              <w:rPr>
-                <w:rFonts w:ascii="Times New Roman" w:hAnsi="Times New Roman"/>
-                <w:sz w:val="18"/>
-              </w:rPr>
-              <w:t>Topic Finalisation &amp; Literature Study</w:t>
-            </w:r>
-          </w:p>
-        </w:tc>
-        <w:tc>
-          <w:tcPr>
-            <w:tcW w:w="5953" w:type="dxa"/>
-          </w:tcPr>
-          <w:p>
-            <w:pPr>
-              <w:spacing w:before="40" w:after="40"/>
-            </w:pPr>
-            <w:r>
-              <w:rPr>
-                <w:rFonts w:ascii="Times New Roman" w:hAnsi="Times New Roman"/>
-                <w:sz w:val="18"/>
-              </w:rPr>
-              <w:t xml:space="preserve">Finalised project topic on deepfake detection. Studied 8 research </w:t>
-            </w:r>
-            <w:r>
-              <w:rPr>
-                <w:rFonts w:ascii="Times New Roman" w:hAnsi="Times New Roman"/>
-                <w:sz w:val="18"/>
-              </w:rPr>
-              <w:t>papers (Rossler, Frank, Qian, Afchar, Li, Tan, Selvaraju, Durall). Identified FaceForensics++ and Celeb-DF v2 as benchmark datasets. Set up Python environment: PyTorch, timm, OpenCV, Streamlit.</w:t>
-            </w:r>
-          </w:p>
-        </w:tc>
-        <w:tc>
-          <w:tcPr>
-            <w:tcW w:w="1247" w:type="dxa"/>
-          </w:tcPr>
-          <w:p>
-            <w:pPr>
-              <w:spacing w:before="40" w:after="40"/>
-              <w:jc w:val="center"/>
-            </w:pPr>
-            <w:r>
-              <w:rPr>
-                <w:rFonts w:ascii="Times New Roman" w:hAnsi="Times New Roman"/>
-                <w:sz w:val="18"/>
-              </w:rPr>
-              <w:t>Completed</w:t>
-            </w:r>
-          </w:p>
-        </w:tc>
-        <w:tc>
-          <w:tcPr>
-            <w:tcW w:w="2476" w:type="dxa"/>
-          </w:tcPr>
-          <w:p/>
-        </w:tc>
-      </w:tr>
-      <w:tr>
-        <w:trPr>
-          <w:jc w:val="center"/>
-        </w:trPr>
-        <w:tc>
-          <w:tcPr>
-            <w:tcW w:w="1020" w:type="dxa"/>
-          </w:tcPr>
-          <w:p>
-            <w:pPr>
-              <w:spacing w:before="40" w:after="40"/>
-              <w:jc w:val="center"/>
-            </w:pPr>
-            <w:r>
-              <w:rPr>
-                <w:rFonts w:ascii="Times New Roman" w:hAnsi="Times New Roman"/>
-                <w:b/>
-                <w:sz w:val="18"/>
-              </w:rPr>
-              <w:t>Week 2</w:t>
-            </w:r>
-          </w:p>
-        </w:tc>
-        <w:tc>
-          <w:tcPr>
-            <w:tcW w:w="1814" w:type="dxa"/>
-          </w:tcPr>
-          <w:p>
-            <w:pPr>
-              <w:spacing w:before="40" w:after="40"/>
-            </w:pPr>
-          </w:p>
-        </w:tc>
-        <w:tc>
-          <w:tcPr>
-            <w:tcW w:w="1984" w:type="dxa"/>
-          </w:tcPr>
-          <w:p>
-            <w:pPr>
-              <w:spacing w:before="40" w:after="40"/>
-            </w:pPr>
-            <w:r>
-              <w:rPr>
-                <w:rFonts w:ascii="Times New Roman" w:hAnsi="Times New Roman"/>
-                <w:sz w:val="18"/>
-              </w:rPr>
-              <w:t>Synopsis Preparation</w:t>
-            </w:r>
-          </w:p>
-        </w:tc>
-        <w:tc>
-          <w:tcPr>
-            <w:tcW w:w="5953" w:type="dxa"/>
-          </w:tcPr>
-          <w:p>
-            <w:pPr>
-              <w:spacing w:before="40" w:after="40"/>
-            </w:pPr>
-            <w:r>
-              <w:rPr>
-                <w:rFonts w:ascii="Times New Roman" w:hAnsi="Times New Roman"/>
-                <w:sz w:val="18"/>
-              </w:rPr>
-              <w:t>Prepared formal MINI PROJECT SYNOPSIS in LIET-prescribed format. Defined 6 project objectives. Drafted Literature Survey, Work Plan, Hardware/Software requirements. Submitted draft to Dr. Devendra Gautam for review.</w:t>
-            </w:r>
-          </w:p>
-        </w:tc>
-        <w:tc>
-          <w:tcPr>
-            <w:tcW w:w="1247" w:type="dxa"/>
-          </w:tcPr>
-          <w:p>
-            <w:pPr>
-              <w:spacing w:before="40" w:after="40"/>
-              <w:jc w:val="center"/>
-            </w:pPr>
-          </w:p>
-        </w:tc>
-        <w:tc>
-          <w:tcPr>
-            <w:tcW w:w="2476" w:type="dxa"/>
-          </w:tcPr>
-          <w:p/>
-        </w:tc>
-      </w:tr>
-      <w:tr>
-        <w:trPr>
-          <w:jc w:val="center"/>
-        </w:trPr>
-        <w:tc>
-          <w:tcPr>
-            <w:tcW w:w="1020" w:type="dxa"/>
-          </w:tcPr>
-          <w:p>
-            <w:pPr>
-              <w:spacing w:before="40" w:after="40"/>
-              <w:jc w:val="center"/>
-            </w:pPr>
-            <w:r>
-              <w:rPr>
-                <w:rFonts w:ascii="Times New Roman" w:hAnsi="Times New Roman"/>
-                <w:b/>
-                <w:sz w:val="18"/>
-              </w:rPr>
-              <w:t>Week 3</w:t>
-            </w:r>
-          </w:p>
-        </w:tc>
-        <w:tc>
-          <w:tcPr>
-            <w:tcW w:w="1814" w:type="dxa"/>
-          </w:tcPr>
-          <w:p>
-            <w:pPr>
-              <w:spacing w:before="40" w:after="40"/>
-            </w:pPr>
-          </w:p>
-        </w:tc>
-        <w:tc>
-          <w:tcPr>
-            <w:tcW w:w="1984" w:type="dxa"/>
-          </w:tcPr>
-          <w:p>
-            <w:pPr>
-              <w:spacing w:before="40" w:after="40"/>
-            </w:pPr>
-            <w:r>
-              <w:rPr>
-                <w:rFonts w:ascii="Times New Roman" w:hAnsi="Times New Roman"/>
-                <w:sz w:val="18"/>
-              </w:rPr>
-              <w:t>Synopsis Approval &amp; Architecture Design</w:t>
-            </w:r>
-          </w:p>
-        </w:tc>
-        <w:tc>
-          <w:tcPr>
-            <w:tcW w:w="5953" w:type="dxa"/>
-          </w:tcPr>
-          <w:p>
-            <w:pPr>
-              <w:spacing w:before="40" w:after="40"/>
-            </w:pPr>
-            <w:r>
-              <w:rPr>
-                <w:rFonts w:ascii="Times New Roman" w:hAnsi="Times New Roman"/>
-                <w:sz w:val="18"/>
-              </w:rPr>
-              <w:t>Incorporated mentor feedback. Received synopsis approval. Designed dual-stream pipeline diagram, DFD Level-0 and Level-1. Created GitHub repository: github.com/DevRanaKaila/DeepGuard-AI. Initial commit with project s</w:t>
-            </w:r>
-            <w:r>
-              <w:rPr>
-                <w:rFonts w:ascii="Times New Roman" w:hAnsi="Times New Roman"/>
-                <w:sz w:val="18"/>
-              </w:rPr>
-              <w:t>tructure.</w:t>
-            </w:r>
-          </w:p>
-        </w:tc>
-        <w:tc>
-          <w:tcPr>
-            <w:tcW w:w="1247" w:type="dxa"/>
-          </w:tcPr>
-          <w:p>
-            <w:pPr>
-              <w:spacing w:before="40" w:after="40"/>
-              <w:jc w:val="center"/>
-            </w:pPr>
-          </w:p>
-        </w:tc>
-        <w:tc>
-          <w:tcPr>
-            <w:tcW w:w="2476" w:type="dxa"/>
-          </w:tcPr>
-          <w:p/>
-        </w:tc>
-      </w:tr>
-      <w:tr>
-        <w:trPr>
-          <w:jc w:val="center"/>
-        </w:trPr>
-        <w:tc>
-          <w:tcPr>
-            <w:tcW w:w="1020" w:type="dxa"/>
-          </w:tcPr>
-          <w:p>
-            <w:pPr>
-              <w:spacing w:before="40" w:after="40"/>
-              <w:jc w:val="center"/>
-            </w:pPr>
-            <w:r>
-              <w:rPr>
-                <w:rFonts w:ascii="Times New Roman" w:hAnsi="Times New Roman"/>
-                <w:b/>
-                <w:sz w:val="18"/>
-              </w:rPr>
-              <w:t>Week 4</w:t>
-            </w:r>
-          </w:p>
-        </w:tc>
-        <w:tc>
-          <w:tcPr>
-            <w:tcW w:w="1814" w:type="dxa"/>
-          </w:tcPr>
-          <w:p>
-            <w:pPr>
-              <w:spacing w:before="40" w:after="40"/>
-            </w:pPr>
-          </w:p>
-        </w:tc>
-        <w:tc>
-          <w:tcPr>
-            <w:tcW w:w="1984" w:type="dxa"/>
-          </w:tcPr>
-          <w:p>
-            <w:pPr>
-              <w:spacing w:before="40" w:after="40"/>
-            </w:pPr>
-            <w:r>
-              <w:rPr>
-                <w:rFonts w:ascii="Times New Roman" w:hAnsi="Times New Roman"/>
-                <w:sz w:val="18"/>
-              </w:rPr>
-              <w:t>Dataset Curation &amp; Preprocessing Pipeline</w:t>
-            </w:r>
-          </w:p>
-        </w:tc>
-        <w:tc>
-          <w:tcPr>
-            <w:tcW w:w="5953" w:type="dxa"/>
-          </w:tcPr>
-          <w:p>
-            <w:pPr>
-              <w:spacing w:before="40" w:after="40"/>
-            </w:pPr>
-            <w:r>
-              <w:rPr>
-                <w:rFonts w:ascii="Times New Roman" w:hAnsi="Times New Roman"/>
-                <w:sz w:val="18"/>
-              </w:rPr>
-              <w:t xml:space="preserve">Set up FaceForensics++ dataset structure. Implemented video frame extraction at 5 FPS using OpenCV. Integrated MTCNN for face detection with 15% boundary margin. </w:t>
-            </w:r>
-            <w:r>
-              <w:rPr>
-                <w:rFonts w:ascii="Times New Roman" w:hAnsi="Times New Roman"/>
-                <w:sz w:val="18"/>
-              </w:rPr>
-              <w:t>Verified preprocessing pipeline on 50 sample videos. Created src/data/ module.</w:t>
-            </w:r>
-          </w:p>
-        </w:tc>
-        <w:tc>
-          <w:tcPr>
-            <w:tcW w:w="1247" w:type="dxa"/>
-          </w:tcPr>
-          <w:p>
-            <w:pPr>
-              <w:spacing w:before="40" w:after="40"/>
-              <w:jc w:val="center"/>
-            </w:pPr>
-          </w:p>
-        </w:tc>
-        <w:tc>
-          <w:tcPr>
-            <w:tcW w:w="2476" w:type="dxa"/>
-          </w:tcPr>
-          <w:p/>
-        </w:tc>
-      </w:tr>
-      <w:tr>
-        <w:trPr>
-          <w:jc w:val="center"/>
-        </w:trPr>
-        <w:tc>
-          <w:tcPr>
-            <w:tcW w:w="1020" w:type="dxa"/>
-          </w:tcPr>
-          <w:p>
-            <w:pPr>
-              <w:spacing w:before="40" w:after="40"/>
-              <w:jc w:val="center"/>
-            </w:pPr>
-            <w:r>
-              <w:rPr>
-                <w:rFonts w:ascii="Times New Roman" w:hAnsi="Times New Roman"/>
-                <w:b/>
-                <w:sz w:val="18"/>
-              </w:rPr>
-              <w:t>Week 5</w:t>
-            </w:r>
-          </w:p>
-        </w:tc>
-        <w:tc>
-          <w:tcPr>
-            <w:tcW w:w="1814" w:type="dxa"/>
-          </w:tcPr>
-          <w:p>
-            <w:pPr>
-              <w:spacing w:before="40" w:after="40"/>
-            </w:pPr>
-          </w:p>
-        </w:tc>
-        <w:tc>
-          <w:tcPr>
-            <w:tcW w:w="1984" w:type="dxa"/>
-          </w:tcPr>
-          <w:p>
-            <w:pPr>
-              <w:spacing w:before="40" w:after="40"/>
-            </w:pPr>
-            <w:r>
-              <w:rPr>
-                <w:rFonts w:ascii="Times New Roman" w:hAnsi="Times New Roman"/>
-                <w:sz w:val="18"/>
-              </w:rPr>
-              <w:t>Spatial Stream Implementation</w:t>
-            </w:r>
-          </w:p>
-        </w:tc>
-        <w:tc>
-          <w:tcPr>
-            <w:tcW w:w="5953" w:type="dxa"/>
-          </w:tcPr>
-          <w:p>
-            <w:pPr>
-              <w:spacing w:before="40" w:after="40"/>
-            </w:pPr>
-            <w:r>
-              <w:rPr>
-                <w:rFonts w:ascii="Times New Roman" w:hAnsi="Times New Roman"/>
-                <w:sz w:val="18"/>
-              </w:rPr>
-              <w:t>Integrated EfficientNet-B4 backbone via timm (pretrained ImageNet). Implemented SpatialStream module in src/m</w:t>
-            </w:r>
-            <w:r>
-              <w:rPr>
-                <w:rFonts w:ascii="Times New Roman" w:hAnsi="Times New Roman"/>
-                <w:sz w:val="18"/>
-              </w:rPr>
-              <w:t>odels/spatial_stream.py. Validated 1792-d feature vector output and gradient flow. Spatial-only baseline achieves 82% accuracy.</w:t>
-            </w:r>
-          </w:p>
-        </w:tc>
-        <w:tc>
-          <w:tcPr>
-            <w:tcW w:w="1247" w:type="dxa"/>
-          </w:tcPr>
-          <w:p>
-            <w:pPr>
-              <w:spacing w:before="40" w:after="40"/>
-              <w:jc w:val="center"/>
-            </w:pPr>
-          </w:p>
-        </w:tc>
-        <w:tc>
-          <w:tcPr>
-            <w:tcW w:w="2476" w:type="dxa"/>
-          </w:tcPr>
-          <w:p/>
-        </w:tc>
-      </w:tr>
-      <w:tr>
-        <w:trPr>
-          <w:jc w:val="center"/>
-        </w:trPr>
-        <w:tc>
-          <w:tcPr>
-            <w:tcW w:w="1020" w:type="dxa"/>
-          </w:tcPr>
-          <w:p>
-            <w:pPr>
-              <w:spacing w:before="40" w:after="40"/>
-              <w:jc w:val="center"/>
-            </w:pPr>
-            <w:r>
-              <w:rPr>
-                <w:rFonts w:ascii="Times New Roman" w:hAnsi="Times New Roman"/>
-                <w:b/>
-                <w:sz w:val="18"/>
-              </w:rPr>
-              <w:t>Week 6</w:t>
-            </w:r>
-          </w:p>
-        </w:tc>
-        <w:tc>
-          <w:tcPr>
-            <w:tcW w:w="1814" w:type="dxa"/>
-          </w:tcPr>
-          <w:p>
-            <w:pPr>
-              <w:spacing w:before="40" w:after="40"/>
-            </w:pPr>
-          </w:p>
-        </w:tc>
-        <w:tc>
-          <w:tcPr>
-            <w:tcW w:w="1984" w:type="dxa"/>
-          </w:tcPr>
-          <w:p>
-            <w:pPr>
-              <w:spacing w:before="40" w:after="40"/>
-            </w:pPr>
-            <w:r>
-              <w:rPr>
-                <w:rFonts w:ascii="Times New Roman" w:hAnsi="Times New Roman"/>
-                <w:sz w:val="18"/>
-              </w:rPr>
-              <w:t>DCT Transform &amp; Mid-Term Review</w:t>
-            </w:r>
-          </w:p>
-        </w:tc>
-        <w:tc>
-          <w:tcPr>
-            <w:tcW w:w="5953" w:type="dxa"/>
-          </w:tcPr>
-          <w:p>
-            <w:pPr>
-              <w:spacing w:before="40" w:after="40"/>
-            </w:pPr>
-            <w:r>
-              <w:rPr>
-                <w:rFonts w:ascii="Times New Roman" w:hAnsi="Times New Roman"/>
-                <w:sz w:val="18"/>
-              </w:rPr>
-              <w:t xml:space="preserve">Implemented 2D-DCT-II transform and Radial Azimuthal </w:t>
-            </w:r>
-            <w:r>
-              <w:rPr>
-                <w:rFonts w:ascii="Times New Roman" w:hAnsi="Times New Roman"/>
-                <w:sz w:val="18"/>
-              </w:rPr>
-              <w:t>Spectrum A(r) in src/data/dct_transform.py. Demonstrated spatial pipeline to mentor. Prepared mid-term progress report. Frequency stream CNN prototype initiated.</w:t>
-            </w:r>
-          </w:p>
-        </w:tc>
-        <w:tc>
-          <w:tcPr>
-            <w:tcW w:w="1247" w:type="dxa"/>
-          </w:tcPr>
-          <w:p>
-            <w:pPr>
-              <w:spacing w:before="40" w:after="40"/>
-              <w:jc w:val="center"/>
-            </w:pPr>
-          </w:p>
-        </w:tc>
-        <w:tc>
-          <w:tcPr>
-            <w:tcW w:w="2476" w:type="dxa"/>
-          </w:tcPr>
-          <w:p/>
-        </w:tc>
-      </w:tr>
-      <w:tr>
-        <w:trPr>
-          <w:jc w:val="center"/>
-        </w:trPr>
-        <w:tc>
-          <w:tcPr>
-            <w:tcW w:w="1020" w:type="dxa"/>
-          </w:tcPr>
-          <w:p>
-            <w:pPr>
-              <w:spacing w:before="40" w:after="40"/>
-              <w:jc w:val="center"/>
-            </w:pPr>
-            <w:r>
-              <w:rPr>
-                <w:rFonts w:ascii="Times New Roman" w:hAnsi="Times New Roman"/>
-                <w:b/>
-                <w:sz w:val="18"/>
-              </w:rPr>
-              <w:lastRenderedPageBreak/>
-              <w:t>Week 7</w:t>
-            </w:r>
-          </w:p>
-        </w:tc>
-        <w:tc>
-          <w:tcPr>
-            <w:tcW w:w="1814" w:type="dxa"/>
-          </w:tcPr>
-          <w:p>
-            <w:pPr>
-              <w:spacing w:before="40" w:after="40"/>
-            </w:pPr>
-          </w:p>
-        </w:tc>
-        <w:tc>
-          <w:tcPr>
-            <w:tcW w:w="1984" w:type="dxa"/>
-          </w:tcPr>
-          <w:p>
-            <w:pPr>
-              <w:spacing w:before="40" w:after="40"/>
-            </w:pPr>
-            <w:r>
-              <w:rPr>
-                <w:rFonts w:ascii="Times New Roman" w:hAnsi="Times New Roman"/>
-                <w:sz w:val="18"/>
-              </w:rPr>
-              <w:t>Frequency Stream &amp; Fusion Module</w:t>
-            </w:r>
-          </w:p>
-        </w:tc>
-        <w:tc>
-          <w:tcPr>
-            <w:tcW w:w="5953" w:type="dxa"/>
-          </w:tcPr>
-          <w:p>
-            <w:pPr>
-              <w:spacing w:before="40" w:after="40"/>
-            </w:pPr>
-            <w:r>
-              <w:rPr>
-                <w:rFonts w:ascii="Times New Roman" w:hAnsi="Times New Roman"/>
-                <w:sz w:val="18"/>
-              </w:rPr>
-              <w:t>Implement 4-stage Spectral-</w:t>
-            </w:r>
-            <w:r>
-              <w:rPr>
-                <w:rFonts w:ascii="Times New Roman" w:hAnsi="Times New Roman"/>
-                <w:sz w:val="18"/>
-              </w:rPr>
-              <w:t>CNN (src/models/frequency_stream.py). Implement attention-gated bilinear fusion (src/models/fusion.py). Complete DualStreamNet integration. Begin full training on FF++ c23 split.</w:t>
-            </w:r>
-          </w:p>
-        </w:tc>
-        <w:tc>
-          <w:tcPr>
-            <w:tcW w:w="1247" w:type="dxa"/>
-          </w:tcPr>
-          <w:p>
-            <w:pPr>
-              <w:spacing w:before="40" w:after="40"/>
-              <w:jc w:val="center"/>
-            </w:pPr>
-          </w:p>
-        </w:tc>
-        <w:tc>
-          <w:tcPr>
-            <w:tcW w:w="2476" w:type="dxa"/>
-          </w:tcPr>
-          <w:p/>
-        </w:tc>
-      </w:tr>
-      <w:tr>
-        <w:trPr>
-          <w:jc w:val="center"/>
-        </w:trPr>
-        <w:tc>
-          <w:tcPr>
-            <w:tcW w:w="1020" w:type="dxa"/>
-          </w:tcPr>
-          <w:p>
-            <w:pPr>
-              <w:spacing w:before="40" w:after="40"/>
-              <w:jc w:val="center"/>
-            </w:pPr>
-            <w:r>
-              <w:rPr>
-                <w:rFonts w:ascii="Times New Roman" w:hAnsi="Times New Roman"/>
-                <w:b/>
-                <w:sz w:val="18"/>
-              </w:rPr>
-              <w:t>Week 8</w:t>
-            </w:r>
-          </w:p>
-        </w:tc>
-        <w:tc>
-          <w:tcPr>
-            <w:tcW w:w="1814" w:type="dxa"/>
-          </w:tcPr>
-          <w:p>
-            <w:pPr>
-              <w:spacing w:before="40" w:after="40"/>
-            </w:pPr>
-          </w:p>
-        </w:tc>
-        <w:tc>
-          <w:tcPr>
-            <w:tcW w:w="1984" w:type="dxa"/>
-          </w:tcPr>
-          <w:p>
-            <w:pPr>
-              <w:spacing w:before="40" w:after="40"/>
-            </w:pPr>
-            <w:r>
-              <w:rPr>
-                <w:rFonts w:ascii="Times New Roman" w:hAnsi="Times New Roman"/>
-                <w:sz w:val="18"/>
-              </w:rPr>
-              <w:t>Dashboard, Grad-CAM &amp; Testing</w:t>
-            </w:r>
-          </w:p>
-        </w:tc>
-        <w:tc>
-          <w:tcPr>
-            <w:tcW w:w="5953" w:type="dxa"/>
-          </w:tcPr>
-          <w:p>
-            <w:pPr>
-              <w:spacing w:before="40" w:after="40"/>
-            </w:pPr>
-            <w:r>
-              <w:rPr>
-                <w:rFonts w:ascii="Times New Roman" w:hAnsi="Times New Roman"/>
-                <w:sz w:val="18"/>
-              </w:rPr>
-              <w:t xml:space="preserve">Develop </w:t>
-            </w:r>
-            <w:r>
-              <w:rPr>
-                <w:rFonts w:ascii="Times New Roman" w:hAnsi="Times New Roman"/>
-                <w:sz w:val="18"/>
-              </w:rPr>
-              <w:t>Streamlit web dashboard (app.py). Implement Grad-CAM heatmap generator (src/utils/gradcam.py). End-to-end pipeline integration. Cross-dataset testing on Celeb-DF v2. Benchmark against XceptionNet and F3-Net.</w:t>
-            </w:r>
-          </w:p>
-        </w:tc>
-        <w:tc>
-          <w:tcPr>
-            <w:tcW w:w="1247" w:type="dxa"/>
-          </w:tcPr>
-          <w:p>
-            <w:pPr>
-              <w:spacing w:before="40" w:after="40"/>
-              <w:jc w:val="center"/>
-            </w:pPr>
-          </w:p>
-        </w:tc>
-        <w:tc>
-          <w:tcPr>
-            <w:tcW w:w="2476" w:type="dxa"/>
-          </w:tcPr>
-          <w:p/>
-        </w:tc>
-      </w:tr>
-      <w:tr>
-        <w:trPr>
-          <w:jc w:val="center"/>
-        </w:trPr>
-        <w:tc>
-          <w:tcPr>
-            <w:tcW w:w="1020" w:type="dxa"/>
-          </w:tcPr>
-          <w:p>
-            <w:pPr>
-              <w:spacing w:before="40" w:after="40"/>
-              <w:jc w:val="center"/>
-            </w:pPr>
-            <w:r>
-              <w:rPr>
-                <w:rFonts w:ascii="Times New Roman" w:hAnsi="Times New Roman"/>
-                <w:b/>
-                <w:sz w:val="18"/>
-              </w:rPr>
-              <w:t>Week 9</w:t>
-            </w:r>
-          </w:p>
-        </w:tc>
-        <w:tc>
-          <w:tcPr>
-            <w:tcW w:w="1814" w:type="dxa"/>
-          </w:tcPr>
-          <w:p>
-            <w:pPr>
-              <w:spacing w:before="40" w:after="40"/>
-            </w:pPr>
-          </w:p>
-        </w:tc>
-        <w:tc>
-          <w:tcPr>
-            <w:tcW w:w="1984" w:type="dxa"/>
-          </w:tcPr>
-          <w:p>
-            <w:pPr>
-              <w:spacing w:before="40" w:after="40"/>
-            </w:pPr>
-            <w:r>
-              <w:rPr>
-                <w:rFonts w:ascii="Times New Roman" w:hAnsi="Times New Roman"/>
-                <w:sz w:val="18"/>
-              </w:rPr>
-              <w:t>Report Writ</w:t>
-            </w:r>
-            <w:r>
-              <w:rPr>
-                <w:rFonts w:ascii="Times New Roman" w:hAnsi="Times New Roman"/>
-                <w:sz w:val="18"/>
-              </w:rPr>
-              <w:t>ing &amp; Code Finalization</w:t>
-            </w:r>
-          </w:p>
-        </w:tc>
-        <w:tc>
-          <w:tcPr>
-            <w:tcW w:w="5953" w:type="dxa"/>
-          </w:tcPr>
-          <w:p>
-            <w:pPr>
-              <w:spacing w:before="40" w:after="40"/>
-            </w:pPr>
-            <w:r>
-              <w:rPr>
-                <w:rFonts w:ascii="Times New Roman" w:hAnsi="Times New Roman"/>
-                <w:sz w:val="18"/>
-              </w:rPr>
-              <w:t>Draft complete 60+ page project report. Conduct ablation study (spatial-only vs. dual-stream). Run plagiarism check (Turnitin &lt;20%). Finalize GitHub repo with full documentation and README.</w:t>
-            </w:r>
-          </w:p>
-        </w:tc>
-        <w:tc>
-          <w:tcPr>
-            <w:tcW w:w="1247" w:type="dxa"/>
-          </w:tcPr>
-          <w:p>
-            <w:pPr>
-              <w:spacing w:before="40" w:after="40"/>
-              <w:jc w:val="center"/>
-            </w:pPr>
-          </w:p>
-        </w:tc>
-        <w:tc>
-          <w:tcPr>
-            <w:tcW w:w="2476" w:type="dxa"/>
-          </w:tcPr>
-          <w:p/>
-        </w:tc>
-      </w:tr>
-      <w:tr>
-        <w:trPr>
-          <w:jc w:val="center"/>
-        </w:trPr>
-        <w:tc>
-          <w:tcPr>
-            <w:tcW w:w="1020" w:type="dxa"/>
-          </w:tcPr>
-          <w:p>
-            <w:pPr>
-              <w:spacing w:before="40" w:after="40"/>
-              <w:jc w:val="center"/>
-            </w:pPr>
-            <w:r>
-              <w:rPr>
-                <w:rFonts w:ascii="Times New Roman" w:hAnsi="Times New Roman"/>
-                <w:b/>
-                <w:sz w:val="18"/>
-              </w:rPr>
-              <w:t>Week 10</w:t>
-            </w:r>
-          </w:p>
-        </w:tc>
-        <w:tc>
-          <w:tcPr>
-            <w:tcW w:w="1814" w:type="dxa"/>
-          </w:tcPr>
-          <w:p>
-            <w:pPr>
-              <w:spacing w:before="40" w:after="40"/>
-            </w:pPr>
-          </w:p>
-        </w:tc>
-        <w:tc>
-          <w:tcPr>
-            <w:tcW w:w="1984" w:type="dxa"/>
-          </w:tcPr>
-          <w:p>
-            <w:pPr>
-              <w:spacing w:before="40" w:after="40"/>
-            </w:pPr>
-            <w:r>
-              <w:rPr>
-                <w:rFonts w:ascii="Times New Roman" w:hAnsi="Times New Roman"/>
-                <w:sz w:val="18"/>
-              </w:rPr>
-              <w:t>Final S</w:t>
-            </w:r>
-            <w:r>
-              <w:rPr>
-                <w:rFonts w:ascii="Times New Roman" w:hAnsi="Times New Roman"/>
-                <w:sz w:val="18"/>
-              </w:rPr>
-              <w:t>ubmission &amp; Viva Defense</w:t>
-            </w:r>
-          </w:p>
-        </w:tc>
-        <w:tc>
-          <w:tcPr>
-            <w:tcW w:w="5953" w:type="dxa"/>
-          </w:tcPr>
-          <w:p>
-            <w:pPr>
-              <w:spacing w:before="40" w:after="40"/>
-            </w:pPr>
-            <w:r>
-              <w:rPr>
-                <w:rFonts w:ascii="Times New Roman" w:hAnsi="Times New Roman"/>
-                <w:sz w:val="18"/>
-              </w:rPr>
-              <w:t>Spiral-bind project report. Prepare 11-slide viva presentation. Live demo of Streamlit dashboard with real and fake test videos. Final submission to Dr. Devendra Gautam. Panel Q&amp;A defense.</w:t>
-            </w:r>
-          </w:p>
-        </w:tc>
-        <w:tc>
-          <w:tcPr>
-            <w:tcW w:w="1247" w:type="dxa"/>
-          </w:tcPr>
-          <w:p>
-            <w:pPr>
-              <w:spacing w:before="40" w:after="40"/>
-              <w:jc w:val="center"/>
-            </w:pPr>
-          </w:p>
-        </w:tc>
-        <w:tc>
-          <w:tcPr>
-            <w:tcW w:w="2476" w:type="dxa"/>
-          </w:tcPr>
-          <w:p/>
-        </w:tc>
-      </w:tr>
-    </w:tbl>
-    <w:p/>
-    <w:p>
-      <w:pPr>
-        <w:spacing w:before="40" w:after="80"/>
-      </w:pPr>
-      <w:r>
-        <w:rPr>
-          <w:rFonts w:ascii="Times New Roman" w:hAnsi="Times New Roman"/>
-          <w:sz w:val="20"/>
-        </w:rPr>
-        <w:t xml:space="preserve">Note: Weeks marked Completed </w:t>
-      </w:r>
-      <w:r>
-        <w:rPr>
-          <w:rFonts w:ascii="Times New Roman" w:hAnsi="Times New Roman"/>
-          <w:sz w:val="20"/>
-        </w:rPr>
-        <w:t>have been signed by the Project Guide. Remaining weeks will be signed upon completion of respective activities.</w:t>
-      </w:r>
-    </w:p>
-    <w:tbl>
-      <w:tblPr>
-        <w:tblW w:w="0" w:type="auto"/>
-        <w:jc w:val="center"/>
-        <w:tblLook w:val="04A0"/>
-      </w:tblPr>
-      <w:tblGrid>
-        <w:gridCol w:w="7427"/>
-        <w:gridCol w:w="7427"/>
-      </w:tblGrid>
-      <w:tr>
-        <w:trPr>
-          <w:jc w:val="center"/>
-        </w:trPr>
-        <w:tc>
-          <w:tcPr>
-            <w:tcW w:w="7427" w:type="dxa"/>
-          </w:tcPr>
-          <w:p/>
-        </w:tc>
-        <w:tc>
-          <w:tcPr>
-            <w:tcW w:w="7427" w:type="dxa"/>
-          </w:tcPr>
-          <w:p>
-            <w:pPr>
-              <w:jc w:val="right"/>
-            </w:pPr>
-          </w:p>
-        </w:tc>
-      </w:tr>
-      <w:tr>
-        <w:trPr>
-          <w:jc w:val="center"/>
-        </w:trPr>
-        <w:tc>
-          <w:tcPr>
-            <w:tcW w:w="7427" w:type="dxa"/>
-          </w:tcPr>
-          <w:p>
-            <w:r>
-              <w:rPr>
-                <w:rFonts w:ascii="Times New Roman" w:hAnsi="Times New Roman"/>
-              </w:rPr>
-              <w:t>Student Signature: _______________________</w:t>
-            </w:r>
-          </w:p>
-        </w:tc>
-        <w:tc>
-          <w:tcPr>
-            <w:tcW w:w="7427" w:type="dxa"/>
-          </w:tcPr>
-          <w:p>
-            <w:pPr>
-              <w:jc w:val="right"/>
-            </w:pPr>
-            <w:r>
-              <w:rPr>
-                <w:rFonts w:ascii="Times New Roman" w:hAnsi="Times New Roman"/>
-              </w:rPr>
-              <w:t>Guide Signature: _______________________</w:t>
-            </w:r>
-          </w:p>
-        </w:tc>
-      </w:tr>
-      <w:tr>
-        <w:trPr>
-          <w:jc w:val="center"/>
-        </w:trPr>
-        <w:tc>
-          <w:tcPr>
-            <w:tcW w:w="7427" w:type="dxa"/>
-          </w:tcPr>
-          <w:p>
-            <w:r>
-              <w:rPr>
-                <w:rFonts w:ascii="Times New Roman" w:hAnsi="Times New Roman"/>
-                <w:b/>
-              </w:rPr>
-              <w:t>Dev Rana Kaila  |  Roll No. 2301531530023</w:t>
-            </w:r>
-          </w:p>
-        </w:tc>
-        <w:tc>
-          <w:tcPr>
-            <w:tcW w:w="7427" w:type="dxa"/>
-          </w:tcPr>
-          <w:p>
-            <w:pPr>
-              <w:jc w:val="right"/>
-            </w:pPr>
-            <w:r>
-              <w:rPr>
-                <w:rFonts w:ascii="Times New Roman" w:hAnsi="Times New Roman"/>
-                <w:b/>
-              </w:rPr>
-              <w:t xml:space="preserve">Dr. Devendra </w:t>
-            </w:r>
-            <w:r>
-              <w:rPr>
-                <w:rFonts w:ascii="Times New Roman" w:hAnsi="Times New Roman"/>
-                <w:b/>
-              </w:rPr>
-              <w:t>Gautam  |  Assoc. Professor, CSE</w:t>
+              <w:t>Dr. Devendra Gautam  |  Assoc. Professor, CSE</w:t>
             </w:r>
           </w:p>
         </w:tc>
       </w:tr>
     </w:tbl>
-    <w:p/>
     <w:sectPr>
-      <w:pgSz w:w="16838" w:h="11906"/>
-      <w:pgMar w:top="1134" w:right="850" w:bottom="850" w:left="1134" w:header="720" w:footer="720" w:gutter="0"/>
+      <w:pgSz w:w="16838" w:h="11906" w:orient="landscape"/>
+      <w:pgMar w:top="720" w:right="864" w:bottom="720" w:left="1008" w:header="720" w:footer="720" w:gutter="0"/>
       <w:cols w:space="720"/>
       <w:docGrid w:linePitch="360"/>
     </w:sectPr>
@@ -1630,7 +2568,7 @@
 </file>
 
 <file path=word/numbering.xml><?xml version="1.0" encoding="utf-8"?>
-<w:numbering xmlns:ve="http://schemas.openxmlformats.org/markup-compatibility/2006" xmlns:o="urn:schemas-microsoft-com:office:office" xmlns:r="http://schemas.openxmlformats.org/officeDocument/2006/relationships" xmlns:m="http://schemas.openxmlformats.org/officeDocument/2006/math" xmlns:v="urn:schemas-microsoft-com:vml" xmlns:wp="http://schemas.openxmlformats.org/drawingml/2006/wordprocessingDrawing" xmlns:w10="urn:schemas-microsoft-com:office:word" xmlns:w="http://schemas.openxmlformats.org/wordprocessingml/2006/main" xmlns:wne="http://schemas.microsoft.com/office/word/2006/wordml">
+<w:numbering xmlns:wpc="http://schemas.microsoft.com/office/word/2010/wordprocessingCanvas" xmlns:mo="http://schemas.microsoft.com/office/mac/office/2008/main" xmlns:mc="http://schemas.openxmlformats.org/markup-compatibility/2006" xmlns:mv="urn:schemas-microsoft-com:mac:vml" xmlns:o="urn:schemas-microsoft-com:office:office" xmlns:r="http://schemas.openxmlformats.org/officeDocument/2006/relationships" xmlns:m="http://schemas.openxmlformats.org/officeDocument/2006/math" xmlns:v="urn:schemas-microsoft-com:vml" xmlns:wp14="http://schemas.microsoft.com/office/word/2010/wordprocessingDrawing" xmlns:wp="http://schemas.openxmlformats.org/drawingml/2006/wordprocessingDrawing" xmlns:w10="urn:schemas-microsoft-com:office:word" xmlns:w="http://schemas.openxmlformats.org/wordprocessingml/2006/main" xmlns:w14="http://schemas.microsoft.com/office/word/2010/wordml" xmlns:wpg="http://schemas.microsoft.com/office/word/2010/wordprocessingGroup" xmlns:wpi="http://schemas.microsoft.com/office/word/2010/wordprocessingInk" xmlns:wne="http://schemas.microsoft.com/office/word/2006/wordml" xmlns:wps="http://schemas.microsoft.com/office/word/2010/wordprocessingShape" mc:Ignorable="w14 wp14">
   <w:abstractNum w:abstractNumId="0">
     <w:nsid w:val="FFFFFF7C"/>
     <w:multiLevelType w:val="singleLevel"/>
@@ -1833,7 +2771,7 @@
 </file>
 
 <file path=word/styles.xml><?xml version="1.0" encoding="utf-8"?>
-<w:styles xmlns:r="http://schemas.openxmlformats.org/officeDocument/2006/relationships" xmlns:w="http://schemas.openxmlformats.org/wordprocessingml/2006/main">
+<w:styles xmlns:mc="http://schemas.openxmlformats.org/markup-compatibility/2006" xmlns:r="http://schemas.openxmlformats.org/officeDocument/2006/relationships" xmlns:w="http://schemas.openxmlformats.org/wordprocessingml/2006/main" xmlns:w14="http://schemas.microsoft.com/office/word/2010/wordml" mc:Ignorable="w14">
   <w:docDefaults>
     <w:rPrDefault>
       <w:rPr>
@@ -1849,7 +2787,7 @@
       </w:pPr>
     </w:pPrDefault>
   </w:docDefaults>
-  <w:latentStyles w:defLockedState="0" w:defUIPriority="99" w:defSemiHidden="1" w:defUnhideWhenUsed="1" w:defQFormat="0" w:count="267">
+  <w:latentStyles w:defLockedState="0" w:defUIPriority="99" w:defSemiHidden="1" w:defUnhideWhenUsed="1" w:defQFormat="0" w:count="276">
     <w:lsdException w:name="Normal" w:semiHidden="0" w:uiPriority="0" w:unhideWhenUsed="0" w:qFormat="1"/>
     <w:lsdException w:name="heading 1" w:semiHidden="0" w:uiPriority="9" w:unhideWhenUsed="0" w:qFormat="1"/>
     <w:lsdException w:name="heading 2" w:uiPriority="9" w:qFormat="1"/>
@@ -1993,6 +2931,50 @@
     <w:qFormat/>
     <w:rsid w:val="00FC693F"/>
   </w:style>
+  <w:style w:type="paragraph" w:styleId="Header">
+    <w:name w:val="header"/>
+    <w:basedOn w:val="Normal"/>
+    <w:link w:val="HeaderChar"/>
+    <w:uiPriority w:val="99"/>
+    <w:unhideWhenUsed/>
+    <w:rsid w:val="00E618BF"/>
+    <w:pPr>
+      <w:tabs>
+        <w:tab w:val="center" w:pos="4680"/>
+        <w:tab w:val="right" w:pos="9360"/>
+      </w:tabs>
+      <w:spacing w:after="0" w:line="240" w:lineRule="auto"/>
+    </w:pPr>
+  </w:style>
+  <w:style w:type="character" w:customStyle="1" w:styleId="HeaderChar">
+    <w:name w:val="Header Char"/>
+    <w:basedOn w:val="DefaultParagraphFont"/>
+    <w:link w:val="Header"/>
+    <w:uiPriority w:val="99"/>
+    <w:rsid w:val="00E618BF"/>
+  </w:style>
+  <w:style w:type="paragraph" w:styleId="Footer">
+    <w:name w:val="footer"/>
+    <w:basedOn w:val="Normal"/>
+    <w:link w:val="FooterChar"/>
+    <w:uiPriority w:val="99"/>
+    <w:unhideWhenUsed/>
+    <w:rsid w:val="00E618BF"/>
+    <w:pPr>
+      <w:tabs>
+        <w:tab w:val="center" w:pos="4680"/>
+        <w:tab w:val="right" w:pos="9360"/>
+      </w:tabs>
+      <w:spacing w:after="0" w:line="240" w:lineRule="auto"/>
+    </w:pPr>
+  </w:style>
+  <w:style w:type="character" w:customStyle="1" w:styleId="FooterChar">
+    <w:name w:val="Footer Char"/>
+    <w:basedOn w:val="DefaultParagraphFont"/>
+    <w:link w:val="Footer"/>
+    <w:uiPriority w:val="99"/>
+    <w:rsid w:val="00E618BF"/>
+  </w:style>
   <w:style w:type="paragraph" w:styleId="Heading1">
     <w:name w:val="heading 1"/>
     <w:basedOn w:val="Normal"/>
@@ -2213,7 +3195,6 @@
     <w:uiPriority w:val="99"/>
     <w:semiHidden/>
     <w:unhideWhenUsed/>
-    <w:qFormat/>
     <w:tblPr>
       <w:tblInd w:w="0" w:type="dxa"/>
       <w:tblCellMar>
@@ -2229,50 +3210,6 @@
     <w:uiPriority w:val="99"/>
     <w:semiHidden/>
     <w:unhideWhenUsed/>
-  </w:style>
-  <w:style w:type="paragraph" w:styleId="Header">
-    <w:name w:val="header"/>
-    <w:basedOn w:val="Normal"/>
-    <w:link w:val="HeaderChar"/>
-    <w:uiPriority w:val="99"/>
-    <w:unhideWhenUsed/>
-    <w:rsid w:val="00E618BF"/>
-    <w:pPr>
-      <w:tabs>
-        <w:tab w:val="center" w:pos="4680"/>
-        <w:tab w:val="right" w:pos="9360"/>
-      </w:tabs>
-      <w:spacing w:after="0" w:line="240" w:lineRule="auto"/>
-    </w:pPr>
-  </w:style>
-  <w:style w:type="character" w:customStyle="1" w:styleId="HeaderChar">
-    <w:name w:val="Header Char"/>
-    <w:basedOn w:val="DefaultParagraphFont"/>
-    <w:link w:val="Header"/>
-    <w:uiPriority w:val="99"/>
-    <w:rsid w:val="00E618BF"/>
-  </w:style>
-  <w:style w:type="paragraph" w:styleId="Footer">
-    <w:name w:val="footer"/>
-    <w:basedOn w:val="Normal"/>
-    <w:link w:val="FooterChar"/>
-    <w:uiPriority w:val="99"/>
-    <w:unhideWhenUsed/>
-    <w:rsid w:val="00E618BF"/>
-    <w:pPr>
-      <w:tabs>
-        <w:tab w:val="center" w:pos="4680"/>
-        <w:tab w:val="right" w:pos="9360"/>
-      </w:tabs>
-      <w:spacing w:after="0" w:line="240" w:lineRule="auto"/>
-    </w:pPr>
-  </w:style>
-  <w:style w:type="character" w:customStyle="1" w:styleId="FooterChar">
-    <w:name w:val="Footer Char"/>
-    <w:basedOn w:val="DefaultParagraphFont"/>
-    <w:link w:val="Footer"/>
-    <w:uiPriority w:val="99"/>
-    <w:rsid w:val="00E618BF"/>
   </w:style>
   <w:style w:type="paragraph" w:styleId="NoSpacing">
     <w:name w:val="No Spacing"/>
@@ -25806,7 +26743,7 @@
 </file>
 
 <file path=customXml/itemProps1.xml><?xml version="1.0" encoding="utf-8"?>
-<ds:datastoreItem xmlns:ds="http://schemas.openxmlformats.org/officeDocument/2006/customXml" ds:itemID="{3E73CA72-6324-4F2E-B1D6-9746FDABE818}">
+<ds:datastoreItem xmlns:ds="http://schemas.openxmlformats.org/officeDocument/2006/customXml" ds:itemID="{EF278816-EC6F-A645-907D-7F25AECB1D4A}">
   <ds:schemaRefs>
     <ds:schemaRef ds:uri="http://schemas.openxmlformats.org/officeDocument/2006/bibliography"/>
   </ds:schemaRefs>

</xml_diff>